<commit_message>
updated to java8 and thread document
</commit_message>
<xml_diff>
--- a/java8.docx
+++ b/java8.docx
@@ -218,13 +218,9 @@
           <w:sz w:val="24"/>
           <w:szCs w:val="24"/>
         </w:rPr>
-        <w:t xml:space="preserve"> )"  double coloun operator</w:t>
-      </w:r>
-    </w:p>
-    <w:p>
-      <w:pPr>
-        <w:pStyle w:val="Normal"/>
-        <w:jc w:val="left"/>
+        <w:t xml:space="preserve"> )</w:t>
+      </w:r>
+      <w:r>
         <w:rPr>
           <w:rFonts w:ascii="Calibri Light" w:hAnsi="Calibri Light"/>
           <w:b w:val="0"/>
@@ -234,7 +230,8 @@
           <w:sz w:val="24"/>
           <w:szCs w:val="24"/>
         </w:rPr>
-      </w:pPr>
+        <w:t>"  double</w:t>
+      </w:r>
       <w:r>
         <w:rPr>
           <w:rFonts w:ascii="Calibri Light" w:hAnsi="Calibri Light"/>
@@ -245,13 +242,9 @@
           <w:sz w:val="24"/>
           <w:szCs w:val="24"/>
         </w:rPr>
-        <w:t>Stream API</w:t>
-      </w:r>
-    </w:p>
-    <w:p>
-      <w:pPr>
-        <w:pStyle w:val="Normal"/>
-        <w:jc w:val="left"/>
+        <w:t xml:space="preserve"> </w:t>
+      </w:r>
+      <w:r>
         <w:rPr>
           <w:rFonts w:ascii="Calibri Light" w:hAnsi="Calibri Light"/>
           <w:b w:val="0"/>
@@ -261,7 +254,8 @@
           <w:sz w:val="24"/>
           <w:szCs w:val="24"/>
         </w:rPr>
-      </w:pPr>
+        <w:t>colon</w:t>
+      </w:r>
       <w:r>
         <w:rPr>
           <w:rFonts w:ascii="Calibri Light" w:hAnsi="Calibri Light"/>
@@ -272,7 +266,7 @@
           <w:sz w:val="24"/>
           <w:szCs w:val="24"/>
         </w:rPr>
-        <w:t>Date and Time API</w:t>
+        <w:t xml:space="preserve"> operator</w:t>
       </w:r>
     </w:p>
     <w:p>
@@ -299,9 +293,13 @@
           <w:sz w:val="24"/>
           <w:szCs w:val="24"/>
         </w:rPr>
-        <w:t>Supplier&lt;R</w:t>
-      </w:r>
-      <w:r>
+        <w:t>Stream API</w:t>
+      </w:r>
+    </w:p>
+    <w:p>
+      <w:pPr>
+        <w:pStyle w:val="Normal"/>
+        <w:jc w:val="left"/>
         <w:rPr>
           <w:rFonts w:ascii="Calibri Light" w:hAnsi="Calibri Light"/>
           <w:b w:val="0"/>
@@ -311,8 +309,7 @@
           <w:sz w:val="24"/>
           <w:szCs w:val="24"/>
         </w:rPr>
-        <w:t>&gt;  (</w:t>
-      </w:r>
+      </w:pPr>
       <w:r>
         <w:rPr>
           <w:rFonts w:ascii="Calibri Light" w:hAnsi="Calibri Light"/>
@@ -323,9 +320,13 @@
           <w:sz w:val="24"/>
           <w:szCs w:val="24"/>
         </w:rPr>
-        <w:t>Predifined</w:t>
-      </w:r>
-      <w:r>
+        <w:t>Date and Time API</w:t>
+      </w:r>
+    </w:p>
+    <w:p>
+      <w:pPr>
+        <w:pStyle w:val="Normal"/>
+        <w:jc w:val="left"/>
         <w:rPr>
           <w:rFonts w:ascii="Calibri Light" w:hAnsi="Calibri Light"/>
           <w:b w:val="0"/>
@@ -335,8 +336,7 @@
           <w:sz w:val="24"/>
           <w:szCs w:val="24"/>
         </w:rPr>
-        <w:t xml:space="preserve"> </w:t>
-      </w:r>
+      </w:pPr>
       <w:r>
         <w:rPr>
           <w:rFonts w:ascii="Calibri Light" w:hAnsi="Calibri Light"/>
@@ -347,7 +347,55 @@
           <w:sz w:val="24"/>
           <w:szCs w:val="24"/>
         </w:rPr>
-        <w:t>functioanal</w:t>
+        <w:t>Supplier&lt;R</w:t>
+      </w:r>
+      <w:r>
+        <w:rPr>
+          <w:rFonts w:ascii="Calibri Light" w:hAnsi="Calibri Light"/>
+          <w:b w:val="0"/>
+          <w:bCs w:val="0"/>
+          <w:i w:val="1"/>
+          <w:iCs w:val="1"/>
+          <w:sz w:val="24"/>
+          <w:szCs w:val="24"/>
+        </w:rPr>
+        <w:t>&gt;  (</w:t>
+      </w:r>
+      <w:r>
+        <w:rPr>
+          <w:rFonts w:ascii="Calibri Light" w:hAnsi="Calibri Light"/>
+          <w:b w:val="0"/>
+          <w:bCs w:val="0"/>
+          <w:i w:val="1"/>
+          <w:iCs w:val="1"/>
+          <w:sz w:val="24"/>
+          <w:szCs w:val="24"/>
+        </w:rPr>
+        <w:t>Predefined</w:t>
+      </w:r>
+      <w:r>
+        <w:rPr>
+          <w:rFonts w:ascii="Calibri Light" w:hAnsi="Calibri Light"/>
+          <w:b w:val="0"/>
+          <w:bCs w:val="0"/>
+          <w:i w:val="1"/>
+          <w:iCs w:val="1"/>
+          <w:sz w:val="24"/>
+          <w:szCs w:val="24"/>
+        </w:rPr>
+        <w:t xml:space="preserve"> </w:t>
+      </w:r>
+      <w:r>
+        <w:rPr>
+          <w:rFonts w:ascii="Calibri Light" w:hAnsi="Calibri Light"/>
+          <w:b w:val="0"/>
+          <w:bCs w:val="0"/>
+          <w:i w:val="1"/>
+          <w:iCs w:val="1"/>
+          <w:sz w:val="24"/>
+          <w:szCs w:val="24"/>
+        </w:rPr>
+        <w:t>functional</w:t>
       </w:r>
       <w:r>
         <w:rPr>
@@ -1688,7 +1736,6 @@
     <w:p>
       <w:pPr>
         <w:pStyle w:val="Normal"/>
-        <w:ind w:left="720" w:firstLine="720"/>
         <w:jc w:val="left"/>
         <w:rPr>
           <w:rFonts w:ascii="Calibri Light" w:hAnsi="Calibri Light"/>
@@ -1700,11 +1747,7 @@
           <w:szCs w:val="24"/>
         </w:rPr>
       </w:pPr>
-    </w:p>
-    <w:p>
-      <w:pPr>
-        <w:pStyle w:val="Normal"/>
-        <w:jc w:val="left"/>
+      <w:r>
         <w:rPr>
           <w:rFonts w:ascii="Calibri Light" w:hAnsi="Calibri Light"/>
           <w:b w:val="0"/>
@@ -1714,7 +1757,8 @@
           <w:sz w:val="24"/>
           <w:szCs w:val="24"/>
         </w:rPr>
-      </w:pPr>
+        <w:t>Conclusion</w:t>
+      </w:r>
     </w:p>
     <w:p>
       <w:pPr>
@@ -1740,7 +1784,7 @@
           <w:sz w:val="24"/>
           <w:szCs w:val="24"/>
         </w:rPr>
-        <w:t>Conclusion</w:t>
+        <w:t>Lambda can have any number of arguments</w:t>
       </w:r>
     </w:p>
     <w:p>
@@ -1767,13 +1811,9 @@
           <w:sz w:val="24"/>
           <w:szCs w:val="24"/>
         </w:rPr>
-        <w:t>Lambda can have any number of arguments</w:t>
-      </w:r>
-    </w:p>
-    <w:p>
-      <w:pPr>
-        <w:pStyle w:val="Normal"/>
-        <w:jc w:val="left"/>
+        <w:t xml:space="preserve">For one argument, lambda expressions parenthesis </w:t>
+      </w:r>
+      <w:r>
         <w:rPr>
           <w:rFonts w:ascii="Calibri Light" w:hAnsi="Calibri Light"/>
           <w:b w:val="0"/>
@@ -1783,7 +1823,8 @@
           <w:sz w:val="24"/>
           <w:szCs w:val="24"/>
         </w:rPr>
-      </w:pPr>
+        <w:t>are</w:t>
+      </w:r>
       <w:r>
         <w:rPr>
           <w:rFonts w:ascii="Calibri Light" w:hAnsi="Calibri Light"/>
@@ -1794,7 +1835,7 @@
           <w:sz w:val="24"/>
           <w:szCs w:val="24"/>
         </w:rPr>
-        <w:t xml:space="preserve">For one argument, lambda expressions parenthesis </w:t>
+        <w:t xml:space="preserve"> </w:t>
       </w:r>
       <w:r>
         <w:rPr>
@@ -1806,7 +1847,7 @@
           <w:sz w:val="24"/>
           <w:szCs w:val="24"/>
         </w:rPr>
-        <w:t>are</w:t>
+        <w:t>optional</w:t>
       </w:r>
       <w:r>
         <w:rPr>
@@ -1818,9 +1859,13 @@
           <w:sz w:val="24"/>
           <w:szCs w:val="24"/>
         </w:rPr>
-        <w:t xml:space="preserve"> </w:t>
-      </w:r>
-      <w:r>
+        <w:t>.</w:t>
+      </w:r>
+    </w:p>
+    <w:p>
+      <w:pPr>
+        <w:pStyle w:val="Normal"/>
+        <w:jc w:val="left"/>
         <w:rPr>
           <w:rFonts w:ascii="Calibri Light" w:hAnsi="Calibri Light"/>
           <w:b w:val="0"/>
@@ -1830,8 +1875,7 @@
           <w:sz w:val="24"/>
           <w:szCs w:val="24"/>
         </w:rPr>
-        <w:t>optional</w:t>
-      </w:r>
+      </w:pPr>
       <w:r>
         <w:rPr>
           <w:rFonts w:ascii="Calibri Light" w:hAnsi="Calibri Light"/>
@@ -1842,13 +1886,9 @@
           <w:sz w:val="24"/>
           <w:szCs w:val="24"/>
         </w:rPr>
-        <w:t>.</w:t>
-      </w:r>
-    </w:p>
-    <w:p>
-      <w:pPr>
-        <w:pStyle w:val="Normal"/>
-        <w:jc w:val="left"/>
+        <w:t xml:space="preserve">Based on context compiler can </w:t>
+      </w:r>
+      <w:r>
         <w:rPr>
           <w:rFonts w:ascii="Calibri Light" w:hAnsi="Calibri Light"/>
           <w:b w:val="0"/>
@@ -1858,7 +1898,8 @@
           <w:sz w:val="24"/>
           <w:szCs w:val="24"/>
         </w:rPr>
-      </w:pPr>
+        <w:t>g</w:t>
+      </w:r>
       <w:r>
         <w:rPr>
           <w:rFonts w:ascii="Calibri Light" w:hAnsi="Calibri Light"/>
@@ -1869,19 +1910,7 @@
           <w:sz w:val="24"/>
           <w:szCs w:val="24"/>
         </w:rPr>
-        <w:t xml:space="preserve">Based on context compiler can </w:t>
-      </w:r>
-      <w:r>
-        <w:rPr>
-          <w:rFonts w:ascii="Calibri Light" w:hAnsi="Calibri Light"/>
-          <w:b w:val="0"/>
-          <w:bCs w:val="0"/>
-          <w:i w:val="1"/>
-          <w:iCs w:val="1"/>
-          <w:sz w:val="24"/>
-          <w:szCs w:val="24"/>
-        </w:rPr>
-        <w:t>guss</w:t>
+        <w:t>uss</w:t>
       </w:r>
       <w:r>
         <w:rPr>
@@ -2039,21 +2068,6 @@
         </w:rPr>
         <w:t xml:space="preserve"> lambdaExpressions1.java</w:t>
       </w:r>
-    </w:p>
-    <w:p>
-      <w:pPr>
-        <w:pStyle w:val="Normal"/>
-        <w:jc w:val="left"/>
-        <w:rPr>
-          <w:rFonts w:ascii="Calibri Light" w:hAnsi="Calibri Light"/>
-          <w:b w:val="0"/>
-          <w:bCs w:val="0"/>
-          <w:i w:val="1"/>
-          <w:iCs w:val="1"/>
-          <w:sz w:val="24"/>
-          <w:szCs w:val="24"/>
-        </w:rPr>
-      </w:pPr>
     </w:p>
     <w:p>
       <w:pPr>
@@ -3438,394 +3452,9 @@
           <w:sz w:val="24"/>
           <w:szCs w:val="24"/>
         </w:rPr>
-        <w:t>Interace</w:t>
-      </w:r>
-    </w:p>
-    <w:p>
-      <w:pPr>
-        <w:pStyle w:val="Normal"/>
-        <w:ind w:firstLine="720"/>
-        <w:jc w:val="left"/>
-        <w:rPr>
-          <w:rFonts w:ascii="Calibri Light" w:hAnsi="Calibri Light"/>
-          <w:b w:val="0"/>
-          <w:bCs w:val="0"/>
-          <w:i w:val="1"/>
-          <w:iCs w:val="1"/>
-          <w:sz w:val="24"/>
-          <w:szCs w:val="24"/>
-        </w:rPr>
-      </w:pPr>
-      <w:r>
-        <w:rPr>
-          <w:rFonts w:ascii="Calibri Light" w:hAnsi="Calibri Light"/>
-          <w:b w:val="0"/>
-          <w:bCs w:val="0"/>
-          <w:i w:val="1"/>
-          <w:iCs w:val="1"/>
-          <w:sz w:val="24"/>
-          <w:szCs w:val="24"/>
-        </w:rPr>
-        <w:t xml:space="preserve">If an interface having only one abstract </w:t>
-      </w:r>
-      <w:r>
-        <w:rPr>
-          <w:rFonts w:ascii="Calibri Light" w:hAnsi="Calibri Light"/>
-          <w:b w:val="0"/>
-          <w:bCs w:val="0"/>
-          <w:i w:val="1"/>
-          <w:iCs w:val="1"/>
-          <w:sz w:val="24"/>
-          <w:szCs w:val="24"/>
-        </w:rPr>
-        <w:t>methods,</w:t>
-      </w:r>
-      <w:r>
-        <w:rPr>
-          <w:rFonts w:ascii="Calibri Light" w:hAnsi="Calibri Light"/>
-          <w:b w:val="0"/>
-          <w:bCs w:val="0"/>
-          <w:i w:val="1"/>
-          <w:iCs w:val="1"/>
-          <w:sz w:val="24"/>
-          <w:szCs w:val="24"/>
-        </w:rPr>
-        <w:t xml:space="preserve"> then it is functional interface.</w:t>
-      </w:r>
-    </w:p>
-    <w:p>
-      <w:pPr>
-        <w:pStyle w:val="Normal"/>
-        <w:ind w:firstLine="720"/>
-        <w:jc w:val="left"/>
-        <w:rPr>
-          <w:rFonts w:ascii="Calibri Light" w:hAnsi="Calibri Light"/>
-          <w:b w:val="0"/>
-          <w:bCs w:val="0"/>
-          <w:i w:val="1"/>
-          <w:iCs w:val="1"/>
-          <w:sz w:val="24"/>
-          <w:szCs w:val="24"/>
-        </w:rPr>
-      </w:pPr>
-      <w:r>
-        <w:rPr>
-          <w:rFonts w:ascii="Calibri Light" w:hAnsi="Calibri Light"/>
-          <w:b w:val="0"/>
-          <w:bCs w:val="0"/>
-          <w:i w:val="1"/>
-          <w:iCs w:val="1"/>
-          <w:sz w:val="24"/>
-          <w:szCs w:val="24"/>
-        </w:rPr>
-        <w:t>Some interfaces</w:t>
-      </w:r>
-    </w:p>
-    <w:p>
-      <w:pPr>
-        <w:pStyle w:val="Normal"/>
-        <w:ind w:firstLine="720"/>
-        <w:jc w:val="left"/>
-        <w:rPr>
-          <w:rFonts w:ascii="Calibri Light" w:hAnsi="Calibri Light"/>
-          <w:b w:val="0"/>
-          <w:bCs w:val="0"/>
-          <w:i w:val="1"/>
-          <w:iCs w:val="1"/>
-          <w:sz w:val="24"/>
-          <w:szCs w:val="24"/>
-        </w:rPr>
-      </w:pPr>
-      <w:r>
-        <w:rPr>
-          <w:rFonts w:ascii="Calibri Light" w:hAnsi="Calibri Light"/>
-          <w:b w:val="0"/>
-          <w:bCs w:val="0"/>
-          <w:i w:val="1"/>
-          <w:iCs w:val="1"/>
-          <w:sz w:val="24"/>
-          <w:szCs w:val="24"/>
-        </w:rPr>
-        <w:t>Java.lang.Runnable</w:t>
-      </w:r>
-      <w:r>
-        <w:rPr>
-          <w:rFonts w:ascii="Calibri Light" w:hAnsi="Calibri Light"/>
-          <w:b w:val="0"/>
-          <w:bCs w:val="0"/>
-          <w:i w:val="1"/>
-          <w:iCs w:val="1"/>
-          <w:sz w:val="24"/>
-          <w:szCs w:val="24"/>
-        </w:rPr>
-        <w:t xml:space="preserve"> interface – method is </w:t>
-      </w:r>
-      <w:r>
-        <w:rPr>
-          <w:rFonts w:ascii="Calibri Light" w:hAnsi="Calibri Light"/>
-          <w:b w:val="0"/>
-          <w:bCs w:val="0"/>
-          <w:i w:val="1"/>
-          <w:iCs w:val="1"/>
-          <w:sz w:val="24"/>
-          <w:szCs w:val="24"/>
-        </w:rPr>
-        <w:t>run(</w:t>
-      </w:r>
-      <w:r>
-        <w:rPr>
-          <w:rFonts w:ascii="Calibri Light" w:hAnsi="Calibri Light"/>
-          <w:b w:val="0"/>
-          <w:bCs w:val="0"/>
-          <w:i w:val="1"/>
-          <w:iCs w:val="1"/>
-          <w:sz w:val="24"/>
-          <w:szCs w:val="24"/>
-        </w:rPr>
-        <w:t>)  functional</w:t>
-      </w:r>
-      <w:r>
-        <w:rPr>
-          <w:rFonts w:ascii="Calibri Light" w:hAnsi="Calibri Light"/>
-          <w:b w:val="0"/>
-          <w:bCs w:val="0"/>
-          <w:i w:val="1"/>
-          <w:iCs w:val="1"/>
-          <w:sz w:val="24"/>
-          <w:szCs w:val="24"/>
-        </w:rPr>
-        <w:t xml:space="preserve"> interface</w:t>
-      </w:r>
-    </w:p>
-    <w:p>
-      <w:pPr>
-        <w:pStyle w:val="Normal"/>
-        <w:ind w:firstLine="720"/>
-        <w:jc w:val="left"/>
-        <w:rPr>
-          <w:rFonts w:ascii="Calibri Light" w:hAnsi="Calibri Light"/>
-          <w:b w:val="0"/>
-          <w:bCs w:val="0"/>
-          <w:i w:val="1"/>
-          <w:iCs w:val="1"/>
-          <w:sz w:val="24"/>
-          <w:szCs w:val="24"/>
-        </w:rPr>
-      </w:pPr>
-      <w:proofErr w:type="spellStart"/>
-      <w:r>
-        <w:rPr>
-          <w:rFonts w:ascii="Calibri Light" w:hAnsi="Calibri Light"/>
-          <w:b w:val="0"/>
-          <w:bCs w:val="0"/>
-          <w:i w:val="1"/>
-          <w:iCs w:val="1"/>
-          <w:sz w:val="24"/>
-          <w:szCs w:val="24"/>
-        </w:rPr>
-        <w:t>Java.util.concurrent.Callable.Callable</w:t>
-      </w:r>
-      <w:proofErr w:type="spellEnd"/>
-      <w:r>
-        <w:rPr>
-          <w:rFonts w:ascii="Calibri Light" w:hAnsi="Calibri Light"/>
-          <w:b w:val="0"/>
-          <w:bCs w:val="0"/>
-          <w:i w:val="1"/>
-          <w:iCs w:val="1"/>
-          <w:sz w:val="24"/>
-          <w:szCs w:val="24"/>
-        </w:rPr>
-        <w:t xml:space="preserve"> interface   - method is </w:t>
-      </w:r>
-      <w:proofErr w:type="gramStart"/>
-      <w:r>
-        <w:rPr>
-          <w:rFonts w:ascii="Calibri Light" w:hAnsi="Calibri Light"/>
-          <w:b w:val="0"/>
-          <w:bCs w:val="0"/>
-          <w:i w:val="1"/>
-          <w:iCs w:val="1"/>
-          <w:sz w:val="24"/>
-          <w:szCs w:val="24"/>
-        </w:rPr>
-        <w:t>call(</w:t>
-      </w:r>
-      <w:proofErr w:type="gramEnd"/>
-      <w:r>
-        <w:rPr>
-          <w:rFonts w:ascii="Calibri Light" w:hAnsi="Calibri Light"/>
-          <w:b w:val="0"/>
-          <w:bCs w:val="0"/>
-          <w:i w:val="1"/>
-          <w:iCs w:val="1"/>
-          <w:sz w:val="24"/>
-          <w:szCs w:val="24"/>
-        </w:rPr>
-        <w:t>) functional interface</w:t>
-      </w:r>
-    </w:p>
-    <w:p>
-      <w:pPr>
-        <w:pStyle w:val="Normal"/>
-        <w:ind w:firstLine="720"/>
-        <w:jc w:val="left"/>
-        <w:rPr>
-          <w:rFonts w:ascii="Calibri Light" w:hAnsi="Calibri Light"/>
-          <w:b w:val="0"/>
-          <w:bCs w:val="0"/>
-          <w:i w:val="1"/>
-          <w:iCs w:val="1"/>
-          <w:sz w:val="24"/>
-          <w:szCs w:val="24"/>
-        </w:rPr>
-      </w:pPr>
-    </w:p>
-    <w:p>
-      <w:pPr>
-        <w:pStyle w:val="Normal"/>
-        <w:ind w:firstLine="720"/>
-        <w:jc w:val="left"/>
-        <w:rPr>
-          <w:rFonts w:ascii="Calibri Light" w:hAnsi="Calibri Light"/>
-          <w:b w:val="0"/>
-          <w:bCs w:val="0"/>
-          <w:i w:val="1"/>
-          <w:iCs w:val="1"/>
-          <w:sz w:val="24"/>
-          <w:szCs w:val="24"/>
-        </w:rPr>
-      </w:pPr>
-    </w:p>
-    <w:p>
-      <w:pPr>
-        <w:pStyle w:val="Normal"/>
-        <w:ind w:firstLine="720"/>
-        <w:jc w:val="left"/>
-        <w:rPr>
-          <w:rFonts w:ascii="Calibri Light" w:hAnsi="Calibri Light"/>
-          <w:b w:val="0"/>
-          <w:bCs w:val="0"/>
-          <w:i w:val="1"/>
-          <w:iCs w:val="1"/>
-          <w:sz w:val="24"/>
-          <w:szCs w:val="24"/>
-        </w:rPr>
-      </w:pPr>
-    </w:p>
-    <w:p>
-      <w:pPr>
-        <w:pStyle w:val="Normal"/>
-        <w:ind w:firstLine="720"/>
-        <w:jc w:val="left"/>
-        <w:rPr>
-          <w:rFonts w:ascii="Calibri Light" w:hAnsi="Calibri Light"/>
-          <w:b w:val="0"/>
-          <w:bCs w:val="0"/>
-          <w:sz w:val="24"/>
-          <w:szCs w:val="24"/>
-        </w:rPr>
-      </w:pPr>
-      <w:r>
-        <w:rPr>
-          <w:rFonts w:ascii="Calibri Light" w:hAnsi="Calibri Light"/>
-          <w:b w:val="0"/>
-          <w:bCs w:val="0"/>
-          <w:sz w:val="24"/>
-          <w:szCs w:val="24"/>
-        </w:rPr>
-        <w:t xml:space="preserve">Single abstract method in </w:t>
-      </w:r>
-      <w:r>
-        <w:rPr>
-          <w:rFonts w:ascii="Calibri Light" w:hAnsi="Calibri Light"/>
-          <w:b w:val="0"/>
-          <w:bCs w:val="0"/>
-          <w:sz w:val="24"/>
-          <w:szCs w:val="24"/>
-        </w:rPr>
-        <w:t>an</w:t>
-      </w:r>
-      <w:r>
-        <w:rPr>
-          <w:rFonts w:ascii="Calibri Light" w:hAnsi="Calibri Light"/>
-          <w:b w:val="0"/>
-          <w:bCs w:val="0"/>
-          <w:sz w:val="24"/>
-          <w:szCs w:val="24"/>
-        </w:rPr>
-        <w:t xml:space="preserve"> functional interface.</w:t>
-      </w:r>
-    </w:p>
-    <w:p>
-      <w:pPr>
-        <w:pStyle w:val="Normal"/>
-        <w:ind w:firstLine="720"/>
-        <w:jc w:val="left"/>
-        <w:rPr>
-          <w:rFonts w:ascii="Calibri Light" w:hAnsi="Calibri Light"/>
-          <w:b w:val="0"/>
-          <w:bCs w:val="0"/>
-          <w:sz w:val="24"/>
-          <w:szCs w:val="24"/>
-        </w:rPr>
-      </w:pPr>
-      <w:r>
-        <w:rPr>
-          <w:rFonts w:ascii="Calibri Light" w:hAnsi="Calibri Light"/>
-          <w:b w:val="0"/>
-          <w:bCs w:val="0"/>
-          <w:sz w:val="24"/>
-          <w:szCs w:val="24"/>
-        </w:rPr>
-        <w:t xml:space="preserve">Can </w:t>
-      </w:r>
-      <w:r>
-        <w:rPr>
-          <w:rFonts w:ascii="Calibri Light" w:hAnsi="Calibri Light"/>
-          <w:b w:val="0"/>
-          <w:bCs w:val="0"/>
-          <w:sz w:val="24"/>
-          <w:szCs w:val="24"/>
-        </w:rPr>
-        <w:t>contain</w:t>
-      </w:r>
-      <w:r>
-        <w:rPr>
-          <w:rFonts w:ascii="Calibri Light" w:hAnsi="Calibri Light"/>
-          <w:b w:val="0"/>
-          <w:bCs w:val="0"/>
-          <w:sz w:val="24"/>
-          <w:szCs w:val="24"/>
-        </w:rPr>
-        <w:t xml:space="preserve"> any number of default and static methods in </w:t>
-      </w:r>
-      <w:r>
-        <w:rPr>
-          <w:rFonts w:ascii="Calibri Light" w:hAnsi="Calibri Light"/>
-          <w:b w:val="0"/>
-          <w:bCs w:val="0"/>
-          <w:sz w:val="24"/>
-          <w:szCs w:val="24"/>
-        </w:rPr>
-        <w:t>an</w:t>
-      </w:r>
-      <w:r>
-        <w:rPr>
-          <w:rFonts w:ascii="Calibri Light" w:hAnsi="Calibri Light"/>
-          <w:b w:val="0"/>
-          <w:bCs w:val="0"/>
-          <w:sz w:val="24"/>
-          <w:szCs w:val="24"/>
-        </w:rPr>
-        <w:t xml:space="preserve"> functional interface.</w:t>
-      </w:r>
-    </w:p>
-    <w:p>
-      <w:pPr>
-        <w:pStyle w:val="Normal"/>
-        <w:ind w:firstLine="720"/>
-        <w:jc w:val="left"/>
+        <w:t>Inter</w:t>
+      </w:r>
+      <w:r>
         <w:rPr>
           <w:rFonts w:ascii="Calibri Light" w:hAnsi="Calibri Light"/>
           <w:b w:val="1"/>
@@ -3835,7 +3464,8 @@
           <w:sz w:val="24"/>
           <w:szCs w:val="24"/>
         </w:rPr>
-      </w:pPr>
+        <w:t>f</w:t>
+      </w:r>
       <w:r>
         <w:rPr>
           <w:rFonts w:ascii="Calibri Light" w:hAnsi="Calibri Light"/>
@@ -3846,7 +3476,7 @@
           <w:sz w:val="24"/>
           <w:szCs w:val="24"/>
         </w:rPr>
-        <w:t>@FunctionalInterface</w:t>
+        <w:t>ace</w:t>
       </w:r>
     </w:p>
     <w:p>
@@ -3858,39 +3488,47 @@
           <w:rFonts w:ascii="Calibri Light" w:hAnsi="Calibri Light"/>
           <w:b w:val="0"/>
           <w:bCs w:val="0"/>
-          <w:sz w:val="24"/>
-          <w:szCs w:val="24"/>
-        </w:rPr>
-      </w:pPr>
-      <w:r>
-        <w:rPr>
-          <w:rFonts w:ascii="Calibri Light" w:hAnsi="Calibri Light"/>
-          <w:b w:val="0"/>
-          <w:bCs w:val="0"/>
-          <w:sz w:val="24"/>
-          <w:szCs w:val="24"/>
-        </w:rPr>
-        <w:t xml:space="preserve">To </w:t>
-      </w:r>
-      <w:r>
-        <w:rPr>
-          <w:rFonts w:ascii="Calibri Light" w:hAnsi="Calibri Light"/>
-          <w:b w:val="0"/>
-          <w:bCs w:val="0"/>
-          <w:sz w:val="24"/>
-          <w:szCs w:val="24"/>
-        </w:rPr>
-        <w:t>indicate</w:t>
-      </w:r>
-      <w:r>
-        <w:rPr>
-          <w:rFonts w:ascii="Calibri Light" w:hAnsi="Calibri Light"/>
-          <w:b w:val="0"/>
-          <w:bCs w:val="0"/>
-          <w:sz w:val="24"/>
-          <w:szCs w:val="24"/>
-        </w:rPr>
-        <w:t xml:space="preserve"> explicitly an interface as functional interface we use @functional Interface annotations.</w:t>
+          <w:i w:val="1"/>
+          <w:iCs w:val="1"/>
+          <w:sz w:val="24"/>
+          <w:szCs w:val="24"/>
+        </w:rPr>
+      </w:pPr>
+      <w:r>
+        <w:rPr>
+          <w:rFonts w:ascii="Calibri Light" w:hAnsi="Calibri Light"/>
+          <w:b w:val="0"/>
+          <w:bCs w:val="0"/>
+          <w:i w:val="1"/>
+          <w:iCs w:val="1"/>
+          <w:sz w:val="24"/>
+          <w:szCs w:val="24"/>
+        </w:rPr>
+        <w:t xml:space="preserve">If an interface having only one abstract </w:t>
+      </w:r>
+      <w:r>
+        <w:rPr>
+          <w:rFonts w:ascii="Calibri Light" w:hAnsi="Calibri Light"/>
+          <w:b w:val="0"/>
+          <w:bCs w:val="0"/>
+          <w:i w:val="1"/>
+          <w:iCs w:val="1"/>
+          <w:sz w:val="24"/>
+          <w:szCs w:val="24"/>
+        </w:rPr>
+        <w:t>methods,</w:t>
+      </w:r>
+      <w:r>
+        <w:rPr>
+          <w:rFonts w:ascii="Calibri Light" w:hAnsi="Calibri Light"/>
+          <w:b w:val="0"/>
+          <w:bCs w:val="0"/>
+          <w:i w:val="1"/>
+          <w:iCs w:val="1"/>
+          <w:sz w:val="24"/>
+          <w:szCs w:val="24"/>
+        </w:rPr>
+        <w:t xml:space="preserve"> then it is functional interface.</w:t>
       </w:r>
     </w:p>
     <w:p>
@@ -3902,19 +3540,23 @@
           <w:rFonts w:ascii="Calibri Light" w:hAnsi="Calibri Light"/>
           <w:b w:val="0"/>
           <w:bCs w:val="0"/>
-          <w:sz w:val="24"/>
-          <w:szCs w:val="24"/>
-        </w:rPr>
-      </w:pPr>
-      <w:r>
-        <w:rPr>
-          <w:rFonts w:ascii="Calibri Light" w:hAnsi="Calibri Light"/>
-          <w:b w:val="0"/>
-          <w:bCs w:val="0"/>
-          <w:sz w:val="24"/>
-          <w:szCs w:val="24"/>
-        </w:rPr>
-        <w:t>@FunctioanlInterface</w:t>
+          <w:i w:val="1"/>
+          <w:iCs w:val="1"/>
+          <w:sz w:val="24"/>
+          <w:szCs w:val="24"/>
+        </w:rPr>
+      </w:pPr>
+      <w:r>
+        <w:rPr>
+          <w:rFonts w:ascii="Calibri Light" w:hAnsi="Calibri Light"/>
+          <w:b w:val="0"/>
+          <w:bCs w:val="0"/>
+          <w:i w:val="1"/>
+          <w:iCs w:val="1"/>
+          <w:sz w:val="24"/>
+          <w:szCs w:val="24"/>
+        </w:rPr>
+        <w:t>Some interfaces</w:t>
       </w:r>
     </w:p>
     <w:p>
@@ -3926,6 +3568,396 @@
           <w:rFonts w:ascii="Calibri Light" w:hAnsi="Calibri Light"/>
           <w:b w:val="0"/>
           <w:bCs w:val="0"/>
+          <w:i w:val="1"/>
+          <w:iCs w:val="1"/>
+          <w:sz w:val="24"/>
+          <w:szCs w:val="24"/>
+        </w:rPr>
+      </w:pPr>
+      <w:r>
+        <w:rPr>
+          <w:rFonts w:ascii="Calibri Light" w:hAnsi="Calibri Light"/>
+          <w:b w:val="0"/>
+          <w:bCs w:val="0"/>
+          <w:i w:val="1"/>
+          <w:iCs w:val="1"/>
+          <w:sz w:val="24"/>
+          <w:szCs w:val="24"/>
+        </w:rPr>
+        <w:t>Java.lang.Runnable</w:t>
+      </w:r>
+      <w:r>
+        <w:rPr>
+          <w:rFonts w:ascii="Calibri Light" w:hAnsi="Calibri Light"/>
+          <w:b w:val="0"/>
+          <w:bCs w:val="0"/>
+          <w:i w:val="1"/>
+          <w:iCs w:val="1"/>
+          <w:sz w:val="24"/>
+          <w:szCs w:val="24"/>
+        </w:rPr>
+        <w:t xml:space="preserve"> interface – method is </w:t>
+      </w:r>
+      <w:r>
+        <w:rPr>
+          <w:rFonts w:ascii="Calibri Light" w:hAnsi="Calibri Light"/>
+          <w:b w:val="0"/>
+          <w:bCs w:val="0"/>
+          <w:i w:val="1"/>
+          <w:iCs w:val="1"/>
+          <w:sz w:val="24"/>
+          <w:szCs w:val="24"/>
+        </w:rPr>
+        <w:t>run(</w:t>
+      </w:r>
+      <w:r>
+        <w:rPr>
+          <w:rFonts w:ascii="Calibri Light" w:hAnsi="Calibri Light"/>
+          <w:b w:val="0"/>
+          <w:bCs w:val="0"/>
+          <w:i w:val="1"/>
+          <w:iCs w:val="1"/>
+          <w:sz w:val="24"/>
+          <w:szCs w:val="24"/>
+        </w:rPr>
+        <w:t>)  functional</w:t>
+      </w:r>
+      <w:r>
+        <w:rPr>
+          <w:rFonts w:ascii="Calibri Light" w:hAnsi="Calibri Light"/>
+          <w:b w:val="0"/>
+          <w:bCs w:val="0"/>
+          <w:i w:val="1"/>
+          <w:iCs w:val="1"/>
+          <w:sz w:val="24"/>
+          <w:szCs w:val="24"/>
+        </w:rPr>
+        <w:t xml:space="preserve"> interface</w:t>
+      </w:r>
+    </w:p>
+    <w:p>
+      <w:pPr>
+        <w:pStyle w:val="Normal"/>
+        <w:ind w:firstLine="720"/>
+        <w:jc w:val="left"/>
+        <w:rPr>
+          <w:rFonts w:ascii="Calibri Light" w:hAnsi="Calibri Light"/>
+          <w:b w:val="0"/>
+          <w:bCs w:val="0"/>
+          <w:i w:val="1"/>
+          <w:iCs w:val="1"/>
+          <w:sz w:val="24"/>
+          <w:szCs w:val="24"/>
+        </w:rPr>
+      </w:pPr>
+      <w:r>
+        <w:rPr>
+          <w:rFonts w:ascii="Calibri Light" w:hAnsi="Calibri Light"/>
+          <w:b w:val="0"/>
+          <w:bCs w:val="0"/>
+          <w:i w:val="1"/>
+          <w:iCs w:val="1"/>
+          <w:sz w:val="24"/>
+          <w:szCs w:val="24"/>
+        </w:rPr>
+        <w:t>Java.util.concurrent.Callable.Callable</w:t>
+      </w:r>
+      <w:r>
+        <w:rPr>
+          <w:rFonts w:ascii="Calibri Light" w:hAnsi="Calibri Light"/>
+          <w:b w:val="0"/>
+          <w:bCs w:val="0"/>
+          <w:i w:val="1"/>
+          <w:iCs w:val="1"/>
+          <w:sz w:val="24"/>
+          <w:szCs w:val="24"/>
+        </w:rPr>
+        <w:t xml:space="preserve"> interface   - method is </w:t>
+      </w:r>
+      <w:r>
+        <w:rPr>
+          <w:rFonts w:ascii="Calibri Light" w:hAnsi="Calibri Light"/>
+          <w:b w:val="0"/>
+          <w:bCs w:val="0"/>
+          <w:i w:val="1"/>
+          <w:iCs w:val="1"/>
+          <w:sz w:val="24"/>
+          <w:szCs w:val="24"/>
+        </w:rPr>
+        <w:t>call(</w:t>
+      </w:r>
+      <w:r>
+        <w:rPr>
+          <w:rFonts w:ascii="Calibri Light" w:hAnsi="Calibri Light"/>
+          <w:b w:val="0"/>
+          <w:bCs w:val="0"/>
+          <w:i w:val="1"/>
+          <w:iCs w:val="1"/>
+          <w:sz w:val="24"/>
+          <w:szCs w:val="24"/>
+        </w:rPr>
+        <w:t>) functional interface</w:t>
+      </w:r>
+    </w:p>
+    <w:p>
+      <w:pPr>
+        <w:pStyle w:val="Normal"/>
+        <w:ind w:firstLine="720"/>
+        <w:jc w:val="left"/>
+        <w:rPr>
+          <w:rFonts w:ascii="Calibri Light" w:hAnsi="Calibri Light"/>
+          <w:b w:val="0"/>
+          <w:bCs w:val="0"/>
+          <w:i w:val="1"/>
+          <w:iCs w:val="1"/>
+          <w:sz w:val="24"/>
+          <w:szCs w:val="24"/>
+        </w:rPr>
+      </w:pPr>
+    </w:p>
+    <w:p>
+      <w:pPr>
+        <w:pStyle w:val="Normal"/>
+        <w:ind w:firstLine="720"/>
+        <w:jc w:val="left"/>
+        <w:rPr>
+          <w:rFonts w:ascii="Calibri Light" w:hAnsi="Calibri Light"/>
+          <w:b w:val="0"/>
+          <w:bCs w:val="0"/>
+          <w:sz w:val="24"/>
+          <w:szCs w:val="24"/>
+        </w:rPr>
+      </w:pPr>
+      <w:r>
+        <w:rPr>
+          <w:rFonts w:ascii="Calibri Light" w:hAnsi="Calibri Light"/>
+          <w:b w:val="0"/>
+          <w:bCs w:val="0"/>
+          <w:sz w:val="24"/>
+          <w:szCs w:val="24"/>
+        </w:rPr>
+        <w:t xml:space="preserve">Single abstract method in </w:t>
+      </w:r>
+      <w:r>
+        <w:rPr>
+          <w:rFonts w:ascii="Calibri Light" w:hAnsi="Calibri Light"/>
+          <w:b w:val="0"/>
+          <w:bCs w:val="0"/>
+          <w:sz w:val="24"/>
+          <w:szCs w:val="24"/>
+        </w:rPr>
+        <w:t>a</w:t>
+      </w:r>
+      <w:r>
+        <w:rPr>
+          <w:rFonts w:ascii="Calibri Light" w:hAnsi="Calibri Light"/>
+          <w:b w:val="0"/>
+          <w:bCs w:val="0"/>
+          <w:sz w:val="24"/>
+          <w:szCs w:val="24"/>
+        </w:rPr>
+        <w:t xml:space="preserve"> </w:t>
+      </w:r>
+      <w:r>
+        <w:rPr>
+          <w:rFonts w:ascii="Calibri Light" w:hAnsi="Calibri Light"/>
+          <w:b w:val="0"/>
+          <w:bCs w:val="0"/>
+          <w:sz w:val="24"/>
+          <w:szCs w:val="24"/>
+        </w:rPr>
+        <w:t>functional interface.</w:t>
+      </w:r>
+    </w:p>
+    <w:p>
+      <w:pPr>
+        <w:pStyle w:val="Normal"/>
+        <w:ind w:firstLine="720"/>
+        <w:jc w:val="left"/>
+        <w:rPr>
+          <w:rFonts w:ascii="Calibri Light" w:hAnsi="Calibri Light"/>
+          <w:b w:val="0"/>
+          <w:bCs w:val="0"/>
+          <w:sz w:val="24"/>
+          <w:szCs w:val="24"/>
+        </w:rPr>
+      </w:pPr>
+      <w:r>
+        <w:rPr>
+          <w:rFonts w:ascii="Calibri Light" w:hAnsi="Calibri Light"/>
+          <w:b w:val="0"/>
+          <w:bCs w:val="0"/>
+          <w:sz w:val="24"/>
+          <w:szCs w:val="24"/>
+        </w:rPr>
+        <w:t xml:space="preserve">Can </w:t>
+      </w:r>
+      <w:r>
+        <w:rPr>
+          <w:rFonts w:ascii="Calibri Light" w:hAnsi="Calibri Light"/>
+          <w:b w:val="0"/>
+          <w:bCs w:val="0"/>
+          <w:sz w:val="24"/>
+          <w:szCs w:val="24"/>
+        </w:rPr>
+        <w:t>contain</w:t>
+      </w:r>
+      <w:r>
+        <w:rPr>
+          <w:rFonts w:ascii="Calibri Light" w:hAnsi="Calibri Light"/>
+          <w:b w:val="0"/>
+          <w:bCs w:val="0"/>
+          <w:sz w:val="24"/>
+          <w:szCs w:val="24"/>
+        </w:rPr>
+        <w:t xml:space="preserve"> any number of default and static methods in </w:t>
+      </w:r>
+      <w:r>
+        <w:rPr>
+          <w:rFonts w:ascii="Calibri Light" w:hAnsi="Calibri Light"/>
+          <w:b w:val="0"/>
+          <w:bCs w:val="0"/>
+          <w:sz w:val="24"/>
+          <w:szCs w:val="24"/>
+        </w:rPr>
+        <w:t>an</w:t>
+      </w:r>
+      <w:r>
+        <w:rPr>
+          <w:rFonts w:ascii="Calibri Light" w:hAnsi="Calibri Light"/>
+          <w:b w:val="0"/>
+          <w:bCs w:val="0"/>
+          <w:sz w:val="24"/>
+          <w:szCs w:val="24"/>
+        </w:rPr>
+        <w:t xml:space="preserve"> functional interface.</w:t>
+      </w:r>
+    </w:p>
+    <w:p>
+      <w:pPr>
+        <w:pStyle w:val="Normal"/>
+        <w:ind w:firstLine="720"/>
+        <w:jc w:val="left"/>
+        <w:rPr>
+          <w:rFonts w:ascii="Calibri Light" w:hAnsi="Calibri Light"/>
+          <w:b w:val="1"/>
+          <w:bCs w:val="1"/>
+          <w:i w:val="1"/>
+          <w:iCs w:val="1"/>
+          <w:sz w:val="24"/>
+          <w:szCs w:val="24"/>
+        </w:rPr>
+      </w:pPr>
+      <w:r>
+        <w:rPr>
+          <w:rFonts w:ascii="Calibri Light" w:hAnsi="Calibri Light"/>
+          <w:b w:val="1"/>
+          <w:bCs w:val="1"/>
+          <w:i w:val="1"/>
+          <w:iCs w:val="1"/>
+          <w:sz w:val="24"/>
+          <w:szCs w:val="24"/>
+        </w:rPr>
+        <w:t>@FunctionalInterface</w:t>
+      </w:r>
+    </w:p>
+    <w:p>
+      <w:pPr>
+        <w:pStyle w:val="Normal"/>
+        <w:ind w:firstLine="720"/>
+        <w:jc w:val="left"/>
+        <w:rPr>
+          <w:rFonts w:ascii="Calibri Light" w:hAnsi="Calibri Light"/>
+          <w:b w:val="0"/>
+          <w:bCs w:val="0"/>
+          <w:sz w:val="24"/>
+          <w:szCs w:val="24"/>
+        </w:rPr>
+      </w:pPr>
+      <w:r>
+        <w:rPr>
+          <w:rFonts w:ascii="Calibri Light" w:hAnsi="Calibri Light"/>
+          <w:b w:val="0"/>
+          <w:bCs w:val="0"/>
+          <w:sz w:val="24"/>
+          <w:szCs w:val="24"/>
+        </w:rPr>
+        <w:t xml:space="preserve">To </w:t>
+      </w:r>
+      <w:r>
+        <w:rPr>
+          <w:rFonts w:ascii="Calibri Light" w:hAnsi="Calibri Light"/>
+          <w:b w:val="0"/>
+          <w:bCs w:val="0"/>
+          <w:sz w:val="24"/>
+          <w:szCs w:val="24"/>
+        </w:rPr>
+        <w:t>indicate</w:t>
+      </w:r>
+      <w:r>
+        <w:rPr>
+          <w:rFonts w:ascii="Calibri Light" w:hAnsi="Calibri Light"/>
+          <w:b w:val="0"/>
+          <w:bCs w:val="0"/>
+          <w:sz w:val="24"/>
+          <w:szCs w:val="24"/>
+        </w:rPr>
+        <w:t xml:space="preserve"> explicitly an interface as functional interface we use @functional Interface annotations.</w:t>
+      </w:r>
+    </w:p>
+    <w:p>
+      <w:pPr>
+        <w:pStyle w:val="Normal"/>
+        <w:ind w:firstLine="720"/>
+        <w:jc w:val="left"/>
+        <w:rPr>
+          <w:rFonts w:ascii="Calibri Light" w:hAnsi="Calibri Light"/>
+          <w:b w:val="0"/>
+          <w:bCs w:val="0"/>
+          <w:sz w:val="24"/>
+          <w:szCs w:val="24"/>
+        </w:rPr>
+      </w:pPr>
+      <w:r>
+        <w:rPr>
+          <w:rFonts w:ascii="Calibri Light" w:hAnsi="Calibri Light"/>
+          <w:b w:val="0"/>
+          <w:bCs w:val="0"/>
+          <w:sz w:val="24"/>
+          <w:szCs w:val="24"/>
+        </w:rPr>
+        <w:t>@Function</w:t>
+      </w:r>
+      <w:r>
+        <w:rPr>
+          <w:rFonts w:ascii="Calibri Light" w:hAnsi="Calibri Light"/>
+          <w:b w:val="0"/>
+          <w:bCs w:val="0"/>
+          <w:sz w:val="24"/>
+          <w:szCs w:val="24"/>
+        </w:rPr>
+        <w:t>a</w:t>
+      </w:r>
+      <w:r>
+        <w:rPr>
+          <w:rFonts w:ascii="Calibri Light" w:hAnsi="Calibri Light"/>
+          <w:b w:val="0"/>
+          <w:bCs w:val="0"/>
+          <w:sz w:val="24"/>
+          <w:szCs w:val="24"/>
+        </w:rPr>
+        <w:t>lInterface</w:t>
+      </w:r>
+    </w:p>
+    <w:p>
+      <w:pPr>
+        <w:pStyle w:val="Normal"/>
+        <w:ind w:firstLine="720"/>
+        <w:jc w:val="left"/>
+        <w:rPr>
+          <w:rFonts w:ascii="Calibri Light" w:hAnsi="Calibri Light"/>
+          <w:b w:val="0"/>
+          <w:bCs w:val="0"/>
           <w:sz w:val="24"/>
           <w:szCs w:val="24"/>
         </w:rPr>
@@ -3949,6 +3981,16 @@
           <w:szCs w:val="24"/>
         </w:rPr>
         <w:t>interface</w:t>
+      </w:r>
+      <w:r>
+        <w:rPr>
+          <w:rFonts w:ascii="Calibri Light" w:hAnsi="Calibri Light"/>
+          <w:b w:val="0"/>
+          <w:bCs w:val="0"/>
+          <w:sz w:val="24"/>
+          <w:szCs w:val="24"/>
+        </w:rPr>
+        <w:t xml:space="preserve"> </w:t>
       </w:r>
       <w:r>
         <w:rPr>
@@ -7791,11 +7833,7 @@
           <w:lang w:val="en-IN"/>
         </w:rPr>
       </w:pPr>
-    </w:p>
-    <w:p>
-      <w:pPr>
-        <w:pStyle w:val="Normal"/>
-        <w:ind w:left="0" w:firstLine="720"/>
+      <w:r>
         <w:rPr>
           <w:rFonts w:ascii="Calibri Light" w:hAnsi="Calibri Light" w:eastAsia="Calibri Light" w:cs="Calibri Light"/>
           <w:b w:val="0"/>
@@ -7810,7 +7848,8 @@
           <w:szCs w:val="21"/>
           <w:lang w:val="en-IN"/>
         </w:rPr>
-      </w:pPr>
+        <w:t>import java.util.Arrays;</w:t>
+      </w:r>
     </w:p>
     <w:p>
       <w:pPr>
@@ -7837,129 +7876,2368 @@
         <w:pStyle w:val="Normal"/>
         <w:ind w:left="0" w:firstLine="0"/>
         <w:rPr>
-          <w:rFonts w:ascii="Calibri Light" w:hAnsi="Calibri Light"/>
-          <w:b w:val="0"/>
-          <w:bCs w:val="0"/>
-          <w:noProof w:val="0"/>
-          <w:sz w:val="24"/>
-          <w:szCs w:val="24"/>
-          <w:lang w:val="en-IN"/>
-        </w:rPr>
-      </w:pPr>
-    </w:p>
-    <w:p>
-      <w:pPr>
-        <w:pStyle w:val="Normal"/>
-        <w:ind w:left="0" w:firstLine="0"/>
-        <w:rPr>
-          <w:rFonts w:ascii="Calibri Light" w:hAnsi="Calibri Light"/>
-          <w:b w:val="0"/>
-          <w:bCs w:val="0"/>
-          <w:noProof w:val="0"/>
-          <w:sz w:val="24"/>
-          <w:szCs w:val="24"/>
-          <w:lang w:val="en-IN"/>
-        </w:rPr>
-      </w:pPr>
-    </w:p>
-    <w:p>
-      <w:pPr>
-        <w:pStyle w:val="Normal"/>
-        <w:ind w:left="0" w:firstLine="720"/>
-        <w:rPr>
-          <w:rFonts w:ascii="Calibri Light" w:hAnsi="Calibri Light"/>
-          <w:b w:val="0"/>
-          <w:bCs w:val="0"/>
-          <w:sz w:val="24"/>
-          <w:szCs w:val="24"/>
-        </w:rPr>
-      </w:pPr>
-      <w:r>
-        <w:rPr>
           <w:rFonts w:ascii="Calibri Light" w:hAnsi="Calibri Light" w:eastAsia="Calibri Light" w:cs="Calibri Light"/>
           <w:noProof w:val="0"/>
-          <w:sz w:val="24"/>
-          <w:szCs w:val="24"/>
+          <w:sz w:val="21"/>
+          <w:szCs w:val="21"/>
+          <w:lang w:val="en-IN"/>
+        </w:rPr>
+      </w:pPr>
+      <w:r>
+        <w:rPr>
+          <w:rFonts w:ascii="Calibri Light" w:hAnsi="Calibri Light" w:eastAsia="Calibri Light" w:cs="Calibri Light"/>
+          <w:b w:val="0"/>
+          <w:bCs w:val="0"/>
+          <w:i w:val="0"/>
+          <w:iCs w:val="0"/>
+          <w:caps w:val="0"/>
+          <w:smallCaps w:val="0"/>
+          <w:noProof w:val="0"/>
+          <w:color w:val="353833"/>
+          <w:sz w:val="21"/>
+          <w:szCs w:val="21"/>
           <w:lang w:val="en-IN"/>
         </w:rPr>
         <w:t xml:space="preserve"> </w:t>
       </w:r>
-    </w:p>
-    <w:p>
-      <w:pPr>
-        <w:pStyle w:val="Normal"/>
-        <w:ind w:left="0" w:firstLine="0"/>
+      <w:r>
         <w:rPr>
           <w:rFonts w:ascii="Calibri Light" w:hAnsi="Calibri Light" w:eastAsia="Calibri Light" w:cs="Calibri Light"/>
           <w:noProof w:val="0"/>
-          <w:sz w:val="24"/>
-          <w:szCs w:val="24"/>
-          <w:lang w:val="en-IN"/>
-        </w:rPr>
-      </w:pPr>
-    </w:p>
-    <w:p>
-      <w:pPr>
-        <w:pStyle w:val="Normal"/>
-        <w:ind w:left="0" w:firstLine="0"/>
-        <w:rPr>
-          <w:rFonts w:ascii="Calibri Light" w:hAnsi="Calibri Light"/>
-          <w:b w:val="0"/>
-          <w:bCs w:val="0"/>
-          <w:sz w:val="24"/>
-          <w:szCs w:val="24"/>
-        </w:rPr>
-      </w:pPr>
-    </w:p>
-    <w:p>
-      <w:pPr>
-        <w:pStyle w:val="Normal"/>
-        <w:ind w:firstLine="720"/>
-        <w:rPr>
-          <w:rFonts w:ascii="Calibri Light" w:hAnsi="Calibri Light"/>
-          <w:b w:val="0"/>
-          <w:bCs w:val="0"/>
-          <w:sz w:val="24"/>
-          <w:szCs w:val="24"/>
-        </w:rPr>
-      </w:pPr>
-    </w:p>
-    <w:p>
-      <w:pPr>
-        <w:pStyle w:val="Normal"/>
-        <w:ind w:firstLine="720"/>
-        <w:rPr>
-          <w:rFonts w:ascii="Calibri Light" w:hAnsi="Calibri Light"/>
+          <w:sz w:val="21"/>
+          <w:szCs w:val="21"/>
+          <w:lang w:val="en-IN"/>
+        </w:rPr>
+        <w:t xml:space="preserve">✅ </w:t>
+      </w:r>
+      <w:r>
+        <w:rPr>
+          <w:rFonts w:ascii="Calibri Light" w:hAnsi="Calibri Light" w:eastAsia="Calibri Light" w:cs="Calibri Light"/>
           <w:b w:val="1"/>
           <w:bCs w:val="1"/>
-          <w:sz w:val="24"/>
-          <w:szCs w:val="24"/>
-        </w:rPr>
-      </w:pPr>
-    </w:p>
-    <w:p>
-      <w:pPr>
-        <w:pStyle w:val="Normal"/>
-        <w:ind w:firstLine="0"/>
-        <w:rPr>
-          <w:rFonts w:ascii="Calibri Light" w:hAnsi="Calibri Light"/>
-          <w:b w:val="0"/>
-          <w:bCs w:val="0"/>
-          <w:sz w:val="24"/>
-          <w:szCs w:val="24"/>
-        </w:rPr>
-      </w:pPr>
-    </w:p>
-    <w:p>
-      <w:pPr>
-        <w:pStyle w:val="Normal"/>
-        <w:ind w:firstLine="0"/>
-        <w:rPr>
-          <w:rFonts w:ascii="Calibri Light" w:hAnsi="Calibri Light"/>
-          <w:b w:val="0"/>
-          <w:bCs w:val="0"/>
-          <w:sz w:val="24"/>
-          <w:szCs w:val="24"/>
+          <w:noProof w:val="0"/>
+          <w:sz w:val="21"/>
+          <w:szCs w:val="21"/>
+          <w:lang w:val="en-IN"/>
+        </w:rPr>
+        <w:t>1. Reference to a Static Method</w:t>
+      </w:r>
+    </w:p>
+    <w:p>
+      <w:pPr>
+        <w:pStyle w:val="Normal"/>
+        <w:ind w:left="0" w:firstLine="720"/>
+      </w:pPr>
+      <w:r>
+        <w:rPr>
+          <w:rFonts w:ascii="Calibri Light" w:hAnsi="Calibri Light" w:eastAsia="Calibri Light" w:cs="Calibri Light"/>
+          <w:b w:val="0"/>
+          <w:bCs w:val="0"/>
+          <w:i w:val="0"/>
+          <w:iCs w:val="0"/>
+          <w:caps w:val="0"/>
+          <w:smallCaps w:val="0"/>
+          <w:noProof w:val="0"/>
+          <w:color w:val="353833"/>
+          <w:sz w:val="21"/>
+          <w:szCs w:val="21"/>
+          <w:lang w:val="en-IN"/>
+        </w:rPr>
+        <w:t>public class StaticMethodRef  {</w:t>
+      </w:r>
+    </w:p>
+    <w:p>
+      <w:pPr>
+        <w:pStyle w:val="Normal"/>
+        <w:ind w:left="0" w:firstLine="720"/>
+      </w:pPr>
+      <w:r>
+        <w:rPr>
+          <w:rFonts w:ascii="Calibri Light" w:hAnsi="Calibri Light" w:eastAsia="Calibri Light" w:cs="Calibri Light"/>
+          <w:b w:val="0"/>
+          <w:bCs w:val="0"/>
+          <w:i w:val="0"/>
+          <w:iCs w:val="0"/>
+          <w:caps w:val="0"/>
+          <w:smallCaps w:val="0"/>
+          <w:noProof w:val="0"/>
+          <w:color w:val="353833"/>
+          <w:sz w:val="21"/>
+          <w:szCs w:val="21"/>
+          <w:lang w:val="en-IN"/>
+        </w:rPr>
+        <w:t xml:space="preserve">    public static void main(String[] args) {</w:t>
+      </w:r>
+    </w:p>
+    <w:p>
+      <w:pPr>
+        <w:pStyle w:val="Normal"/>
+        <w:ind w:left="0" w:firstLine="720"/>
+      </w:pPr>
+      <w:r>
+        <w:rPr>
+          <w:rFonts w:ascii="Calibri Light" w:hAnsi="Calibri Light" w:eastAsia="Calibri Light" w:cs="Calibri Light"/>
+          <w:b w:val="0"/>
+          <w:bCs w:val="0"/>
+          <w:i w:val="0"/>
+          <w:iCs w:val="0"/>
+          <w:caps w:val="0"/>
+          <w:smallCaps w:val="0"/>
+          <w:noProof w:val="0"/>
+          <w:color w:val="353833"/>
+          <w:sz w:val="21"/>
+          <w:szCs w:val="21"/>
+          <w:lang w:val="en-IN"/>
+        </w:rPr>
+        <w:t xml:space="preserve">        String[] names = {"Gopi", "Arun", "Bala"};</w:t>
+      </w:r>
+    </w:p>
+    <w:p>
+      <w:pPr>
+        <w:pStyle w:val="Normal"/>
+        <w:ind w:left="0" w:firstLine="720"/>
+      </w:pPr>
+      <w:r>
+        <w:rPr>
+          <w:rFonts w:ascii="Calibri Light" w:hAnsi="Calibri Light" w:eastAsia="Calibri Light" w:cs="Calibri Light"/>
+          <w:b w:val="0"/>
+          <w:bCs w:val="0"/>
+          <w:i w:val="0"/>
+          <w:iCs w:val="0"/>
+          <w:caps w:val="0"/>
+          <w:smallCaps w:val="0"/>
+          <w:noProof w:val="0"/>
+          <w:color w:val="353833"/>
+          <w:sz w:val="21"/>
+          <w:szCs w:val="21"/>
+          <w:lang w:val="en-IN"/>
+        </w:rPr>
+        <w:t xml:space="preserve"> </w:t>
+      </w:r>
+      <w:r>
+        <w:rPr>
+          <w:rFonts w:ascii="Calibri Light" w:hAnsi="Calibri Light" w:eastAsia="Calibri Light" w:cs="Calibri Light"/>
+          <w:b w:val="0"/>
+          <w:bCs w:val="0"/>
+          <w:i w:val="0"/>
+          <w:iCs w:val="0"/>
+          <w:caps w:val="0"/>
+          <w:smallCaps w:val="0"/>
+          <w:noProof w:val="0"/>
+          <w:color w:val="353833"/>
+          <w:sz w:val="21"/>
+          <w:szCs w:val="21"/>
+          <w:lang w:val="en-IN"/>
+        </w:rPr>
+        <w:t xml:space="preserve">        // Using lambda</w:t>
+      </w:r>
+    </w:p>
+    <w:p>
+      <w:pPr>
+        <w:pStyle w:val="Normal"/>
+        <w:ind w:left="0" w:firstLine="720"/>
+      </w:pPr>
+      <w:r>
+        <w:rPr>
+          <w:rFonts w:ascii="Calibri Light" w:hAnsi="Calibri Light" w:eastAsia="Calibri Light" w:cs="Calibri Light"/>
+          <w:b w:val="0"/>
+          <w:bCs w:val="0"/>
+          <w:i w:val="0"/>
+          <w:iCs w:val="0"/>
+          <w:caps w:val="0"/>
+          <w:smallCaps w:val="0"/>
+          <w:noProof w:val="0"/>
+          <w:color w:val="353833"/>
+          <w:sz w:val="21"/>
+          <w:szCs w:val="21"/>
+          <w:lang w:val="en-IN"/>
+        </w:rPr>
+        <w:t xml:space="preserve">        // Arrays.sort(names, (a, b) -&gt; StaticMethodRef.compare(a, b));</w:t>
+      </w:r>
+    </w:p>
+    <w:p>
+      <w:pPr>
+        <w:pStyle w:val="Normal"/>
+        <w:ind w:left="0" w:firstLine="720"/>
+      </w:pPr>
+      <w:r>
+        <w:rPr>
+          <w:rFonts w:ascii="Calibri Light" w:hAnsi="Calibri Light" w:eastAsia="Calibri Light" w:cs="Calibri Light"/>
+          <w:b w:val="0"/>
+          <w:bCs w:val="0"/>
+          <w:i w:val="0"/>
+          <w:iCs w:val="0"/>
+          <w:caps w:val="0"/>
+          <w:smallCaps w:val="0"/>
+          <w:noProof w:val="0"/>
+          <w:color w:val="353833"/>
+          <w:sz w:val="21"/>
+          <w:szCs w:val="21"/>
+          <w:lang w:val="en-IN"/>
+        </w:rPr>
+        <w:t xml:space="preserve"> </w:t>
+      </w:r>
+      <w:r>
+        <w:rPr>
+          <w:rFonts w:ascii="Calibri Light" w:hAnsi="Calibri Light" w:eastAsia="Calibri Light" w:cs="Calibri Light"/>
+          <w:b w:val="0"/>
+          <w:bCs w:val="0"/>
+          <w:i w:val="0"/>
+          <w:iCs w:val="0"/>
+          <w:caps w:val="0"/>
+          <w:smallCaps w:val="0"/>
+          <w:noProof w:val="0"/>
+          <w:color w:val="353833"/>
+          <w:sz w:val="21"/>
+          <w:szCs w:val="21"/>
+          <w:lang w:val="en-IN"/>
+        </w:rPr>
+        <w:t xml:space="preserve">       // Using method reference</w:t>
+      </w:r>
+    </w:p>
+    <w:p>
+      <w:pPr>
+        <w:pStyle w:val="Normal"/>
+        <w:ind w:left="0" w:firstLine="720"/>
+      </w:pPr>
+      <w:r>
+        <w:rPr>
+          <w:rFonts w:ascii="Calibri Light" w:hAnsi="Calibri Light" w:eastAsia="Calibri Light" w:cs="Calibri Light"/>
+          <w:b w:val="0"/>
+          <w:bCs w:val="0"/>
+          <w:i w:val="0"/>
+          <w:iCs w:val="0"/>
+          <w:caps w:val="0"/>
+          <w:smallCaps w:val="0"/>
+          <w:noProof w:val="0"/>
+          <w:color w:val="353833"/>
+          <w:sz w:val="21"/>
+          <w:szCs w:val="21"/>
+          <w:lang w:val="en-IN"/>
+        </w:rPr>
+        <w:t xml:space="preserve">        Arrays.sort(names, StaticMethodRef::compare);</w:t>
+      </w:r>
+    </w:p>
+    <w:p>
+      <w:pPr>
+        <w:pStyle w:val="Normal"/>
+        <w:ind w:left="0" w:firstLine="720"/>
+      </w:pPr>
+      <w:r>
+        <w:rPr>
+          <w:rFonts w:ascii="Calibri Light" w:hAnsi="Calibri Light" w:eastAsia="Calibri Light" w:cs="Calibri Light"/>
+          <w:b w:val="0"/>
+          <w:bCs w:val="0"/>
+          <w:i w:val="0"/>
+          <w:iCs w:val="0"/>
+          <w:caps w:val="0"/>
+          <w:smallCaps w:val="0"/>
+          <w:noProof w:val="0"/>
+          <w:color w:val="353833"/>
+          <w:sz w:val="21"/>
+          <w:szCs w:val="21"/>
+          <w:lang w:val="en-IN"/>
+        </w:rPr>
+        <w:t xml:space="preserve"> </w:t>
+      </w:r>
+      <w:r>
+        <w:rPr>
+          <w:rFonts w:ascii="Calibri Light" w:hAnsi="Calibri Light" w:eastAsia="Calibri Light" w:cs="Calibri Light"/>
+          <w:b w:val="0"/>
+          <w:bCs w:val="0"/>
+          <w:i w:val="0"/>
+          <w:iCs w:val="0"/>
+          <w:caps w:val="0"/>
+          <w:smallCaps w:val="0"/>
+          <w:noProof w:val="0"/>
+          <w:color w:val="353833"/>
+          <w:sz w:val="21"/>
+          <w:szCs w:val="21"/>
+          <w:lang w:val="en-IN"/>
+        </w:rPr>
+        <w:t xml:space="preserve">       </w:t>
+      </w:r>
+      <w:r>
+        <w:rPr>
+          <w:rFonts w:ascii="Calibri Light" w:hAnsi="Calibri Light" w:eastAsia="Calibri Light" w:cs="Calibri Light"/>
+          <w:b w:val="0"/>
+          <w:bCs w:val="0"/>
+          <w:i w:val="0"/>
+          <w:iCs w:val="0"/>
+          <w:caps w:val="0"/>
+          <w:smallCaps w:val="0"/>
+          <w:noProof w:val="0"/>
+          <w:color w:val="353833"/>
+          <w:sz w:val="21"/>
+          <w:szCs w:val="21"/>
+          <w:lang w:val="en-IN"/>
+        </w:rPr>
+        <w:t>System.out.println</w:t>
+      </w:r>
+      <w:r>
+        <w:rPr>
+          <w:rFonts w:ascii="Calibri Light" w:hAnsi="Calibri Light" w:eastAsia="Calibri Light" w:cs="Calibri Light"/>
+          <w:b w:val="0"/>
+          <w:bCs w:val="0"/>
+          <w:i w:val="0"/>
+          <w:iCs w:val="0"/>
+          <w:caps w:val="0"/>
+          <w:smallCaps w:val="0"/>
+          <w:noProof w:val="0"/>
+          <w:color w:val="353833"/>
+          <w:sz w:val="21"/>
+          <w:szCs w:val="21"/>
+          <w:lang w:val="en-IN"/>
+        </w:rPr>
+        <w:t>(</w:t>
+      </w:r>
+      <w:r>
+        <w:rPr>
+          <w:rFonts w:ascii="Calibri Light" w:hAnsi="Calibri Light" w:eastAsia="Calibri Light" w:cs="Calibri Light"/>
+          <w:b w:val="0"/>
+          <w:bCs w:val="0"/>
+          <w:i w:val="0"/>
+          <w:iCs w:val="0"/>
+          <w:caps w:val="0"/>
+          <w:smallCaps w:val="0"/>
+          <w:noProof w:val="0"/>
+          <w:color w:val="353833"/>
+          <w:sz w:val="21"/>
+          <w:szCs w:val="21"/>
+          <w:lang w:val="en-IN"/>
+        </w:rPr>
+        <w:t>Arrays.toString</w:t>
+      </w:r>
+      <w:r>
+        <w:rPr>
+          <w:rFonts w:ascii="Calibri Light" w:hAnsi="Calibri Light" w:eastAsia="Calibri Light" w:cs="Calibri Light"/>
+          <w:b w:val="0"/>
+          <w:bCs w:val="0"/>
+          <w:i w:val="0"/>
+          <w:iCs w:val="0"/>
+          <w:caps w:val="0"/>
+          <w:smallCaps w:val="0"/>
+          <w:noProof w:val="0"/>
+          <w:color w:val="353833"/>
+          <w:sz w:val="21"/>
+          <w:szCs w:val="21"/>
+          <w:lang w:val="en-IN"/>
+        </w:rPr>
+        <w:t>(names));</w:t>
+      </w:r>
+    </w:p>
+    <w:p>
+      <w:pPr>
+        <w:pStyle w:val="Normal"/>
+        <w:ind w:left="0" w:firstLine="720"/>
+      </w:pPr>
+      <w:r>
+        <w:rPr>
+          <w:rFonts w:ascii="Calibri Light" w:hAnsi="Calibri Light" w:eastAsia="Calibri Light" w:cs="Calibri Light"/>
+          <w:b w:val="0"/>
+          <w:bCs w:val="0"/>
+          <w:i w:val="0"/>
+          <w:iCs w:val="0"/>
+          <w:caps w:val="0"/>
+          <w:smallCaps w:val="0"/>
+          <w:noProof w:val="0"/>
+          <w:color w:val="353833"/>
+          <w:sz w:val="21"/>
+          <w:szCs w:val="21"/>
+          <w:lang w:val="en-IN"/>
+        </w:rPr>
+        <w:t xml:space="preserve">    }</w:t>
+      </w:r>
+    </w:p>
+    <w:p>
+      <w:pPr>
+        <w:pStyle w:val="Normal"/>
+        <w:ind w:left="0" w:firstLine="720"/>
+      </w:pPr>
+      <w:r>
+        <w:rPr>
+          <w:rFonts w:ascii="Calibri Light" w:hAnsi="Calibri Light" w:eastAsia="Calibri Light" w:cs="Calibri Light"/>
+          <w:b w:val="0"/>
+          <w:bCs w:val="0"/>
+          <w:i w:val="0"/>
+          <w:iCs w:val="0"/>
+          <w:caps w:val="0"/>
+          <w:smallCaps w:val="0"/>
+          <w:noProof w:val="0"/>
+          <w:color w:val="353833"/>
+          <w:sz w:val="21"/>
+          <w:szCs w:val="21"/>
+          <w:lang w:val="en-IN"/>
+        </w:rPr>
+        <w:t xml:space="preserve"> </w:t>
+      </w:r>
+      <w:r>
+        <w:rPr>
+          <w:rFonts w:ascii="Calibri Light" w:hAnsi="Calibri Light" w:eastAsia="Calibri Light" w:cs="Calibri Light"/>
+          <w:b w:val="0"/>
+          <w:bCs w:val="0"/>
+          <w:i w:val="0"/>
+          <w:iCs w:val="0"/>
+          <w:caps w:val="0"/>
+          <w:smallCaps w:val="0"/>
+          <w:noProof w:val="0"/>
+          <w:color w:val="353833"/>
+          <w:sz w:val="21"/>
+          <w:szCs w:val="21"/>
+          <w:lang w:val="en-IN"/>
+        </w:rPr>
+        <w:t xml:space="preserve">  public static int </w:t>
+      </w:r>
+      <w:r>
+        <w:rPr>
+          <w:rFonts w:ascii="Calibri Light" w:hAnsi="Calibri Light" w:eastAsia="Calibri Light" w:cs="Calibri Light"/>
+          <w:b w:val="0"/>
+          <w:bCs w:val="0"/>
+          <w:i w:val="0"/>
+          <w:iCs w:val="0"/>
+          <w:caps w:val="0"/>
+          <w:smallCaps w:val="0"/>
+          <w:noProof w:val="0"/>
+          <w:color w:val="353833"/>
+          <w:sz w:val="21"/>
+          <w:szCs w:val="21"/>
+          <w:lang w:val="en-IN"/>
+        </w:rPr>
+        <w:t>compare(</w:t>
+      </w:r>
+      <w:r>
+        <w:rPr>
+          <w:rFonts w:ascii="Calibri Light" w:hAnsi="Calibri Light" w:eastAsia="Calibri Light" w:cs="Calibri Light"/>
+          <w:b w:val="0"/>
+          <w:bCs w:val="0"/>
+          <w:i w:val="0"/>
+          <w:iCs w:val="0"/>
+          <w:caps w:val="0"/>
+          <w:smallCaps w:val="0"/>
+          <w:noProof w:val="0"/>
+          <w:color w:val="353833"/>
+          <w:sz w:val="21"/>
+          <w:szCs w:val="21"/>
+          <w:lang w:val="en-IN"/>
+        </w:rPr>
+        <w:t>String a, String b) {</w:t>
+      </w:r>
+    </w:p>
+    <w:p>
+      <w:pPr>
+        <w:pStyle w:val="Normal"/>
+        <w:ind w:left="0" w:firstLine="720"/>
+      </w:pPr>
+      <w:r>
+        <w:rPr>
+          <w:rFonts w:ascii="Calibri Light" w:hAnsi="Calibri Light" w:eastAsia="Calibri Light" w:cs="Calibri Light"/>
+          <w:b w:val="0"/>
+          <w:bCs w:val="0"/>
+          <w:i w:val="0"/>
+          <w:iCs w:val="0"/>
+          <w:caps w:val="0"/>
+          <w:smallCaps w:val="0"/>
+          <w:noProof w:val="0"/>
+          <w:color w:val="353833"/>
+          <w:sz w:val="21"/>
+          <w:szCs w:val="21"/>
+          <w:lang w:val="en-IN"/>
+        </w:rPr>
+        <w:t xml:space="preserve">        return a.compareTo(b);</w:t>
+      </w:r>
+    </w:p>
+    <w:p>
+      <w:pPr>
+        <w:pStyle w:val="Normal"/>
+        <w:ind w:left="0" w:firstLine="720"/>
+      </w:pPr>
+      <w:r>
+        <w:rPr>
+          <w:rFonts w:ascii="Calibri Light" w:hAnsi="Calibri Light" w:eastAsia="Calibri Light" w:cs="Calibri Light"/>
+          <w:b w:val="0"/>
+          <w:bCs w:val="0"/>
+          <w:i w:val="0"/>
+          <w:iCs w:val="0"/>
+          <w:caps w:val="0"/>
+          <w:smallCaps w:val="0"/>
+          <w:noProof w:val="0"/>
+          <w:color w:val="353833"/>
+          <w:sz w:val="21"/>
+          <w:szCs w:val="21"/>
+          <w:lang w:val="en-IN"/>
+        </w:rPr>
+        <w:t xml:space="preserve">    }</w:t>
+      </w:r>
+    </w:p>
+    <w:p>
+      <w:pPr>
+        <w:pStyle w:val="Normal"/>
+        <w:ind w:left="0" w:firstLine="720"/>
+      </w:pPr>
+      <w:r>
+        <w:rPr>
+          <w:rFonts w:ascii="Calibri Light" w:hAnsi="Calibri Light" w:eastAsia="Calibri Light" w:cs="Calibri Light"/>
+          <w:b w:val="0"/>
+          <w:bCs w:val="0"/>
+          <w:i w:val="0"/>
+          <w:iCs w:val="0"/>
+          <w:caps w:val="0"/>
+          <w:smallCaps w:val="0"/>
+          <w:noProof w:val="0"/>
+          <w:color w:val="353833"/>
+          <w:sz w:val="21"/>
+          <w:szCs w:val="21"/>
+          <w:lang w:val="en-IN"/>
+        </w:rPr>
+        <w:t>}</w:t>
+      </w:r>
+    </w:p>
+    <w:p>
+      <w:pPr>
+        <w:pStyle w:val="Heading1"/>
+        <w:spacing w:before="322" w:beforeAutospacing="off" w:after="322" w:afterAutospacing="off"/>
+        <w:ind/>
+        <w:rPr>
+          <w:rFonts w:ascii="Calibri Light" w:hAnsi="Calibri Light" w:eastAsia="Calibri Light" w:cs="Calibri Light"/>
+          <w:b w:val="0"/>
+          <w:bCs w:val="0"/>
+          <w:i w:val="0"/>
+          <w:iCs w:val="0"/>
+          <w:caps w:val="0"/>
+          <w:smallCaps w:val="0"/>
+          <w:noProof w:val="0"/>
+          <w:color w:val="353833"/>
+          <w:sz w:val="21"/>
+          <w:szCs w:val="21"/>
+          <w:lang w:val="en-IN"/>
+        </w:rPr>
+      </w:pPr>
+      <w:r>
+        <w:rPr>
+          <w:rFonts w:ascii="Calibri Light" w:hAnsi="Calibri Light" w:eastAsia="Calibri Light" w:cs="Calibri Light" w:asciiTheme="minorAscii" w:hAnsiTheme="minorAscii" w:eastAsiaTheme="minorAscii" w:cstheme="minorBidi"/>
+          <w:b w:val="0"/>
+          <w:bCs w:val="0"/>
+          <w:i w:val="0"/>
+          <w:iCs w:val="0"/>
+          <w:caps w:val="0"/>
+          <w:smallCaps w:val="0"/>
+          <w:noProof w:val="0"/>
+          <w:color w:val="353833"/>
+          <w:sz w:val="21"/>
+          <w:szCs w:val="21"/>
+          <w:lang w:val="en-IN" w:eastAsia="en-US" w:bidi="ar-SA"/>
+        </w:rPr>
+        <w:t>✅</w:t>
+      </w:r>
+      <w:r>
+        <w:rPr>
+          <w:rFonts w:ascii="Calibri Light" w:hAnsi="Calibri Light" w:eastAsia="Calibri Light" w:cs="Calibri Light" w:asciiTheme="minorAscii" w:hAnsiTheme="minorAscii" w:eastAsiaTheme="minorAscii" w:cstheme="minorBidi"/>
+          <w:noProof w:val="0"/>
+          <w:color w:val="auto"/>
+          <w:sz w:val="21"/>
+          <w:szCs w:val="21"/>
+          <w:lang w:val="en-IN" w:eastAsia="en-US" w:bidi="ar-SA"/>
+        </w:rPr>
+        <w:t xml:space="preserve"> 2. Reference to an Instance Method of a Particular Object</w:t>
+      </w:r>
+    </w:p>
+    <w:p>
+      <w:pPr>
+        <w:pStyle w:val="Normal"/>
+        <w:ind w:left="0" w:firstLine="720"/>
+        <w:rPr>
+          <w:rFonts w:ascii="Calibri Light" w:hAnsi="Calibri Light" w:eastAsia="Calibri Light" w:cs="Calibri Light"/>
+          <w:noProof w:val="0"/>
+          <w:sz w:val="21"/>
+          <w:szCs w:val="21"/>
+          <w:lang w:val="en-IN"/>
+        </w:rPr>
+      </w:pPr>
+      <w:r>
+        <w:rPr>
+          <w:rFonts w:ascii="Calibri Light" w:hAnsi="Calibri Light" w:eastAsia="Calibri Light" w:cs="Calibri Light"/>
+          <w:b w:val="1"/>
+          <w:bCs w:val="1"/>
+          <w:noProof w:val="0"/>
+          <w:sz w:val="21"/>
+          <w:szCs w:val="21"/>
+          <w:lang w:val="en-IN"/>
+        </w:rPr>
+        <w:t>Syntax:</w:t>
+      </w:r>
+      <w:r>
+        <w:br/>
+      </w:r>
+      <w:r>
+        <w:rPr>
+          <w:rFonts w:ascii="Calibri Light" w:hAnsi="Calibri Light" w:eastAsia="Calibri Light" w:cs="Calibri Light"/>
+          <w:noProof w:val="0"/>
+          <w:sz w:val="21"/>
+          <w:szCs w:val="21"/>
+          <w:lang w:val="en-IN"/>
+        </w:rPr>
+        <w:t xml:space="preserve"> </w:t>
+      </w:r>
+      <w:r>
+        <w:tab/>
+      </w:r>
+      <w:r>
+        <w:rPr>
+          <w:rFonts w:ascii="Consolas" w:hAnsi="Consolas" w:eastAsia="Consolas" w:cs="Consolas"/>
+          <w:noProof w:val="0"/>
+          <w:sz w:val="21"/>
+          <w:szCs w:val="21"/>
+          <w:lang w:val="en-IN"/>
+        </w:rPr>
+        <w:t>object::</w:t>
+      </w:r>
+      <w:r>
+        <w:rPr>
+          <w:rFonts w:ascii="Consolas" w:hAnsi="Consolas" w:eastAsia="Consolas" w:cs="Consolas"/>
+          <w:noProof w:val="0"/>
+          <w:sz w:val="21"/>
+          <w:szCs w:val="21"/>
+          <w:lang w:val="en-IN"/>
+        </w:rPr>
+        <w:t>instanceMethod</w:t>
+      </w:r>
+    </w:p>
+    <w:p>
+      <w:pPr>
+        <w:pStyle w:val="Normal"/>
+        <w:ind w:left="0" w:firstLine="720"/>
+        <w:rPr>
+          <w:rFonts w:ascii="Calibri Light" w:hAnsi="Calibri Light" w:eastAsia="Calibri Light" w:cs="Calibri Light"/>
+          <w:b w:val="0"/>
+          <w:bCs w:val="0"/>
+          <w:i w:val="0"/>
+          <w:iCs w:val="0"/>
+          <w:caps w:val="0"/>
+          <w:smallCaps w:val="0"/>
+          <w:noProof w:val="0"/>
+          <w:color w:val="353833"/>
+          <w:sz w:val="21"/>
+          <w:szCs w:val="21"/>
+          <w:lang w:val="en-IN"/>
+        </w:rPr>
+      </w:pPr>
+    </w:p>
+    <w:p>
+      <w:pPr>
+        <w:pStyle w:val="Normal"/>
+        <w:ind w:left="0" w:firstLine="720"/>
+        <w:rPr>
+          <w:rFonts w:ascii="Calibri Light" w:hAnsi="Calibri Light" w:eastAsia="Calibri Light" w:cs="Calibri Light"/>
+          <w:b w:val="0"/>
+          <w:bCs w:val="0"/>
+          <w:i w:val="0"/>
+          <w:iCs w:val="0"/>
+          <w:caps w:val="0"/>
+          <w:smallCaps w:val="0"/>
+          <w:noProof w:val="0"/>
+          <w:color w:val="353833"/>
+          <w:sz w:val="21"/>
+          <w:szCs w:val="21"/>
+          <w:lang w:val="en-IN"/>
+        </w:rPr>
+      </w:pPr>
+      <w:r>
+        <w:rPr>
+          <w:rFonts w:ascii="Calibri Light" w:hAnsi="Calibri Light" w:eastAsia="Calibri Light" w:cs="Calibri Light"/>
+          <w:b w:val="0"/>
+          <w:bCs w:val="0"/>
+          <w:i w:val="0"/>
+          <w:iCs w:val="0"/>
+          <w:caps w:val="0"/>
+          <w:smallCaps w:val="0"/>
+          <w:noProof w:val="0"/>
+          <w:color w:val="353833"/>
+          <w:sz w:val="21"/>
+          <w:szCs w:val="21"/>
+          <w:lang w:val="en-IN"/>
+        </w:rPr>
+        <w:t>public class InstanceMethodRef {</w:t>
+      </w:r>
+    </w:p>
+    <w:p>
+      <w:pPr>
+        <w:pStyle w:val="Normal"/>
+        <w:ind w:left="0" w:firstLine="720"/>
+      </w:pPr>
+      <w:r>
+        <w:rPr>
+          <w:rFonts w:ascii="Calibri Light" w:hAnsi="Calibri Light" w:eastAsia="Calibri Light" w:cs="Calibri Light"/>
+          <w:b w:val="0"/>
+          <w:bCs w:val="0"/>
+          <w:i w:val="0"/>
+          <w:iCs w:val="0"/>
+          <w:caps w:val="0"/>
+          <w:smallCaps w:val="0"/>
+          <w:noProof w:val="0"/>
+          <w:color w:val="353833"/>
+          <w:sz w:val="21"/>
+          <w:szCs w:val="21"/>
+          <w:lang w:val="en-IN"/>
+        </w:rPr>
+        <w:t xml:space="preserve">    public void printMessage(String msg) {</w:t>
+      </w:r>
+    </w:p>
+    <w:p>
+      <w:pPr>
+        <w:pStyle w:val="Normal"/>
+        <w:ind w:left="0" w:firstLine="720"/>
+      </w:pPr>
+      <w:r>
+        <w:rPr>
+          <w:rFonts w:ascii="Calibri Light" w:hAnsi="Calibri Light" w:eastAsia="Calibri Light" w:cs="Calibri Light"/>
+          <w:b w:val="0"/>
+          <w:bCs w:val="0"/>
+          <w:i w:val="0"/>
+          <w:iCs w:val="0"/>
+          <w:caps w:val="0"/>
+          <w:smallCaps w:val="0"/>
+          <w:noProof w:val="0"/>
+          <w:color w:val="353833"/>
+          <w:sz w:val="21"/>
+          <w:szCs w:val="21"/>
+          <w:lang w:val="en-IN"/>
+        </w:rPr>
+        <w:t xml:space="preserve">        System.out.println(msg);</w:t>
+      </w:r>
+    </w:p>
+    <w:p>
+      <w:pPr>
+        <w:pStyle w:val="Normal"/>
+        <w:ind w:left="0" w:firstLine="720"/>
+      </w:pPr>
+      <w:r>
+        <w:rPr>
+          <w:rFonts w:ascii="Calibri Light" w:hAnsi="Calibri Light" w:eastAsia="Calibri Light" w:cs="Calibri Light"/>
+          <w:b w:val="0"/>
+          <w:bCs w:val="0"/>
+          <w:i w:val="0"/>
+          <w:iCs w:val="0"/>
+          <w:caps w:val="0"/>
+          <w:smallCaps w:val="0"/>
+          <w:noProof w:val="0"/>
+          <w:color w:val="353833"/>
+          <w:sz w:val="21"/>
+          <w:szCs w:val="21"/>
+          <w:lang w:val="en-IN"/>
+        </w:rPr>
+        <w:t xml:space="preserve">    }</w:t>
+      </w:r>
+    </w:p>
+    <w:p>
+      <w:pPr>
+        <w:pStyle w:val="Normal"/>
+        <w:ind w:left="0" w:firstLine="720"/>
+      </w:pPr>
+      <w:r>
+        <w:rPr>
+          <w:rFonts w:ascii="Calibri Light" w:hAnsi="Calibri Light" w:eastAsia="Calibri Light" w:cs="Calibri Light"/>
+          <w:b w:val="0"/>
+          <w:bCs w:val="0"/>
+          <w:i w:val="0"/>
+          <w:iCs w:val="0"/>
+          <w:caps w:val="0"/>
+          <w:smallCaps w:val="0"/>
+          <w:noProof w:val="0"/>
+          <w:color w:val="353833"/>
+          <w:sz w:val="21"/>
+          <w:szCs w:val="21"/>
+          <w:lang w:val="en-IN"/>
+        </w:rPr>
+        <w:t xml:space="preserve"> </w:t>
+      </w:r>
+    </w:p>
+    <w:p>
+      <w:pPr>
+        <w:pStyle w:val="Normal"/>
+        <w:ind w:left="0" w:firstLine="720"/>
+      </w:pPr>
+      <w:r>
+        <w:rPr>
+          <w:rFonts w:ascii="Calibri Light" w:hAnsi="Calibri Light" w:eastAsia="Calibri Light" w:cs="Calibri Light"/>
+          <w:b w:val="0"/>
+          <w:bCs w:val="0"/>
+          <w:i w:val="0"/>
+          <w:iCs w:val="0"/>
+          <w:caps w:val="0"/>
+          <w:smallCaps w:val="0"/>
+          <w:noProof w:val="0"/>
+          <w:color w:val="353833"/>
+          <w:sz w:val="21"/>
+          <w:szCs w:val="21"/>
+          <w:lang w:val="en-IN"/>
+        </w:rPr>
+        <w:t xml:space="preserve">    public static void main(String[] args) {</w:t>
+      </w:r>
+    </w:p>
+    <w:p>
+      <w:pPr>
+        <w:pStyle w:val="Normal"/>
+        <w:ind w:left="0" w:firstLine="720"/>
+      </w:pPr>
+      <w:r>
+        <w:rPr>
+          <w:rFonts w:ascii="Calibri Light" w:hAnsi="Calibri Light" w:eastAsia="Calibri Light" w:cs="Calibri Light"/>
+          <w:b w:val="0"/>
+          <w:bCs w:val="0"/>
+          <w:i w:val="0"/>
+          <w:iCs w:val="0"/>
+          <w:caps w:val="0"/>
+          <w:smallCaps w:val="0"/>
+          <w:noProof w:val="0"/>
+          <w:color w:val="353833"/>
+          <w:sz w:val="21"/>
+          <w:szCs w:val="21"/>
+          <w:lang w:val="en-IN"/>
+        </w:rPr>
+        <w:t xml:space="preserve">        InstanceMethodRef obj = new InstanceMethodRef();</w:t>
+      </w:r>
+    </w:p>
+    <w:p>
+      <w:pPr>
+        <w:pStyle w:val="Normal"/>
+        <w:ind w:left="0" w:firstLine="720"/>
+      </w:pPr>
+      <w:r>
+        <w:rPr>
+          <w:rFonts w:ascii="Calibri Light" w:hAnsi="Calibri Light" w:eastAsia="Calibri Light" w:cs="Calibri Light"/>
+          <w:b w:val="0"/>
+          <w:bCs w:val="0"/>
+          <w:i w:val="0"/>
+          <w:iCs w:val="0"/>
+          <w:caps w:val="0"/>
+          <w:smallCaps w:val="0"/>
+          <w:noProof w:val="0"/>
+          <w:color w:val="353833"/>
+          <w:sz w:val="21"/>
+          <w:szCs w:val="21"/>
+          <w:lang w:val="en-IN"/>
+        </w:rPr>
+        <w:t xml:space="preserve"> </w:t>
+      </w:r>
+    </w:p>
+    <w:p>
+      <w:pPr>
+        <w:pStyle w:val="Normal"/>
+        <w:ind w:left="0" w:firstLine="720"/>
+      </w:pPr>
+      <w:r>
+        <w:rPr>
+          <w:rFonts w:ascii="Calibri Light" w:hAnsi="Calibri Light" w:eastAsia="Calibri Light" w:cs="Calibri Light"/>
+          <w:b w:val="0"/>
+          <w:bCs w:val="0"/>
+          <w:i w:val="0"/>
+          <w:iCs w:val="0"/>
+          <w:caps w:val="0"/>
+          <w:smallCaps w:val="0"/>
+          <w:noProof w:val="0"/>
+          <w:color w:val="353833"/>
+          <w:sz w:val="21"/>
+          <w:szCs w:val="21"/>
+          <w:lang w:val="en-IN"/>
+        </w:rPr>
+        <w:t xml:space="preserve">        // Using lambda</w:t>
+      </w:r>
+    </w:p>
+    <w:p>
+      <w:pPr>
+        <w:pStyle w:val="Normal"/>
+        <w:ind w:left="0" w:firstLine="720"/>
+      </w:pPr>
+      <w:r>
+        <w:rPr>
+          <w:rFonts w:ascii="Calibri Light" w:hAnsi="Calibri Light" w:eastAsia="Calibri Light" w:cs="Calibri Light"/>
+          <w:b w:val="0"/>
+          <w:bCs w:val="0"/>
+          <w:i w:val="0"/>
+          <w:iCs w:val="0"/>
+          <w:caps w:val="0"/>
+          <w:smallCaps w:val="0"/>
+          <w:noProof w:val="0"/>
+          <w:color w:val="353833"/>
+          <w:sz w:val="21"/>
+          <w:szCs w:val="21"/>
+          <w:lang w:val="en-IN"/>
+        </w:rPr>
+        <w:t xml:space="preserve">        // Runnable r = () -&gt; obj.printMessage("Hello");</w:t>
+      </w:r>
+    </w:p>
+    <w:p>
+      <w:pPr>
+        <w:pStyle w:val="Normal"/>
+        <w:ind w:left="0" w:firstLine="720"/>
+      </w:pPr>
+      <w:r>
+        <w:rPr>
+          <w:rFonts w:ascii="Calibri Light" w:hAnsi="Calibri Light" w:eastAsia="Calibri Light" w:cs="Calibri Light"/>
+          <w:b w:val="0"/>
+          <w:bCs w:val="0"/>
+          <w:i w:val="0"/>
+          <w:iCs w:val="0"/>
+          <w:caps w:val="0"/>
+          <w:smallCaps w:val="0"/>
+          <w:noProof w:val="0"/>
+          <w:color w:val="353833"/>
+          <w:sz w:val="21"/>
+          <w:szCs w:val="21"/>
+          <w:lang w:val="en-IN"/>
+        </w:rPr>
+        <w:t xml:space="preserve"> </w:t>
+      </w:r>
+    </w:p>
+    <w:p>
+      <w:pPr>
+        <w:pStyle w:val="Normal"/>
+        <w:ind w:left="0" w:firstLine="720"/>
+      </w:pPr>
+      <w:r>
+        <w:rPr>
+          <w:rFonts w:ascii="Calibri Light" w:hAnsi="Calibri Light" w:eastAsia="Calibri Light" w:cs="Calibri Light"/>
+          <w:b w:val="0"/>
+          <w:bCs w:val="0"/>
+          <w:i w:val="0"/>
+          <w:iCs w:val="0"/>
+          <w:caps w:val="0"/>
+          <w:smallCaps w:val="0"/>
+          <w:noProof w:val="0"/>
+          <w:color w:val="353833"/>
+          <w:sz w:val="21"/>
+          <w:szCs w:val="21"/>
+          <w:lang w:val="en-IN"/>
+        </w:rPr>
+        <w:t xml:space="preserve">        // Using method reference</w:t>
+      </w:r>
+    </w:p>
+    <w:p>
+      <w:pPr>
+        <w:pStyle w:val="Normal"/>
+        <w:ind w:left="0" w:firstLine="720"/>
+      </w:pPr>
+      <w:r>
+        <w:rPr>
+          <w:rFonts w:ascii="Calibri Light" w:hAnsi="Calibri Light" w:eastAsia="Calibri Light" w:cs="Calibri Light"/>
+          <w:b w:val="0"/>
+          <w:bCs w:val="0"/>
+          <w:i w:val="0"/>
+          <w:iCs w:val="0"/>
+          <w:caps w:val="0"/>
+          <w:smallCaps w:val="0"/>
+          <w:noProof w:val="0"/>
+          <w:color w:val="353833"/>
+          <w:sz w:val="21"/>
+          <w:szCs w:val="21"/>
+          <w:lang w:val="en-IN"/>
+        </w:rPr>
+        <w:t xml:space="preserve">        Runnable r = obj::printMessage;</w:t>
+      </w:r>
+    </w:p>
+    <w:p>
+      <w:pPr>
+        <w:pStyle w:val="Normal"/>
+        <w:ind w:left="0" w:firstLine="720"/>
+      </w:pPr>
+      <w:r>
+        <w:rPr>
+          <w:rFonts w:ascii="Calibri Light" w:hAnsi="Calibri Light" w:eastAsia="Calibri Light" w:cs="Calibri Light"/>
+          <w:b w:val="0"/>
+          <w:bCs w:val="0"/>
+          <w:i w:val="0"/>
+          <w:iCs w:val="0"/>
+          <w:caps w:val="0"/>
+          <w:smallCaps w:val="0"/>
+          <w:noProof w:val="0"/>
+          <w:color w:val="353833"/>
+          <w:sz w:val="21"/>
+          <w:szCs w:val="21"/>
+          <w:lang w:val="en-IN"/>
+        </w:rPr>
+        <w:t xml:space="preserve"> </w:t>
+      </w:r>
+    </w:p>
+    <w:p>
+      <w:pPr>
+        <w:pStyle w:val="Normal"/>
+        <w:ind w:left="0" w:firstLine="720"/>
+      </w:pPr>
+      <w:r>
+        <w:rPr>
+          <w:rFonts w:ascii="Calibri Light" w:hAnsi="Calibri Light" w:eastAsia="Calibri Light" w:cs="Calibri Light"/>
+          <w:b w:val="0"/>
+          <w:bCs w:val="0"/>
+          <w:i w:val="0"/>
+          <w:iCs w:val="0"/>
+          <w:caps w:val="0"/>
+          <w:smallCaps w:val="0"/>
+          <w:noProof w:val="0"/>
+          <w:color w:val="353833"/>
+          <w:sz w:val="21"/>
+          <w:szCs w:val="21"/>
+          <w:lang w:val="en-IN"/>
+        </w:rPr>
+        <w:t xml:space="preserve">        r.run();</w:t>
+      </w:r>
+    </w:p>
+    <w:p>
+      <w:pPr>
+        <w:pStyle w:val="Normal"/>
+        <w:ind w:left="0" w:firstLine="720"/>
+      </w:pPr>
+      <w:r>
+        <w:rPr>
+          <w:rFonts w:ascii="Calibri Light" w:hAnsi="Calibri Light" w:eastAsia="Calibri Light" w:cs="Calibri Light"/>
+          <w:b w:val="0"/>
+          <w:bCs w:val="0"/>
+          <w:i w:val="0"/>
+          <w:iCs w:val="0"/>
+          <w:caps w:val="0"/>
+          <w:smallCaps w:val="0"/>
+          <w:noProof w:val="0"/>
+          <w:color w:val="353833"/>
+          <w:sz w:val="21"/>
+          <w:szCs w:val="21"/>
+          <w:lang w:val="en-IN"/>
+        </w:rPr>
+        <w:t xml:space="preserve">    }</w:t>
+      </w:r>
+    </w:p>
+    <w:p>
+      <w:pPr>
+        <w:pStyle w:val="Normal"/>
+        <w:ind w:left="0" w:firstLine="720"/>
+      </w:pPr>
+      <w:r>
+        <w:rPr>
+          <w:rFonts w:ascii="Calibri Light" w:hAnsi="Calibri Light" w:eastAsia="Calibri Light" w:cs="Calibri Light"/>
+          <w:b w:val="0"/>
+          <w:bCs w:val="0"/>
+          <w:i w:val="0"/>
+          <w:iCs w:val="0"/>
+          <w:caps w:val="0"/>
+          <w:smallCaps w:val="0"/>
+          <w:noProof w:val="0"/>
+          <w:color w:val="353833"/>
+          <w:sz w:val="21"/>
+          <w:szCs w:val="21"/>
+          <w:lang w:val="en-IN"/>
+        </w:rPr>
+        <w:t>}</w:t>
+      </w:r>
+    </w:p>
+    <w:p>
+      <w:pPr>
+        <w:pStyle w:val="Normal"/>
+        <w:ind w:left="0" w:firstLine="0"/>
+        <w:rPr>
+          <w:rFonts w:ascii="Calibri Light" w:hAnsi="Calibri Light" w:eastAsia="Calibri Light" w:cs="Calibri Light"/>
+          <w:noProof w:val="0"/>
+          <w:sz w:val="21"/>
+          <w:szCs w:val="21"/>
+          <w:lang w:val="en-IN"/>
+        </w:rPr>
+      </w:pPr>
+      <w:r>
+        <w:rPr>
+          <w:rFonts w:ascii="Calibri Light" w:hAnsi="Calibri Light" w:eastAsia="Calibri Light" w:cs="Calibri Light"/>
+          <w:noProof w:val="0"/>
+          <w:sz w:val="21"/>
+          <w:szCs w:val="21"/>
+          <w:lang w:val="en-IN"/>
+        </w:rPr>
+        <w:t xml:space="preserve">✅ </w:t>
+      </w:r>
+      <w:r>
+        <w:rPr>
+          <w:rFonts w:ascii="Calibri Light" w:hAnsi="Calibri Light" w:eastAsia="Calibri Light" w:cs="Calibri Light"/>
+          <w:b w:val="1"/>
+          <w:bCs w:val="1"/>
+          <w:noProof w:val="0"/>
+          <w:sz w:val="21"/>
+          <w:szCs w:val="21"/>
+          <w:lang w:val="en-IN"/>
+        </w:rPr>
+        <w:t>3. Reference to an Instance Method of an Arbitrary Object of a Particular Type</w:t>
+      </w:r>
+    </w:p>
+    <w:p>
+      <w:pPr>
+        <w:pStyle w:val="Normal"/>
+        <w:ind w:left="0" w:firstLine="720"/>
+        <w:rPr>
+          <w:rFonts w:ascii="Calibri Light" w:hAnsi="Calibri Light" w:eastAsia="Calibri Light" w:cs="Calibri Light"/>
+          <w:b w:val="1"/>
+          <w:bCs w:val="1"/>
+          <w:noProof w:val="0"/>
+          <w:sz w:val="21"/>
+          <w:szCs w:val="21"/>
+          <w:lang w:val="en-IN"/>
+        </w:rPr>
+      </w:pPr>
+      <w:r>
+        <w:rPr>
+          <w:rFonts w:ascii="Calibri Light" w:hAnsi="Calibri Light" w:eastAsia="Calibri Light" w:cs="Calibri Light"/>
+          <w:b w:val="1"/>
+          <w:bCs w:val="1"/>
+          <w:noProof w:val="0"/>
+          <w:sz w:val="21"/>
+          <w:szCs w:val="21"/>
+          <w:lang w:val="en-IN"/>
+        </w:rPr>
+        <w:t>Syntax</w:t>
+      </w:r>
+      <w:r>
+        <w:tab/>
+      </w:r>
+    </w:p>
+    <w:p>
+      <w:pPr>
+        <w:pStyle w:val="Normal"/>
+        <w:ind w:left="0" w:firstLine="720"/>
+      </w:pPr>
+      <w:r>
+        <w:rPr>
+          <w:rFonts w:ascii="Calibri Light" w:hAnsi="Calibri Light" w:eastAsia="Calibri Light" w:cs="Calibri Light"/>
+          <w:noProof w:val="0"/>
+          <w:sz w:val="21"/>
+          <w:szCs w:val="21"/>
+          <w:lang w:val="en-IN"/>
+        </w:rPr>
+        <w:t>ClassName::instanceMethod</w:t>
+      </w:r>
+    </w:p>
+    <w:p>
+      <w:pPr>
+        <w:pStyle w:val="Normal"/>
+        <w:ind w:left="0" w:firstLine="720"/>
+        <w:rPr>
+          <w:rFonts w:ascii="Calibri Light" w:hAnsi="Calibri Light" w:eastAsia="Calibri Light" w:cs="Calibri Light"/>
+          <w:noProof w:val="0"/>
+          <w:sz w:val="21"/>
+          <w:szCs w:val="21"/>
+          <w:lang w:val="en-IN"/>
+        </w:rPr>
+      </w:pPr>
+      <w:r>
+        <w:rPr>
+          <w:rFonts w:ascii="Calibri Light" w:hAnsi="Calibri Light" w:eastAsia="Calibri Light" w:cs="Calibri Light"/>
+          <w:noProof w:val="0"/>
+          <w:sz w:val="21"/>
+          <w:szCs w:val="21"/>
+          <w:lang w:val="en-IN"/>
+        </w:rPr>
+        <w:t xml:space="preserve">Used mostly in </w:t>
+      </w:r>
+      <w:r>
+        <w:rPr>
+          <w:rFonts w:ascii="Calibri Light" w:hAnsi="Calibri Light" w:eastAsia="Calibri Light" w:cs="Calibri Light"/>
+          <w:b w:val="1"/>
+          <w:bCs w:val="1"/>
+          <w:noProof w:val="0"/>
+          <w:sz w:val="21"/>
+          <w:szCs w:val="21"/>
+          <w:lang w:val="en-IN"/>
+        </w:rPr>
+        <w:t>streams</w:t>
+      </w:r>
+      <w:r>
+        <w:rPr>
+          <w:rFonts w:ascii="Calibri Light" w:hAnsi="Calibri Light" w:eastAsia="Calibri Light" w:cs="Calibri Light"/>
+          <w:noProof w:val="0"/>
+          <w:sz w:val="21"/>
+          <w:szCs w:val="21"/>
+          <w:lang w:val="en-IN"/>
+        </w:rPr>
+        <w:t xml:space="preserve"> or </w:t>
+      </w:r>
+      <w:r>
+        <w:rPr>
+          <w:rFonts w:ascii="Calibri Light" w:hAnsi="Calibri Light" w:eastAsia="Calibri Light" w:cs="Calibri Light"/>
+          <w:b w:val="1"/>
+          <w:bCs w:val="1"/>
+          <w:noProof w:val="0"/>
+          <w:sz w:val="21"/>
+          <w:szCs w:val="21"/>
+          <w:lang w:val="en-IN"/>
+        </w:rPr>
+        <w:t>sorting</w:t>
+      </w:r>
+      <w:r>
+        <w:rPr>
+          <w:rFonts w:ascii="Calibri Light" w:hAnsi="Calibri Light" w:eastAsia="Calibri Light" w:cs="Calibri Light"/>
+          <w:noProof w:val="0"/>
+          <w:sz w:val="21"/>
+          <w:szCs w:val="21"/>
+          <w:lang w:val="en-IN"/>
+        </w:rPr>
+        <w:t>.</w:t>
+      </w:r>
+      <w:r>
+        <w:tab/>
+      </w:r>
+    </w:p>
+    <w:p>
+      <w:pPr>
+        <w:pStyle w:val="Normal"/>
+        <w:ind w:left="0" w:firstLine="720"/>
+        <w:rPr>
+          <w:rFonts w:ascii="Calibri Light" w:hAnsi="Calibri Light" w:eastAsia="Calibri Light" w:cs="Calibri Light"/>
+          <w:b w:val="1"/>
+          <w:bCs w:val="1"/>
+          <w:noProof w:val="0"/>
+          <w:sz w:val="21"/>
+          <w:szCs w:val="21"/>
+          <w:lang w:val="en-IN"/>
+        </w:rPr>
+      </w:pPr>
+      <w:r>
+        <w:rPr>
+          <w:rFonts w:ascii="Calibri Light" w:hAnsi="Calibri Light" w:eastAsia="Calibri Light" w:cs="Calibri Light"/>
+          <w:b w:val="1"/>
+          <w:bCs w:val="1"/>
+          <w:noProof w:val="0"/>
+          <w:sz w:val="21"/>
+          <w:szCs w:val="21"/>
+          <w:lang w:val="en-IN"/>
+        </w:rPr>
+        <w:t>import java.util.Arrays;</w:t>
+      </w:r>
+    </w:p>
+    <w:p>
+      <w:pPr>
+        <w:pStyle w:val="Normal"/>
+        <w:ind w:left="0" w:firstLine="720"/>
+      </w:pPr>
+      <w:r>
+        <w:rPr>
+          <w:rFonts w:ascii="Calibri Light" w:hAnsi="Calibri Light" w:eastAsia="Calibri Light" w:cs="Calibri Light"/>
+          <w:b w:val="1"/>
+          <w:bCs w:val="1"/>
+          <w:noProof w:val="0"/>
+          <w:sz w:val="21"/>
+          <w:szCs w:val="21"/>
+          <w:lang w:val="en-IN"/>
+        </w:rPr>
+        <w:t>import java.util.List;</w:t>
+      </w:r>
+    </w:p>
+    <w:p>
+      <w:pPr>
+        <w:pStyle w:val="Normal"/>
+        <w:ind w:left="0" w:firstLine="720"/>
+      </w:pPr>
+      <w:r>
+        <w:rPr>
+          <w:rFonts w:ascii="Calibri Light" w:hAnsi="Calibri Light" w:eastAsia="Calibri Light" w:cs="Calibri Light"/>
+          <w:b w:val="1"/>
+          <w:bCs w:val="1"/>
+          <w:noProof w:val="0"/>
+          <w:sz w:val="21"/>
+          <w:szCs w:val="21"/>
+          <w:lang w:val="en-IN"/>
+        </w:rPr>
+        <w:t xml:space="preserve"> </w:t>
+      </w:r>
+    </w:p>
+    <w:p>
+      <w:pPr>
+        <w:pStyle w:val="Normal"/>
+        <w:ind w:left="0" w:firstLine="720"/>
+      </w:pPr>
+      <w:r>
+        <w:rPr>
+          <w:rFonts w:ascii="Calibri Light" w:hAnsi="Calibri Light" w:eastAsia="Calibri Light" w:cs="Calibri Light"/>
+          <w:b w:val="1"/>
+          <w:bCs w:val="1"/>
+          <w:noProof w:val="0"/>
+          <w:sz w:val="21"/>
+          <w:szCs w:val="21"/>
+          <w:lang w:val="en-IN"/>
+        </w:rPr>
+        <w:t>public class ArbitraryObjectMethodRef {</w:t>
+      </w:r>
+    </w:p>
+    <w:p>
+      <w:pPr>
+        <w:pStyle w:val="Normal"/>
+        <w:ind w:left="0" w:firstLine="720"/>
+      </w:pPr>
+      <w:r>
+        <w:rPr>
+          <w:rFonts w:ascii="Calibri Light" w:hAnsi="Calibri Light" w:eastAsia="Calibri Light" w:cs="Calibri Light"/>
+          <w:b w:val="1"/>
+          <w:bCs w:val="1"/>
+          <w:noProof w:val="0"/>
+          <w:sz w:val="21"/>
+          <w:szCs w:val="21"/>
+          <w:lang w:val="en-IN"/>
+        </w:rPr>
+        <w:t xml:space="preserve">    public static void main(String[] args) {</w:t>
+      </w:r>
+    </w:p>
+    <w:p>
+      <w:pPr>
+        <w:pStyle w:val="Normal"/>
+        <w:ind w:left="0" w:firstLine="720"/>
+      </w:pPr>
+      <w:r>
+        <w:rPr>
+          <w:rFonts w:ascii="Calibri Light" w:hAnsi="Calibri Light" w:eastAsia="Calibri Light" w:cs="Calibri Light"/>
+          <w:b w:val="1"/>
+          <w:bCs w:val="1"/>
+          <w:noProof w:val="0"/>
+          <w:sz w:val="21"/>
+          <w:szCs w:val="21"/>
+          <w:lang w:val="en-IN"/>
+        </w:rPr>
+        <w:t xml:space="preserve">        List&lt;String&gt; list = Arrays.asList("gopi", "bala", "arun");</w:t>
+      </w:r>
+    </w:p>
+    <w:p>
+      <w:pPr>
+        <w:pStyle w:val="Normal"/>
+        <w:ind w:left="0" w:firstLine="720"/>
+      </w:pPr>
+      <w:r>
+        <w:rPr>
+          <w:rFonts w:ascii="Calibri Light" w:hAnsi="Calibri Light" w:eastAsia="Calibri Light" w:cs="Calibri Light"/>
+          <w:b w:val="1"/>
+          <w:bCs w:val="1"/>
+          <w:noProof w:val="0"/>
+          <w:sz w:val="21"/>
+          <w:szCs w:val="21"/>
+          <w:lang w:val="en-IN"/>
+        </w:rPr>
+        <w:t xml:space="preserve"> </w:t>
+      </w:r>
+    </w:p>
+    <w:p>
+      <w:pPr>
+        <w:pStyle w:val="Normal"/>
+        <w:ind w:left="0" w:firstLine="720"/>
+      </w:pPr>
+      <w:r>
+        <w:rPr>
+          <w:rFonts w:ascii="Calibri Light" w:hAnsi="Calibri Light" w:eastAsia="Calibri Light" w:cs="Calibri Light"/>
+          <w:b w:val="1"/>
+          <w:bCs w:val="1"/>
+          <w:noProof w:val="0"/>
+          <w:sz w:val="21"/>
+          <w:szCs w:val="21"/>
+          <w:lang w:val="en-IN"/>
+        </w:rPr>
+        <w:t xml:space="preserve">        // Using lambda</w:t>
+      </w:r>
+    </w:p>
+    <w:p>
+      <w:pPr>
+        <w:pStyle w:val="Normal"/>
+        <w:ind w:left="0" w:firstLine="720"/>
+      </w:pPr>
+      <w:r>
+        <w:rPr>
+          <w:rFonts w:ascii="Calibri Light" w:hAnsi="Calibri Light" w:eastAsia="Calibri Light" w:cs="Calibri Light"/>
+          <w:b w:val="1"/>
+          <w:bCs w:val="1"/>
+          <w:noProof w:val="0"/>
+          <w:sz w:val="21"/>
+          <w:szCs w:val="21"/>
+          <w:lang w:val="en-IN"/>
+        </w:rPr>
+        <w:t xml:space="preserve">        // list.forEach(s -&gt; System.out.println(s.toUpperCase()));</w:t>
+      </w:r>
+    </w:p>
+    <w:p>
+      <w:pPr>
+        <w:pStyle w:val="Normal"/>
+        <w:ind w:left="0" w:firstLine="720"/>
+      </w:pPr>
+      <w:r>
+        <w:rPr>
+          <w:rFonts w:ascii="Calibri Light" w:hAnsi="Calibri Light" w:eastAsia="Calibri Light" w:cs="Calibri Light"/>
+          <w:b w:val="1"/>
+          <w:bCs w:val="1"/>
+          <w:noProof w:val="0"/>
+          <w:sz w:val="21"/>
+          <w:szCs w:val="21"/>
+          <w:lang w:val="en-IN"/>
+        </w:rPr>
+        <w:t xml:space="preserve"> </w:t>
+      </w:r>
+    </w:p>
+    <w:p>
+      <w:pPr>
+        <w:pStyle w:val="Normal"/>
+        <w:ind w:left="0" w:firstLine="720"/>
+      </w:pPr>
+      <w:r>
+        <w:rPr>
+          <w:rFonts w:ascii="Calibri Light" w:hAnsi="Calibri Light" w:eastAsia="Calibri Light" w:cs="Calibri Light"/>
+          <w:b w:val="1"/>
+          <w:bCs w:val="1"/>
+          <w:noProof w:val="0"/>
+          <w:sz w:val="21"/>
+          <w:szCs w:val="21"/>
+          <w:lang w:val="en-IN"/>
+        </w:rPr>
+        <w:t xml:space="preserve">        // Using method reference</w:t>
+      </w:r>
+    </w:p>
+    <w:p>
+      <w:pPr>
+        <w:pStyle w:val="Normal"/>
+        <w:ind w:left="0" w:firstLine="720"/>
+      </w:pPr>
+      <w:r>
+        <w:rPr>
+          <w:rFonts w:ascii="Calibri Light" w:hAnsi="Calibri Light" w:eastAsia="Calibri Light" w:cs="Calibri Light"/>
+          <w:b w:val="1"/>
+          <w:bCs w:val="1"/>
+          <w:noProof w:val="0"/>
+          <w:sz w:val="21"/>
+          <w:szCs w:val="21"/>
+          <w:lang w:val="en-IN"/>
+        </w:rPr>
+        <w:t xml:space="preserve">        list.forEach(String::toUpperCase);  // returns uppercase but not printed</w:t>
+      </w:r>
+    </w:p>
+    <w:p>
+      <w:pPr>
+        <w:pStyle w:val="Normal"/>
+        <w:ind w:left="0" w:firstLine="720"/>
+      </w:pPr>
+      <w:r>
+        <w:rPr>
+          <w:rFonts w:ascii="Calibri Light" w:hAnsi="Calibri Light" w:eastAsia="Calibri Light" w:cs="Calibri Light"/>
+          <w:b w:val="1"/>
+          <w:bCs w:val="1"/>
+          <w:noProof w:val="0"/>
+          <w:sz w:val="21"/>
+          <w:szCs w:val="21"/>
+          <w:lang w:val="en-IN"/>
+        </w:rPr>
+        <w:t xml:space="preserve"> </w:t>
+      </w:r>
+    </w:p>
+    <w:p>
+      <w:pPr>
+        <w:pStyle w:val="Normal"/>
+        <w:ind w:left="0" w:firstLine="720"/>
+      </w:pPr>
+      <w:r>
+        <w:rPr>
+          <w:rFonts w:ascii="Calibri Light" w:hAnsi="Calibri Light" w:eastAsia="Calibri Light" w:cs="Calibri Light"/>
+          <w:b w:val="1"/>
+          <w:bCs w:val="1"/>
+          <w:noProof w:val="0"/>
+          <w:sz w:val="21"/>
+          <w:szCs w:val="21"/>
+          <w:lang w:val="en-IN"/>
+        </w:rPr>
+        <w:t xml:space="preserve">        // Better example</w:t>
+      </w:r>
+    </w:p>
+    <w:p>
+      <w:pPr>
+        <w:pStyle w:val="Normal"/>
+        <w:ind w:left="0" w:firstLine="720"/>
+      </w:pPr>
+      <w:r>
+        <w:rPr>
+          <w:rFonts w:ascii="Calibri Light" w:hAnsi="Calibri Light" w:eastAsia="Calibri Light" w:cs="Calibri Light"/>
+          <w:b w:val="1"/>
+          <w:bCs w:val="1"/>
+          <w:noProof w:val="0"/>
+          <w:sz w:val="21"/>
+          <w:szCs w:val="21"/>
+          <w:lang w:val="en-IN"/>
+        </w:rPr>
+        <w:t xml:space="preserve">        list.forEach(System.out::println); // calls println on each element</w:t>
+      </w:r>
+    </w:p>
+    <w:p>
+      <w:pPr>
+        <w:pStyle w:val="Normal"/>
+        <w:ind w:left="0" w:firstLine="720"/>
+      </w:pPr>
+      <w:r>
+        <w:rPr>
+          <w:rFonts w:ascii="Calibri Light" w:hAnsi="Calibri Light" w:eastAsia="Calibri Light" w:cs="Calibri Light"/>
+          <w:b w:val="1"/>
+          <w:bCs w:val="1"/>
+          <w:noProof w:val="0"/>
+          <w:sz w:val="21"/>
+          <w:szCs w:val="21"/>
+          <w:lang w:val="en-IN"/>
+        </w:rPr>
+        <w:t xml:space="preserve">    }</w:t>
+      </w:r>
+    </w:p>
+    <w:p>
+      <w:pPr>
+        <w:pStyle w:val="Normal"/>
+        <w:ind w:left="0" w:firstLine="720"/>
+      </w:pPr>
+      <w:r>
+        <w:rPr>
+          <w:rFonts w:ascii="Calibri Light" w:hAnsi="Calibri Light" w:eastAsia="Calibri Light" w:cs="Calibri Light"/>
+          <w:b w:val="1"/>
+          <w:bCs w:val="1"/>
+          <w:noProof w:val="0"/>
+          <w:sz w:val="21"/>
+          <w:szCs w:val="21"/>
+          <w:lang w:val="en-IN"/>
+        </w:rPr>
+        <w:t>}</w:t>
+      </w:r>
+    </w:p>
+    <w:p>
+      <w:pPr>
+        <w:pStyle w:val="Normal"/>
+        <w:ind w:left="0" w:firstLine="720"/>
+        <w:rPr>
+          <w:rFonts w:ascii="Calibri Light" w:hAnsi="Calibri Light" w:eastAsia="Calibri Light" w:cs="Calibri Light"/>
+          <w:b w:val="1"/>
+          <w:bCs w:val="1"/>
+          <w:noProof w:val="0"/>
+          <w:sz w:val="21"/>
+          <w:szCs w:val="21"/>
+          <w:lang w:val="en-IN"/>
+        </w:rPr>
+      </w:pPr>
+    </w:p>
+    <w:p>
+      <w:pPr>
+        <w:pStyle w:val="Normal"/>
+        <w:ind w:left="0" w:firstLine="0"/>
+        <w:rPr>
+          <w:rFonts w:ascii="Calibri Light" w:hAnsi="Calibri Light" w:eastAsia="Calibri Light" w:cs="Calibri Light"/>
+          <w:noProof w:val="0"/>
+          <w:sz w:val="21"/>
+          <w:szCs w:val="21"/>
+          <w:lang w:val="en-IN"/>
+        </w:rPr>
+      </w:pPr>
+      <w:r>
+        <w:rPr>
+          <w:rFonts w:ascii="Calibri Light" w:hAnsi="Calibri Light" w:eastAsia="Calibri Light" w:cs="Calibri Light"/>
+          <w:noProof w:val="0"/>
+          <w:sz w:val="21"/>
+          <w:szCs w:val="21"/>
+          <w:lang w:val="en-IN"/>
+        </w:rPr>
+        <w:t xml:space="preserve">✅ </w:t>
+      </w:r>
+      <w:r>
+        <w:rPr>
+          <w:rFonts w:ascii="Calibri Light" w:hAnsi="Calibri Light" w:eastAsia="Calibri Light" w:cs="Calibri Light"/>
+          <w:b w:val="1"/>
+          <w:bCs w:val="1"/>
+          <w:noProof w:val="0"/>
+          <w:sz w:val="21"/>
+          <w:szCs w:val="21"/>
+          <w:lang w:val="en-IN"/>
+        </w:rPr>
+        <w:t>4. Reference to a Constructor</w:t>
+      </w:r>
+    </w:p>
+    <w:p>
+      <w:pPr>
+        <w:pStyle w:val="Normal"/>
+        <w:ind w:left="0" w:firstLine="720"/>
+      </w:pPr>
+      <w:r>
+        <w:rPr>
+          <w:rFonts w:ascii="Calibri Light" w:hAnsi="Calibri Light" w:eastAsia="Calibri Light" w:cs="Calibri Light"/>
+          <w:noProof w:val="0"/>
+          <w:sz w:val="21"/>
+          <w:szCs w:val="21"/>
+          <w:lang w:val="en-IN"/>
+        </w:rPr>
+        <w:t>Syntax:</w:t>
+      </w:r>
+    </w:p>
+    <w:p>
+      <w:pPr>
+        <w:pStyle w:val="Normal"/>
+        <w:ind w:left="0" w:firstLine="720"/>
+      </w:pPr>
+      <w:r>
+        <w:rPr>
+          <w:rFonts w:ascii="Calibri Light" w:hAnsi="Calibri Light" w:eastAsia="Calibri Light" w:cs="Calibri Light"/>
+          <w:noProof w:val="0"/>
+          <w:sz w:val="21"/>
+          <w:szCs w:val="21"/>
+          <w:lang w:val="en-IN"/>
+        </w:rPr>
+        <w:t>ClassName</w:t>
+      </w:r>
+      <w:r>
+        <w:rPr>
+          <w:rFonts w:ascii="Calibri Light" w:hAnsi="Calibri Light" w:eastAsia="Calibri Light" w:cs="Calibri Light"/>
+          <w:noProof w:val="0"/>
+          <w:sz w:val="21"/>
+          <w:szCs w:val="21"/>
+          <w:lang w:val="en-IN"/>
+        </w:rPr>
+        <w:t>::new</w:t>
+      </w:r>
+    </w:p>
+    <w:p>
+      <w:pPr>
+        <w:pStyle w:val="Normal"/>
+        <w:ind w:left="0" w:firstLine="720"/>
+        <w:rPr>
+          <w:rFonts w:ascii="Calibri Light" w:hAnsi="Calibri Light" w:eastAsia="Calibri Light" w:cs="Calibri Light"/>
+          <w:noProof w:val="0"/>
+          <w:sz w:val="21"/>
+          <w:szCs w:val="21"/>
+          <w:lang w:val="en-IN"/>
+        </w:rPr>
+      </w:pPr>
+    </w:p>
+    <w:p>
+      <w:pPr>
+        <w:pStyle w:val="Normal"/>
+        <w:ind w:left="0" w:firstLine="720"/>
+        <w:rPr>
+          <w:rFonts w:ascii="Calibri Light" w:hAnsi="Calibri Light" w:eastAsia="Calibri Light" w:cs="Calibri Light"/>
+          <w:noProof w:val="0"/>
+          <w:sz w:val="21"/>
+          <w:szCs w:val="21"/>
+          <w:lang w:val="en-IN"/>
+        </w:rPr>
+      </w:pPr>
+      <w:r>
+        <w:rPr>
+          <w:rFonts w:ascii="Calibri Light" w:hAnsi="Calibri Light" w:eastAsia="Calibri Light" w:cs="Calibri Light"/>
+          <w:noProof w:val="0"/>
+          <w:sz w:val="21"/>
+          <w:szCs w:val="21"/>
+          <w:lang w:val="en-IN"/>
+        </w:rPr>
+        <w:t>import java.util.function.Supplier;</w:t>
+      </w:r>
+    </w:p>
+    <w:p>
+      <w:pPr>
+        <w:pStyle w:val="Normal"/>
+        <w:ind w:left="0" w:firstLine="720"/>
+      </w:pPr>
+      <w:r>
+        <w:rPr>
+          <w:rFonts w:ascii="Calibri Light" w:hAnsi="Calibri Light" w:eastAsia="Calibri Light" w:cs="Calibri Light"/>
+          <w:noProof w:val="0"/>
+          <w:sz w:val="21"/>
+          <w:szCs w:val="21"/>
+          <w:lang w:val="en-IN"/>
+        </w:rPr>
+        <w:t xml:space="preserve"> </w:t>
+      </w:r>
+      <w:r>
+        <w:rPr>
+          <w:rFonts w:ascii="Calibri Light" w:hAnsi="Calibri Light" w:eastAsia="Calibri Light" w:cs="Calibri Light"/>
+          <w:noProof w:val="0"/>
+          <w:sz w:val="21"/>
+          <w:szCs w:val="21"/>
+          <w:lang w:val="en-IN"/>
+        </w:rPr>
+        <w:t>class Employee {</w:t>
+      </w:r>
+    </w:p>
+    <w:p>
+      <w:pPr>
+        <w:pStyle w:val="Normal"/>
+        <w:ind w:left="0" w:firstLine="720"/>
+      </w:pPr>
+      <w:r>
+        <w:rPr>
+          <w:rFonts w:ascii="Calibri Light" w:hAnsi="Calibri Light" w:eastAsia="Calibri Light" w:cs="Calibri Light"/>
+          <w:noProof w:val="0"/>
+          <w:sz w:val="21"/>
+          <w:szCs w:val="21"/>
+          <w:lang w:val="en-IN"/>
+        </w:rPr>
+        <w:t xml:space="preserve">    Employee() {</w:t>
+      </w:r>
+    </w:p>
+    <w:p>
+      <w:pPr>
+        <w:pStyle w:val="Normal"/>
+        <w:ind w:left="0" w:firstLine="720"/>
+      </w:pPr>
+      <w:r>
+        <w:rPr>
+          <w:rFonts w:ascii="Calibri Light" w:hAnsi="Calibri Light" w:eastAsia="Calibri Light" w:cs="Calibri Light"/>
+          <w:noProof w:val="0"/>
+          <w:sz w:val="21"/>
+          <w:szCs w:val="21"/>
+          <w:lang w:val="en-IN"/>
+        </w:rPr>
+        <w:t xml:space="preserve">        System.out.println("Employee created!");</w:t>
+      </w:r>
+    </w:p>
+    <w:p>
+      <w:pPr>
+        <w:pStyle w:val="Normal"/>
+        <w:ind w:left="0" w:firstLine="720"/>
+      </w:pPr>
+      <w:r>
+        <w:rPr>
+          <w:rFonts w:ascii="Calibri Light" w:hAnsi="Calibri Light" w:eastAsia="Calibri Light" w:cs="Calibri Light"/>
+          <w:noProof w:val="0"/>
+          <w:sz w:val="21"/>
+          <w:szCs w:val="21"/>
+          <w:lang w:val="en-IN"/>
+        </w:rPr>
+        <w:t xml:space="preserve">    }</w:t>
+      </w:r>
+    </w:p>
+    <w:p>
+      <w:pPr>
+        <w:pStyle w:val="Normal"/>
+        <w:ind w:left="0" w:firstLine="720"/>
+      </w:pPr>
+      <w:r>
+        <w:rPr>
+          <w:rFonts w:ascii="Calibri Light" w:hAnsi="Calibri Light" w:eastAsia="Calibri Light" w:cs="Calibri Light"/>
+          <w:noProof w:val="0"/>
+          <w:sz w:val="21"/>
+          <w:szCs w:val="21"/>
+          <w:lang w:val="en-IN"/>
+        </w:rPr>
+        <w:t>}</w:t>
+      </w:r>
+    </w:p>
+    <w:p>
+      <w:pPr>
+        <w:pStyle w:val="Normal"/>
+        <w:ind w:left="0" w:firstLine="720"/>
+      </w:pPr>
+      <w:r>
+        <w:rPr>
+          <w:rFonts w:ascii="Calibri Light" w:hAnsi="Calibri Light" w:eastAsia="Calibri Light" w:cs="Calibri Light"/>
+          <w:noProof w:val="0"/>
+          <w:sz w:val="21"/>
+          <w:szCs w:val="21"/>
+          <w:lang w:val="en-IN"/>
+        </w:rPr>
+        <w:t xml:space="preserve"> </w:t>
+      </w:r>
+    </w:p>
+    <w:p>
+      <w:pPr>
+        <w:pStyle w:val="Normal"/>
+        <w:ind w:left="0" w:firstLine="720"/>
+      </w:pPr>
+      <w:r>
+        <w:rPr>
+          <w:rFonts w:ascii="Calibri Light" w:hAnsi="Calibri Light" w:eastAsia="Calibri Light" w:cs="Calibri Light"/>
+          <w:noProof w:val="0"/>
+          <w:sz w:val="21"/>
+          <w:szCs w:val="21"/>
+          <w:lang w:val="en-IN"/>
+        </w:rPr>
+        <w:t>public class ConstructorRef {</w:t>
+      </w:r>
+    </w:p>
+    <w:p>
+      <w:pPr>
+        <w:pStyle w:val="Normal"/>
+        <w:ind w:left="0" w:firstLine="720"/>
+      </w:pPr>
+      <w:r>
+        <w:rPr>
+          <w:rFonts w:ascii="Calibri Light" w:hAnsi="Calibri Light" w:eastAsia="Calibri Light" w:cs="Calibri Light"/>
+          <w:noProof w:val="0"/>
+          <w:sz w:val="21"/>
+          <w:szCs w:val="21"/>
+          <w:lang w:val="en-IN"/>
+        </w:rPr>
+        <w:t xml:space="preserve">    public static void main(String[] args) {</w:t>
+      </w:r>
+    </w:p>
+    <w:p>
+      <w:pPr>
+        <w:pStyle w:val="Normal"/>
+        <w:ind w:left="0" w:firstLine="720"/>
+      </w:pPr>
+      <w:r>
+        <w:rPr>
+          <w:rFonts w:ascii="Calibri Light" w:hAnsi="Calibri Light" w:eastAsia="Calibri Light" w:cs="Calibri Light"/>
+          <w:noProof w:val="0"/>
+          <w:sz w:val="21"/>
+          <w:szCs w:val="21"/>
+          <w:lang w:val="en-IN"/>
+        </w:rPr>
+        <w:t xml:space="preserve">        // Using lambda</w:t>
+      </w:r>
+    </w:p>
+    <w:p>
+      <w:pPr>
+        <w:pStyle w:val="Normal"/>
+        <w:ind w:left="0" w:firstLine="720"/>
+      </w:pPr>
+      <w:r>
+        <w:rPr>
+          <w:rFonts w:ascii="Calibri Light" w:hAnsi="Calibri Light" w:eastAsia="Calibri Light" w:cs="Calibri Light"/>
+          <w:noProof w:val="0"/>
+          <w:sz w:val="21"/>
+          <w:szCs w:val="21"/>
+          <w:lang w:val="en-IN"/>
+        </w:rPr>
+        <w:t xml:space="preserve">        // Supplier&lt;Employee&gt; supplier = () -&gt; new Employee();</w:t>
+      </w:r>
+    </w:p>
+    <w:p>
+      <w:pPr>
+        <w:pStyle w:val="Normal"/>
+        <w:ind w:left="0" w:firstLine="720"/>
+      </w:pPr>
+      <w:r>
+        <w:rPr>
+          <w:rFonts w:ascii="Calibri Light" w:hAnsi="Calibri Light" w:eastAsia="Calibri Light" w:cs="Calibri Light"/>
+          <w:noProof w:val="0"/>
+          <w:sz w:val="21"/>
+          <w:szCs w:val="21"/>
+          <w:lang w:val="en-IN"/>
+        </w:rPr>
+        <w:t xml:space="preserve"> </w:t>
+      </w:r>
+    </w:p>
+    <w:p>
+      <w:pPr>
+        <w:pStyle w:val="Normal"/>
+        <w:ind w:left="0" w:firstLine="720"/>
+      </w:pPr>
+      <w:r>
+        <w:rPr>
+          <w:rFonts w:ascii="Calibri Light" w:hAnsi="Calibri Light" w:eastAsia="Calibri Light" w:cs="Calibri Light"/>
+          <w:noProof w:val="0"/>
+          <w:sz w:val="21"/>
+          <w:szCs w:val="21"/>
+          <w:lang w:val="en-IN"/>
+        </w:rPr>
+        <w:t xml:space="preserve">        // Using method reference</w:t>
+      </w:r>
+    </w:p>
+    <w:p>
+      <w:pPr>
+        <w:pStyle w:val="Normal"/>
+        <w:ind w:left="0" w:firstLine="720"/>
+      </w:pPr>
+      <w:r>
+        <w:rPr>
+          <w:rFonts w:ascii="Calibri Light" w:hAnsi="Calibri Light" w:eastAsia="Calibri Light" w:cs="Calibri Light"/>
+          <w:noProof w:val="0"/>
+          <w:sz w:val="21"/>
+          <w:szCs w:val="21"/>
+          <w:lang w:val="en-IN"/>
+        </w:rPr>
+        <w:t xml:space="preserve">        Supplier&lt;Employee&gt; supplier = Employee::new;</w:t>
+      </w:r>
+    </w:p>
+    <w:p>
+      <w:pPr>
+        <w:pStyle w:val="Normal"/>
+        <w:ind w:left="0" w:firstLine="720"/>
+      </w:pPr>
+      <w:r>
+        <w:rPr>
+          <w:rFonts w:ascii="Calibri Light" w:hAnsi="Calibri Light" w:eastAsia="Calibri Light" w:cs="Calibri Light"/>
+          <w:noProof w:val="0"/>
+          <w:sz w:val="21"/>
+          <w:szCs w:val="21"/>
+          <w:lang w:val="en-IN"/>
+        </w:rPr>
+        <w:t xml:space="preserve"> </w:t>
+      </w:r>
+    </w:p>
+    <w:p>
+      <w:pPr>
+        <w:pStyle w:val="Normal"/>
+        <w:ind w:left="0" w:firstLine="720"/>
+      </w:pPr>
+      <w:r>
+        <w:rPr>
+          <w:rFonts w:ascii="Calibri Light" w:hAnsi="Calibri Light" w:eastAsia="Calibri Light" w:cs="Calibri Light"/>
+          <w:noProof w:val="0"/>
+          <w:sz w:val="21"/>
+          <w:szCs w:val="21"/>
+          <w:lang w:val="en-IN"/>
+        </w:rPr>
+        <w:t xml:space="preserve">        Employee emp = supplier.get();</w:t>
+      </w:r>
+    </w:p>
+    <w:p>
+      <w:pPr>
+        <w:pStyle w:val="Normal"/>
+        <w:ind w:left="0" w:firstLine="720"/>
+      </w:pPr>
+      <w:r>
+        <w:rPr>
+          <w:rFonts w:ascii="Calibri Light" w:hAnsi="Calibri Light" w:eastAsia="Calibri Light" w:cs="Calibri Light"/>
+          <w:noProof w:val="0"/>
+          <w:sz w:val="21"/>
+          <w:szCs w:val="21"/>
+          <w:lang w:val="en-IN"/>
+        </w:rPr>
+        <w:t xml:space="preserve">    }</w:t>
+      </w:r>
+    </w:p>
+    <w:p>
+      <w:pPr>
+        <w:pStyle w:val="Normal"/>
+        <w:ind w:left="0" w:firstLine="720"/>
+      </w:pPr>
+      <w:r>
+        <w:rPr>
+          <w:rFonts w:ascii="Calibri Light" w:hAnsi="Calibri Light" w:eastAsia="Calibri Light" w:cs="Calibri Light"/>
+          <w:noProof w:val="0"/>
+          <w:sz w:val="21"/>
+          <w:szCs w:val="21"/>
+          <w:lang w:val="en-IN"/>
+        </w:rPr>
+        <w:t>}</w:t>
+      </w:r>
+    </w:p>
+    <w:p>
+      <w:pPr>
+        <w:pStyle w:val="Normal"/>
+        <w:ind w:left="0" w:firstLine="720"/>
+        <w:rPr>
+          <w:rFonts w:ascii="Calibri Light" w:hAnsi="Calibri Light" w:eastAsia="Calibri Light" w:cs="Calibri Light"/>
+          <w:noProof w:val="0"/>
+          <w:sz w:val="21"/>
+          <w:szCs w:val="21"/>
+          <w:lang w:val="en-IN"/>
+        </w:rPr>
+      </w:pPr>
+    </w:p>
+    <w:tbl>
+      <w:tblPr>
+        <w:tblStyle w:val="TableNormal"/>
+        <w:bidiVisual w:val="0"/>
+        <w:tblW w:w="0" w:type="auto"/>
+        <w:tblLook w:val="06A0" w:firstRow="1" w:lastRow="0" w:firstColumn="1" w:lastColumn="0" w:noHBand="1" w:noVBand="1"/>
+      </w:tblPr>
+      <w:tblGrid>
+        <w:gridCol w:w="2985"/>
+        <w:gridCol w:w="2337"/>
+        <w:gridCol w:w="2337"/>
+      </w:tblGrid>
+      <w:tr>
+        <w:trPr>
+          <w:trHeight w:val="300"/>
+        </w:trPr>
+        <w:tc>
+          <w:tcPr>
+            <w:tcW w:w="2985" w:type="dxa"/>
+            <w:tcMar/>
+            <w:vAlign w:val="center"/>
+          </w:tcPr>
+          <w:p>
+            <w:pPr>
+              <w:spacing w:before="0" w:beforeAutospacing="off" w:after="0" w:afterAutospacing="off"/>
+              <w:jc w:val="center"/>
+            </w:pPr>
+            <w:r>
+              <w:rPr>
+                <w:b w:val="1"/>
+                <w:bCs w:val="1"/>
+              </w:rPr>
+              <w:t>Type</w:t>
+            </w:r>
+          </w:p>
+        </w:tc>
+        <w:tc>
+          <w:tcPr>
+            <w:tcW w:w="2337" w:type="dxa"/>
+            <w:tcMar/>
+            <w:vAlign w:val="center"/>
+          </w:tcPr>
+          <w:p>
+            <w:pPr>
+              <w:spacing w:before="0" w:beforeAutospacing="off" w:after="0" w:afterAutospacing="off"/>
+              <w:jc w:val="center"/>
+            </w:pPr>
+            <w:r>
+              <w:rPr>
+                <w:b w:val="1"/>
+                <w:bCs w:val="1"/>
+              </w:rPr>
+              <w:t>Syntax</w:t>
+            </w:r>
+          </w:p>
+        </w:tc>
+        <w:tc>
+          <w:tcPr>
+            <w:tcW w:w="2337" w:type="dxa"/>
+            <w:tcMar/>
+            <w:vAlign w:val="center"/>
+          </w:tcPr>
+          <w:p>
+            <w:pPr>
+              <w:spacing w:before="0" w:beforeAutospacing="off" w:after="0" w:afterAutospacing="off"/>
+              <w:jc w:val="center"/>
+            </w:pPr>
+            <w:r>
+              <w:rPr>
+                <w:b w:val="1"/>
+                <w:bCs w:val="1"/>
+              </w:rPr>
+              <w:t>Example</w:t>
+            </w:r>
+          </w:p>
+        </w:tc>
+      </w:tr>
+      <w:tr>
+        <w:trPr>
+          <w:trHeight w:val="300"/>
+        </w:trPr>
+        <w:tc>
+          <w:tcPr>
+            <w:tcW w:w="2985" w:type="dxa"/>
+            <w:tcMar/>
+            <w:vAlign w:val="center"/>
+          </w:tcPr>
+          <w:p>
+            <w:pPr>
+              <w:spacing w:before="0" w:beforeAutospacing="off" w:after="0" w:afterAutospacing="off"/>
+              <w:ind w:left="720"/>
+            </w:pPr>
+            <w:r>
+              <w:rPr/>
+              <w:t>Static method</w:t>
+            </w:r>
+          </w:p>
+        </w:tc>
+        <w:tc>
+          <w:tcPr>
+            <w:tcW w:w="2337" w:type="dxa"/>
+            <w:tcMar/>
+            <w:vAlign w:val="center"/>
+          </w:tcPr>
+          <w:p>
+            <w:pPr>
+              <w:spacing w:before="0" w:beforeAutospacing="off" w:after="0" w:afterAutospacing="off"/>
+              <w:ind w:left="720"/>
+              <w:rPr>
+                <w:rFonts w:ascii="Consolas" w:hAnsi="Consolas" w:eastAsia="Consolas" w:cs="Consolas"/>
+              </w:rPr>
+            </w:pPr>
+            <w:r>
+              <w:rPr>
+                <w:rFonts w:ascii="Consolas" w:hAnsi="Consolas" w:eastAsia="Consolas" w:cs="Consolas"/>
+              </w:rPr>
+              <w:t>Class::</w:t>
+            </w:r>
+            <w:r>
+              <w:rPr>
+                <w:rFonts w:ascii="Consolas" w:hAnsi="Consolas" w:eastAsia="Consolas" w:cs="Consolas"/>
+              </w:rPr>
+              <w:t>staticMethod</w:t>
+            </w:r>
+          </w:p>
+          <w:p>
+            <w:pPr>
+              <w:spacing w:before="0" w:beforeAutospacing="off" w:after="0" w:afterAutospacing="off"/>
+              <w:ind w:left="720"/>
+              <w:rPr>
+                <w:rFonts w:ascii="Consolas" w:hAnsi="Consolas" w:eastAsia="Consolas" w:cs="Consolas"/>
+              </w:rPr>
+            </w:pPr>
+          </w:p>
+        </w:tc>
+        <w:tc>
+          <w:tcPr>
+            <w:tcW w:w="2337" w:type="dxa"/>
+            <w:tcMar/>
+            <w:vAlign w:val="center"/>
+          </w:tcPr>
+          <w:p>
+            <w:pPr>
+              <w:spacing w:before="0" w:beforeAutospacing="off" w:after="0" w:afterAutospacing="off"/>
+              <w:ind w:left="720"/>
+            </w:pPr>
+            <w:r>
+              <w:rPr>
+                <w:rFonts w:ascii="Consolas" w:hAnsi="Consolas" w:eastAsia="Consolas" w:cs="Consolas"/>
+              </w:rPr>
+              <w:t>Math::</w:t>
+            </w:r>
+            <w:r>
+              <w:rPr>
+                <w:rFonts w:ascii="Consolas" w:hAnsi="Consolas" w:eastAsia="Consolas" w:cs="Consolas"/>
+              </w:rPr>
+              <w:t>max</w:t>
+            </w:r>
+          </w:p>
+        </w:tc>
+      </w:tr>
+      <w:tr>
+        <w:trPr>
+          <w:trHeight w:val="300"/>
+        </w:trPr>
+        <w:tc>
+          <w:tcPr>
+            <w:tcW w:w="2985" w:type="dxa"/>
+            <w:tcMar/>
+            <w:vAlign w:val="center"/>
+          </w:tcPr>
+          <w:p>
+            <w:pPr>
+              <w:spacing w:before="0" w:beforeAutospacing="off" w:after="0" w:afterAutospacing="off"/>
+              <w:ind w:left="720"/>
+            </w:pPr>
+            <w:r>
+              <w:rPr/>
+              <w:t xml:space="preserve">Instance of </w:t>
+            </w:r>
+            <w:r>
+              <w:rPr/>
+              <w:t>particular object</w:t>
+            </w:r>
+          </w:p>
+          <w:p>
+            <w:pPr>
+              <w:spacing w:before="0" w:beforeAutospacing="off" w:after="0" w:afterAutospacing="off"/>
+              <w:ind w:left="720"/>
+            </w:pPr>
+          </w:p>
+        </w:tc>
+        <w:tc>
+          <w:tcPr>
+            <w:tcW w:w="2337" w:type="dxa"/>
+            <w:tcMar/>
+            <w:vAlign w:val="center"/>
+          </w:tcPr>
+          <w:p>
+            <w:pPr>
+              <w:spacing w:before="0" w:beforeAutospacing="off" w:after="0" w:afterAutospacing="off"/>
+              <w:ind w:left="720"/>
+            </w:pPr>
+            <w:r>
+              <w:rPr>
+                <w:rFonts w:ascii="Consolas" w:hAnsi="Consolas" w:eastAsia="Consolas" w:cs="Consolas"/>
+              </w:rPr>
+              <w:t>obj</w:t>
+            </w:r>
+            <w:r>
+              <w:rPr>
+                <w:rFonts w:ascii="Consolas" w:hAnsi="Consolas" w:eastAsia="Consolas" w:cs="Consolas"/>
+              </w:rPr>
+              <w:t>::method</w:t>
+            </w:r>
+          </w:p>
+        </w:tc>
+        <w:tc>
+          <w:tcPr>
+            <w:tcW w:w="2337" w:type="dxa"/>
+            <w:tcMar/>
+            <w:vAlign w:val="center"/>
+          </w:tcPr>
+          <w:p>
+            <w:pPr>
+              <w:spacing w:before="0" w:beforeAutospacing="off" w:after="0" w:afterAutospacing="off"/>
+              <w:ind w:left="720"/>
+            </w:pPr>
+            <w:r>
+              <w:rPr>
+                <w:rFonts w:ascii="Consolas" w:hAnsi="Consolas" w:eastAsia="Consolas" w:cs="Consolas"/>
+              </w:rPr>
+              <w:t>obj</w:t>
+            </w:r>
+            <w:r>
+              <w:rPr>
+                <w:rFonts w:ascii="Consolas" w:hAnsi="Consolas" w:eastAsia="Consolas" w:cs="Consolas"/>
+              </w:rPr>
+              <w:t>::print</w:t>
+            </w:r>
+          </w:p>
+        </w:tc>
+      </w:tr>
+      <w:tr>
+        <w:trPr>
+          <w:trHeight w:val="300"/>
+        </w:trPr>
+        <w:tc>
+          <w:tcPr>
+            <w:tcW w:w="2985" w:type="dxa"/>
+            <w:tcMar/>
+            <w:vAlign w:val="center"/>
+          </w:tcPr>
+          <w:p>
+            <w:pPr>
+              <w:spacing w:before="0" w:beforeAutospacing="off" w:after="0" w:afterAutospacing="off"/>
+              <w:ind w:left="720"/>
+            </w:pPr>
+            <w:r>
+              <w:rPr/>
+              <w:t>Instance of arbitrary object</w:t>
+            </w:r>
+          </w:p>
+          <w:p>
+            <w:pPr>
+              <w:spacing w:before="0" w:beforeAutospacing="off" w:after="0" w:afterAutospacing="off"/>
+              <w:ind w:left="720"/>
+            </w:pPr>
+          </w:p>
+        </w:tc>
+        <w:tc>
+          <w:tcPr>
+            <w:tcW w:w="2337" w:type="dxa"/>
+            <w:tcMar/>
+            <w:vAlign w:val="center"/>
+          </w:tcPr>
+          <w:p>
+            <w:pPr>
+              <w:spacing w:before="0" w:beforeAutospacing="off" w:after="0" w:afterAutospacing="off"/>
+              <w:ind w:left="720"/>
+            </w:pPr>
+            <w:r>
+              <w:rPr>
+                <w:rFonts w:ascii="Consolas" w:hAnsi="Consolas" w:eastAsia="Consolas" w:cs="Consolas"/>
+              </w:rPr>
+              <w:t>Class::</w:t>
+            </w:r>
+            <w:r>
+              <w:rPr>
+                <w:rFonts w:ascii="Consolas" w:hAnsi="Consolas" w:eastAsia="Consolas" w:cs="Consolas"/>
+              </w:rPr>
+              <w:t>method</w:t>
+            </w:r>
+          </w:p>
+        </w:tc>
+        <w:tc>
+          <w:tcPr>
+            <w:tcW w:w="2337" w:type="dxa"/>
+            <w:tcMar/>
+            <w:vAlign w:val="center"/>
+          </w:tcPr>
+          <w:p>
+            <w:pPr>
+              <w:spacing w:before="0" w:beforeAutospacing="off" w:after="0" w:afterAutospacing="off"/>
+              <w:ind w:left="720"/>
+              <w:rPr>
+                <w:rFonts w:ascii="Consolas" w:hAnsi="Consolas" w:eastAsia="Consolas" w:cs="Consolas"/>
+              </w:rPr>
+            </w:pPr>
+            <w:r>
+              <w:rPr>
+                <w:rFonts w:ascii="Consolas" w:hAnsi="Consolas" w:eastAsia="Consolas" w:cs="Consolas"/>
+              </w:rPr>
+              <w:t>String::</w:t>
+            </w:r>
+            <w:r>
+              <w:rPr>
+                <w:rFonts w:ascii="Consolas" w:hAnsi="Consolas" w:eastAsia="Consolas" w:cs="Consolas"/>
+              </w:rPr>
+              <w:t>toLowerCase</w:t>
+            </w:r>
+          </w:p>
+        </w:tc>
+      </w:tr>
+      <w:tr>
+        <w:trPr>
+          <w:trHeight w:val="300"/>
+        </w:trPr>
+        <w:tc>
+          <w:tcPr>
+            <w:tcW w:w="2985" w:type="dxa"/>
+            <w:tcMar/>
+            <w:vAlign w:val="center"/>
+          </w:tcPr>
+          <w:p>
+            <w:pPr>
+              <w:spacing w:before="0" w:beforeAutospacing="off" w:after="0" w:afterAutospacing="off"/>
+              <w:ind w:left="720"/>
+            </w:pPr>
+            <w:r>
+              <w:rPr/>
+              <w:t>Constructor</w:t>
+            </w:r>
+          </w:p>
+        </w:tc>
+        <w:tc>
+          <w:tcPr>
+            <w:tcW w:w="2337" w:type="dxa"/>
+            <w:tcMar/>
+            <w:vAlign w:val="center"/>
+          </w:tcPr>
+          <w:p>
+            <w:pPr>
+              <w:spacing w:before="0" w:beforeAutospacing="off" w:after="0" w:afterAutospacing="off"/>
+              <w:ind w:left="720"/>
+            </w:pPr>
+            <w:r>
+              <w:rPr>
+                <w:rFonts w:ascii="Consolas" w:hAnsi="Consolas" w:eastAsia="Consolas" w:cs="Consolas"/>
+              </w:rPr>
+              <w:t>Class::</w:t>
+            </w:r>
+            <w:r>
+              <w:rPr>
+                <w:rFonts w:ascii="Consolas" w:hAnsi="Consolas" w:eastAsia="Consolas" w:cs="Consolas"/>
+              </w:rPr>
+              <w:t>new</w:t>
+            </w:r>
+          </w:p>
+        </w:tc>
+        <w:tc>
+          <w:tcPr>
+            <w:tcW w:w="2337" w:type="dxa"/>
+            <w:tcMar/>
+            <w:vAlign w:val="center"/>
+          </w:tcPr>
+          <w:p>
+            <w:pPr>
+              <w:spacing w:before="0" w:beforeAutospacing="off" w:after="0" w:afterAutospacing="off"/>
+              <w:ind w:left="720"/>
+            </w:pPr>
+            <w:r>
+              <w:rPr>
+                <w:rFonts w:ascii="Consolas" w:hAnsi="Consolas" w:eastAsia="Consolas" w:cs="Consolas"/>
+              </w:rPr>
+              <w:t>ArrayList</w:t>
+            </w:r>
+            <w:r>
+              <w:rPr>
+                <w:rFonts w:ascii="Consolas" w:hAnsi="Consolas" w:eastAsia="Consolas" w:cs="Consolas"/>
+              </w:rPr>
+              <w:t>::new</w:t>
+            </w:r>
+          </w:p>
+        </w:tc>
+      </w:tr>
+    </w:tbl>
+    <w:p>
+      <w:pPr>
+        <w:pStyle w:val="Normal"/>
+        <w:ind w:left="0" w:firstLine="720"/>
+        <w:rPr>
+          <w:rFonts w:ascii="Calibri Light" w:hAnsi="Calibri Light" w:eastAsia="Calibri Light" w:cs="Calibri Light"/>
+          <w:noProof w:val="0"/>
+          <w:sz w:val="21"/>
+          <w:szCs w:val="21"/>
+          <w:lang w:val="en-IN"/>
+        </w:rPr>
+      </w:pPr>
+    </w:p>
+    <w:p>
+      <w:pPr>
+        <w:pStyle w:val="Normal"/>
+        <w:ind w:left="0" w:firstLine="720"/>
+        <w:rPr>
+          <w:rFonts w:ascii="Calibri Light" w:hAnsi="Calibri Light" w:eastAsia="Calibri Light" w:cs="Calibri Light"/>
+          <w:b w:val="1"/>
+          <w:bCs w:val="1"/>
+          <w:noProof w:val="0"/>
+          <w:sz w:val="21"/>
+          <w:szCs w:val="21"/>
+          <w:lang w:val="en-IN"/>
         </w:rPr>
       </w:pPr>
     </w:p>
@@ -11264,11 +13542,31 @@
       <w:spacing xmlns:w="http://schemas.openxmlformats.org/wordprocessingml/2006/main" w:after="0" w:line="240" w:lineRule="auto"/>
     </w:pPr>
   </w:style>
+  <w:style w:type="paragraph" w:styleId="Heading1">
+    <w:uiPriority w:val="9"/>
+    <w:name w:val="heading 1"/>
+    <w:basedOn w:val="Normal"/>
+    <w:next w:val="Normal"/>
+    <w:qFormat/>
+    <w:rsid w:val="15B3C72B"/>
+    <w:rPr>
+      <w:rFonts w:ascii="Calibri Light" w:hAnsi="Calibri Light" w:eastAsia="" w:cs="" w:asciiTheme="majorAscii" w:hAnsiTheme="majorAscii" w:eastAsiaTheme="majorEastAsia" w:cstheme="majorBidi"/>
+      <w:color w:val="2E74B5" w:themeColor="accent1" w:themeTint="FF" w:themeShade="BF"/>
+      <w:sz w:val="40"/>
+      <w:szCs w:val="40"/>
+    </w:rPr>
+    <w:pPr>
+      <w:keepNext w:val="1"/>
+      <w:keepLines w:val="1"/>
+      <w:spacing w:before="360" w:after="80"/>
+      <w:outlineLvl w:val="0"/>
+    </w:pPr>
+  </w:style>
 </w:styles>
 </file>
 
 <file path=word/theme/theme1.xml><?xml version="1.0" encoding="utf-8"?>
-<a:theme xmlns:a="http://schemas.openxmlformats.org/drawingml/2006/main" name="Office Theme">
+<a:theme xmlns:a="http://schemas.openxmlformats.org/drawingml/2006/main" xmlns:thm15="http://schemas.microsoft.com/office/thememl/2012/main" name="Office Theme">
   <a:themeElements>
     <a:clrScheme name="Office">
       <a:dk1>

</xml_diff>

<commit_message>
added new java 8 features
</commit_message>
<xml_diff>
--- a/java8.docx
+++ b/java8.docx
@@ -21972,9 +21972,7 @@
         </w:rPr>
         <w:br w:type="page"/>
       </w:r>
-      <w:bookmarkStart w:id="0" w:name="_GoBack"/>
-    </w:p>
-    <w:bookmarkEnd w:id="0"/>
+    </w:p>
     <w:p>
       <w:pPr>
         <w:pBdr>
@@ -21997,6 +21995,177 @@
           <w:szCs w:val="26"/>
         </w:rPr>
       </w:pPr>
+      <w:proofErr w:type="gramStart"/>
+      <w:r>
+        <w:rPr>
+          <w:rFonts w:ascii="Calibri Light" w:hAnsi="Calibri Light"/>
+          <w:sz w:val="24"/>
+          <w:szCs w:val="26"/>
+        </w:rPr>
+        <w:t>java</w:t>
+      </w:r>
+      <w:proofErr w:type="gramEnd"/>
+      <w:r>
+        <w:rPr>
+          <w:rFonts w:ascii="Calibri Light" w:hAnsi="Calibri Light"/>
+          <w:sz w:val="24"/>
+          <w:szCs w:val="26"/>
+        </w:rPr>
+        <w:t xml:space="preserve"> 9</w:t>
+      </w:r>
+    </w:p>
+    <w:p>
+      <w:pPr>
+        <w:pStyle w:val="ListParagraph"/>
+        <w:numPr>
+          <w:ilvl w:val="0"/>
+          <w:numId w:val="4"/>
+        </w:numPr>
+        <w:spacing w:before="100" w:beforeAutospacing="1" w:after="100" w:afterAutospacing="1" w:line="240" w:lineRule="auto"/>
+      </w:pPr>
+      <w:proofErr w:type="spellStart"/>
+      <w:r>
+        <w:t>JShell</w:t>
+      </w:r>
+      <w:proofErr w:type="spellEnd"/>
+      <w:r>
+        <w:t xml:space="preserve"> (REPL)</w:t>
+      </w:r>
+    </w:p>
+    <w:p>
+      <w:pPr>
+        <w:pStyle w:val="ListParagraph"/>
+        <w:numPr>
+          <w:ilvl w:val="0"/>
+          <w:numId w:val="4"/>
+        </w:numPr>
+        <w:spacing w:before="100" w:beforeAutospacing="1" w:after="100" w:afterAutospacing="1" w:line="240" w:lineRule="auto"/>
+        <w:rPr>
+          <w:rFonts w:ascii="Calibri Light" w:hAnsi="Calibri Light"/>
+          <w:sz w:val="24"/>
+          <w:szCs w:val="26"/>
+        </w:rPr>
+      </w:pPr>
+      <w:r>
+        <w:t>2. Module System (Project Jigsaw)</w:t>
+      </w:r>
+    </w:p>
+    <w:p>
+      <w:pPr>
+        <w:pStyle w:val="ListParagraph"/>
+        <w:numPr>
+          <w:ilvl w:val="0"/>
+          <w:numId w:val="4"/>
+        </w:numPr>
+        <w:spacing w:before="100" w:beforeAutospacing="1" w:after="100" w:afterAutospacing="1" w:line="240" w:lineRule="auto"/>
+        <w:rPr>
+          <w:rFonts w:ascii="Calibri Light" w:hAnsi="Calibri Light"/>
+          <w:sz w:val="24"/>
+          <w:szCs w:val="26"/>
+        </w:rPr>
+      </w:pPr>
+      <w:r>
+        <w:t>Factory Methods for Immutable Collections</w:t>
+      </w:r>
+    </w:p>
+    <w:p>
+      <w:pPr>
+        <w:pStyle w:val="ListParagraph"/>
+        <w:numPr>
+          <w:ilvl w:val="0"/>
+          <w:numId w:val="4"/>
+        </w:numPr>
+        <w:spacing w:before="100" w:beforeAutospacing="1" w:after="100" w:afterAutospacing="1" w:line="240" w:lineRule="auto"/>
+        <w:rPr>
+          <w:rFonts w:ascii="Calibri Light" w:hAnsi="Calibri Light"/>
+          <w:sz w:val="24"/>
+          <w:szCs w:val="26"/>
+        </w:rPr>
+      </w:pPr>
+      <w:r>
+        <w:t>4. Stream API Enhancements</w:t>
+      </w:r>
+    </w:p>
+    <w:p>
+      <w:pPr>
+        <w:pStyle w:val="ListParagraph"/>
+        <w:numPr>
+          <w:ilvl w:val="0"/>
+          <w:numId w:val="4"/>
+        </w:numPr>
+        <w:spacing w:before="100" w:beforeAutospacing="1" w:after="100" w:afterAutospacing="1" w:line="240" w:lineRule="auto"/>
+        <w:rPr>
+          <w:rFonts w:ascii="Calibri Light" w:hAnsi="Calibri Light"/>
+          <w:sz w:val="24"/>
+          <w:szCs w:val="26"/>
+        </w:rPr>
+      </w:pPr>
+      <w:r>
+        <w:t>5. Interface Private Methods</w:t>
+      </w:r>
+    </w:p>
+    <w:p>
+      <w:pPr>
+        <w:pStyle w:val="ListParagraph"/>
+        <w:numPr>
+          <w:ilvl w:val="0"/>
+          <w:numId w:val="4"/>
+        </w:numPr>
+        <w:spacing w:before="100" w:beforeAutospacing="1" w:after="100" w:afterAutospacing="1" w:line="240" w:lineRule="auto"/>
+        <w:rPr>
+          <w:rFonts w:ascii="Calibri Light" w:hAnsi="Calibri Light"/>
+          <w:sz w:val="24"/>
+          <w:szCs w:val="26"/>
+        </w:rPr>
+      </w:pPr>
+      <w:r>
+        <w:t>5. Interface Private Methods</w:t>
+      </w:r>
+    </w:p>
+    <w:p>
+      <w:pPr>
+        <w:pStyle w:val="ListParagraph"/>
+        <w:numPr>
+          <w:ilvl w:val="0"/>
+          <w:numId w:val="4"/>
+        </w:numPr>
+        <w:spacing w:before="100" w:beforeAutospacing="1" w:after="100" w:afterAutospacing="1" w:line="240" w:lineRule="auto"/>
+        <w:rPr>
+          <w:rFonts w:ascii="Calibri Light" w:hAnsi="Calibri Light"/>
+          <w:sz w:val="24"/>
+          <w:szCs w:val="26"/>
+        </w:rPr>
+      </w:pPr>
+      <w:r>
+        <w:t>9. Reactive Streams</w:t>
+      </w:r>
+    </w:p>
+    <w:p>
+      <w:pPr>
+        <w:pStyle w:val="ListParagraph"/>
+        <w:numPr>
+          <w:ilvl w:val="0"/>
+          <w:numId w:val="4"/>
+        </w:numPr>
+        <w:spacing w:before="100" w:beforeAutospacing="1" w:after="100" w:afterAutospacing="1" w:line="240" w:lineRule="auto"/>
+        <w:rPr>
+          <w:rFonts w:ascii="Calibri Light" w:hAnsi="Calibri Light"/>
+          <w:sz w:val="24"/>
+          <w:szCs w:val="26"/>
+        </w:rPr>
+      </w:pPr>
+      <w:r>
+        <w:t>Multi-Release JARs</w:t>
+      </w:r>
+      <w:r>
+        <w:t xml:space="preserve"> (</w:t>
+      </w:r>
+      <w:r>
+        <w:t>Same JAR works in Java 8, 9, 11, etc.</w:t>
+      </w:r>
+      <w:r>
+        <w:t>)</w:t>
+      </w:r>
     </w:p>
     <w:p>
       <w:pPr>
@@ -22020,6 +22189,136 @@
           <w:szCs w:val="26"/>
         </w:rPr>
       </w:pPr>
+      <w:r>
+        <w:rPr>
+          <w:rFonts w:ascii="Calibri Light" w:hAnsi="Calibri Light"/>
+          <w:sz w:val="24"/>
+          <w:szCs w:val="26"/>
+        </w:rPr>
+        <w:t>Java 10</w:t>
+      </w:r>
+    </w:p>
+    <w:p>
+      <w:pPr>
+        <w:pStyle w:val="ListParagraph"/>
+        <w:numPr>
+          <w:ilvl w:val="0"/>
+          <w:numId w:val="4"/>
+        </w:numPr>
+        <w:spacing w:before="100" w:beforeAutospacing="1" w:after="100" w:afterAutospacing="1" w:line="240" w:lineRule="auto"/>
+      </w:pPr>
+      <w:proofErr w:type="spellStart"/>
+      <w:proofErr w:type="gramStart"/>
+      <w:r>
+        <w:t>var</w:t>
+      </w:r>
+      <w:proofErr w:type="spellEnd"/>
+      <w:proofErr w:type="gramEnd"/>
+      <w:r>
+        <w:t xml:space="preserve"> – Local Variable Type Inference</w:t>
+      </w:r>
+    </w:p>
+    <w:p>
+      <w:pPr>
+        <w:pStyle w:val="ListParagraph"/>
+        <w:numPr>
+          <w:ilvl w:val="0"/>
+          <w:numId w:val="4"/>
+        </w:numPr>
+        <w:spacing w:before="100" w:beforeAutospacing="1" w:after="100" w:afterAutospacing="1" w:line="240" w:lineRule="auto"/>
+      </w:pPr>
+      <w:r>
+        <w:t>2. Garbage Collector Interface (GC Interface)</w:t>
+      </w:r>
+    </w:p>
+    <w:p>
+      <w:pPr>
+        <w:pStyle w:val="ListParagraph"/>
+        <w:numPr>
+          <w:ilvl w:val="0"/>
+          <w:numId w:val="4"/>
+        </w:numPr>
+        <w:spacing w:before="100" w:beforeAutospacing="1" w:after="100" w:afterAutospacing="1" w:line="240" w:lineRule="auto"/>
+      </w:pPr>
+      <w:r>
+        <w:t>3. Application Class-Data Sharing (</w:t>
+      </w:r>
+      <w:proofErr w:type="spellStart"/>
+      <w:r>
+        <w:t>AppCDS</w:t>
+      </w:r>
+      <w:proofErr w:type="spellEnd"/>
+      <w:r>
+        <w:t>)</w:t>
+      </w:r>
+    </w:p>
+    <w:p>
+      <w:pPr>
+        <w:pStyle w:val="ListParagraph"/>
+        <w:numPr>
+          <w:ilvl w:val="0"/>
+          <w:numId w:val="4"/>
+        </w:numPr>
+        <w:spacing w:before="100" w:beforeAutospacing="1" w:after="100" w:afterAutospacing="1" w:line="240" w:lineRule="auto"/>
+      </w:pPr>
+      <w:r>
+        <w:t>Parallel Full GC for G1</w:t>
+      </w:r>
+    </w:p>
+    <w:p>
+      <w:pPr>
+        <w:pStyle w:val="ListParagraph"/>
+        <w:numPr>
+          <w:ilvl w:val="0"/>
+          <w:numId w:val="4"/>
+        </w:numPr>
+        <w:spacing w:before="100" w:beforeAutospacing="1" w:after="100" w:afterAutospacing="1" w:line="240" w:lineRule="auto"/>
+      </w:pPr>
+      <w:r>
+        <w:t>Thread-Local Handshakes</w:t>
+      </w:r>
+    </w:p>
+    <w:p>
+      <w:pPr>
+        <w:pStyle w:val="ListParagraph"/>
+        <w:numPr>
+          <w:ilvl w:val="0"/>
+          <w:numId w:val="4"/>
+        </w:numPr>
+        <w:spacing w:before="100" w:beforeAutospacing="1" w:after="100" w:afterAutospacing="1" w:line="240" w:lineRule="auto"/>
+      </w:pPr>
+      <w:r>
+        <w:t>Heap Allocation on Alternative Memory Devices</w:t>
+      </w:r>
+    </w:p>
+    <w:p>
+      <w:pPr>
+        <w:pStyle w:val="ListParagraph"/>
+        <w:numPr>
+          <w:ilvl w:val="0"/>
+          <w:numId w:val="4"/>
+        </w:numPr>
+        <w:spacing w:before="100" w:beforeAutospacing="1" w:after="100" w:afterAutospacing="1" w:line="240" w:lineRule="auto"/>
+      </w:pPr>
+      <w:r>
+        <w:t>Time-Based Release Versioning</w:t>
+      </w:r>
+      <w:r>
+        <w:t xml:space="preserve">  -- </w:t>
+      </w:r>
+      <w:r>
+        <w:t>&lt;FEATURE&gt;.&lt;INTERIM&gt;.&lt;UPDATE&gt;.&lt;PATCH&gt;</w:t>
+      </w:r>
+    </w:p>
+    <w:p>
+      <w:pPr>
+        <w:pStyle w:val="ListParagraph"/>
+        <w:numPr>
+          <w:ilvl w:val="0"/>
+          <w:numId w:val="4"/>
+        </w:numPr>
+        <w:spacing w:before="100" w:beforeAutospacing="1" w:after="100" w:afterAutospacing="1" w:line="240" w:lineRule="auto"/>
+      </w:pPr>
     </w:p>
     <w:p>
       <w:pPr>
@@ -22043,132 +22342,124 @@
           <w:szCs w:val="26"/>
         </w:rPr>
       </w:pPr>
+      <w:r>
+        <w:rPr>
+          <w:rFonts w:ascii="Calibri Light" w:hAnsi="Calibri Light"/>
+          <w:sz w:val="24"/>
+          <w:szCs w:val="26"/>
+        </w:rPr>
+        <w:t>Java 11</w:t>
+      </w:r>
+    </w:p>
+    <w:p>
+      <w:pPr>
+        <w:pStyle w:val="ListParagraph"/>
+        <w:numPr>
+          <w:ilvl w:val="0"/>
+          <w:numId w:val="6"/>
+        </w:numPr>
+        <w:spacing w:before="100" w:beforeAutospacing="1" w:after="100" w:afterAutospacing="1" w:line="240" w:lineRule="auto"/>
+      </w:pPr>
+      <w:r>
+        <w:t>New String API Methods</w:t>
+      </w:r>
+    </w:p>
+    <w:p>
+      <w:pPr>
+        <w:pStyle w:val="ListParagraph"/>
+        <w:numPr>
+          <w:ilvl w:val="0"/>
+          <w:numId w:val="6"/>
+        </w:numPr>
+        <w:spacing w:before="100" w:beforeAutospacing="1" w:after="100" w:afterAutospacing="1" w:line="240" w:lineRule="auto"/>
+        <w:rPr>
+          <w:rFonts w:ascii="Calibri Light" w:hAnsi="Calibri Light"/>
+          <w:sz w:val="24"/>
+          <w:szCs w:val="26"/>
+        </w:rPr>
+      </w:pPr>
+      <w:proofErr w:type="spellStart"/>
+      <w:r>
+        <w:rPr>
+          <w:rStyle w:val="HTMLCode"/>
+          <w:rFonts w:eastAsiaTheme="minorHAnsi"/>
+        </w:rPr>
+        <w:t>var</w:t>
+      </w:r>
+      <w:proofErr w:type="spellEnd"/>
+      <w:r>
+        <w:t xml:space="preserve"> in Lambda Parameters</w:t>
+      </w:r>
+    </w:p>
+    <w:p>
+      <w:pPr>
+        <w:pStyle w:val="ListParagraph"/>
+        <w:numPr>
+          <w:ilvl w:val="0"/>
+          <w:numId w:val="6"/>
+        </w:numPr>
+        <w:spacing w:before="100" w:beforeAutospacing="1" w:after="100" w:afterAutospacing="1" w:line="240" w:lineRule="auto"/>
+        <w:rPr>
+          <w:rFonts w:ascii="Calibri Light" w:hAnsi="Calibri Light"/>
+          <w:sz w:val="24"/>
+          <w:szCs w:val="26"/>
+        </w:rPr>
+      </w:pPr>
+      <w:r>
+        <w:t>New HTTP Client</w:t>
+      </w:r>
+    </w:p>
+    <w:p>
+      <w:pPr>
+        <w:pStyle w:val="ListParagraph"/>
+        <w:numPr>
+          <w:ilvl w:val="0"/>
+          <w:numId w:val="6"/>
+        </w:numPr>
+        <w:spacing w:before="100" w:beforeAutospacing="1" w:after="100" w:afterAutospacing="1" w:line="240" w:lineRule="auto"/>
+        <w:rPr>
+          <w:rFonts w:ascii="Calibri Light" w:hAnsi="Calibri Light"/>
+          <w:sz w:val="24"/>
+          <w:szCs w:val="26"/>
+        </w:rPr>
+      </w:pPr>
+      <w:r>
+        <w:t>Files API Enhancements</w:t>
+      </w:r>
+    </w:p>
+    <w:p>
+      <w:pPr>
+        <w:pStyle w:val="ListParagraph"/>
+        <w:numPr>
+          <w:ilvl w:val="0"/>
+          <w:numId w:val="6"/>
+        </w:numPr>
+        <w:spacing w:before="100" w:beforeAutospacing="1" w:after="100" w:afterAutospacing="1" w:line="240" w:lineRule="auto"/>
+        <w:rPr>
+          <w:rFonts w:ascii="Calibri Light" w:hAnsi="Calibri Light"/>
+          <w:sz w:val="24"/>
+          <w:szCs w:val="26"/>
+        </w:rPr>
+      </w:pPr>
+      <w:r>
+        <w:rPr>
+          <w:rStyle w:val="HTMLCode"/>
+          <w:rFonts w:eastAsiaTheme="minorHAnsi"/>
+        </w:rPr>
+        <w:t>Optional</w:t>
+      </w:r>
+      <w:r>
+        <w:t xml:space="preserve"> Enhancements</w:t>
+      </w:r>
     </w:p>
     <w:p>
       <w:pPr>
         <w:pBdr>
           <w:bottom w:val="single" w:sz="12" w:space="1" w:color="auto"/>
         </w:pBdr>
-        <w:spacing w:before="100" w:beforeAutospacing="1" w:after="100" w:afterAutospacing="1" w:line="240" w:lineRule="auto"/>
-        <w:rPr>
-          <w:rFonts w:ascii="Calibri Light" w:hAnsi="Calibri Light"/>
-          <w:sz w:val="24"/>
-          <w:szCs w:val="26"/>
-        </w:rPr>
-      </w:pPr>
-    </w:p>
-    <w:p>
-      <w:pPr>
-        <w:spacing w:before="100" w:beforeAutospacing="1" w:after="100" w:afterAutospacing="1" w:line="240" w:lineRule="auto"/>
-        <w:rPr>
-          <w:rFonts w:ascii="Calibri Light" w:hAnsi="Calibri Light"/>
-          <w:sz w:val="24"/>
-          <w:szCs w:val="26"/>
-        </w:rPr>
-      </w:pPr>
-    </w:p>
-    <w:p>
-      <w:pPr>
-        <w:spacing w:before="100" w:beforeAutospacing="1" w:after="100" w:afterAutospacing="1" w:line="240" w:lineRule="auto"/>
-        <w:rPr>
-          <w:rFonts w:ascii="Calibri Light" w:hAnsi="Calibri Light"/>
-          <w:sz w:val="24"/>
-          <w:szCs w:val="26"/>
-        </w:rPr>
-      </w:pPr>
-    </w:p>
-    <w:p>
-      <w:pPr>
-        <w:spacing w:before="100" w:beforeAutospacing="1" w:after="100" w:afterAutospacing="1" w:line="240" w:lineRule="auto"/>
-        <w:rPr>
-          <w:rFonts w:ascii="Calibri Light" w:hAnsi="Calibri Light"/>
-          <w:sz w:val="24"/>
-          <w:szCs w:val="26"/>
-        </w:rPr>
-      </w:pPr>
-    </w:p>
-    <w:p>
-      <w:pPr>
-        <w:spacing w:before="100" w:beforeAutospacing="1" w:after="100" w:afterAutospacing="1" w:line="240" w:lineRule="auto"/>
-        <w:rPr>
-          <w:rFonts w:ascii="Calibri Light" w:hAnsi="Calibri Light"/>
-          <w:sz w:val="24"/>
-          <w:szCs w:val="26"/>
-        </w:rPr>
-      </w:pPr>
-    </w:p>
-    <w:p>
-      <w:pPr>
-        <w:spacing w:before="100" w:beforeAutospacing="1" w:after="100" w:afterAutospacing="1" w:line="240" w:lineRule="auto"/>
-        <w:rPr>
-          <w:rFonts w:ascii="Calibri Light" w:hAnsi="Calibri Light"/>
-          <w:sz w:val="24"/>
-          <w:szCs w:val="26"/>
-        </w:rPr>
-      </w:pPr>
-    </w:p>
-    <w:p>
-      <w:pPr>
-        <w:spacing w:before="100" w:beforeAutospacing="1" w:after="100" w:afterAutospacing="1" w:line="240" w:lineRule="auto"/>
-        <w:rPr>
-          <w:rFonts w:ascii="Calibri Light" w:hAnsi="Calibri Light"/>
-          <w:sz w:val="24"/>
-          <w:szCs w:val="26"/>
-        </w:rPr>
-      </w:pPr>
-    </w:p>
-    <w:p>
-      <w:pPr>
-        <w:spacing w:before="100" w:beforeAutospacing="1" w:after="100" w:afterAutospacing="1" w:line="240" w:lineRule="auto"/>
-        <w:rPr>
-          <w:rFonts w:ascii="Calibri Light" w:hAnsi="Calibri Light"/>
-          <w:sz w:val="24"/>
-          <w:szCs w:val="26"/>
-        </w:rPr>
-      </w:pPr>
-    </w:p>
-    <w:p>
-      <w:pPr>
-        <w:spacing w:before="100" w:beforeAutospacing="1" w:after="100" w:afterAutospacing="1" w:line="240" w:lineRule="auto"/>
-        <w:rPr>
-          <w:rFonts w:ascii="Calibri Light" w:hAnsi="Calibri Light"/>
-          <w:sz w:val="24"/>
-          <w:szCs w:val="26"/>
-        </w:rPr>
-      </w:pPr>
-    </w:p>
-    <w:p>
-      <w:pPr>
-        <w:spacing w:before="100" w:beforeAutospacing="1" w:after="100" w:afterAutospacing="1" w:line="240" w:lineRule="auto"/>
-        <w:rPr>
-          <w:rFonts w:ascii="Calibri Light" w:hAnsi="Calibri Light"/>
-          <w:sz w:val="24"/>
-          <w:szCs w:val="26"/>
-        </w:rPr>
-      </w:pPr>
-    </w:p>
-    <w:p>
-      <w:pPr>
-        <w:spacing w:before="100" w:beforeAutospacing="1" w:after="100" w:afterAutospacing="1" w:line="240" w:lineRule="auto"/>
-        <w:rPr>
-          <w:rFonts w:ascii="Calibri Light" w:hAnsi="Calibri Light"/>
-          <w:sz w:val="24"/>
-          <w:szCs w:val="26"/>
-        </w:rPr>
-      </w:pPr>
-    </w:p>
-    <w:p>
-      <w:pPr>
-        <w:spacing w:before="100" w:beforeAutospacing="1" w:after="100" w:afterAutospacing="1" w:line="240" w:lineRule="auto"/>
-        <w:rPr>
-          <w:rFonts w:ascii="Calibri Light" w:hAnsi="Calibri Light"/>
-          <w:sz w:val="24"/>
-          <w:szCs w:val="26"/>
-        </w:rPr>
-      </w:pPr>
-    </w:p>
-    <w:p>
-      <w:pPr>
+        <w:tabs>
+          <w:tab w:val="left" w:pos="2500"/>
+        </w:tabs>
         <w:spacing w:before="100" w:beforeAutospacing="1" w:after="100" w:afterAutospacing="1" w:line="240" w:lineRule="auto"/>
         <w:rPr>
           <w:rFonts w:ascii="Calibri Light" w:hAnsi="Calibri Light"/>
@@ -22194,6 +22485,1967 @@
           <w:szCs w:val="26"/>
         </w:rPr>
       </w:pPr>
+      <w:r>
+        <w:rPr>
+          <w:rFonts w:ascii="Calibri Light" w:hAnsi="Calibri Light"/>
+          <w:sz w:val="24"/>
+          <w:szCs w:val="26"/>
+        </w:rPr>
+        <w:t>Java 12</w:t>
+      </w:r>
+    </w:p>
+    <w:p>
+      <w:pPr>
+        <w:pStyle w:val="ListParagraph"/>
+        <w:numPr>
+          <w:ilvl w:val="0"/>
+          <w:numId w:val="7"/>
+        </w:numPr>
+        <w:spacing w:before="100" w:beforeAutospacing="1" w:after="100" w:afterAutospacing="1" w:line="240" w:lineRule="auto"/>
+        <w:rPr>
+          <w:rFonts w:ascii="Calibri Light" w:hAnsi="Calibri Light"/>
+          <w:sz w:val="24"/>
+          <w:szCs w:val="26"/>
+        </w:rPr>
+      </w:pPr>
+      <w:r>
+        <w:t>G1 GC Improvements</w:t>
+      </w:r>
+    </w:p>
+    <w:p>
+      <w:pPr>
+        <w:pBdr>
+          <w:bottom w:val="single" w:sz="12" w:space="1" w:color="auto"/>
+        </w:pBdr>
+        <w:tabs>
+          <w:tab w:val="left" w:pos="2500"/>
+        </w:tabs>
+        <w:spacing w:before="100" w:beforeAutospacing="1" w:after="100" w:afterAutospacing="1" w:line="240" w:lineRule="auto"/>
+        <w:rPr>
+          <w:rFonts w:ascii="Calibri Light" w:hAnsi="Calibri Light"/>
+          <w:sz w:val="24"/>
+          <w:szCs w:val="26"/>
+        </w:rPr>
+      </w:pPr>
+      <w:r>
+        <w:rPr>
+          <w:rFonts w:ascii="Calibri Light" w:hAnsi="Calibri Light"/>
+          <w:sz w:val="24"/>
+          <w:szCs w:val="26"/>
+        </w:rPr>
+        <w:tab/>
+      </w:r>
+    </w:p>
+    <w:p>
+      <w:pPr>
+        <w:pBdr>
+          <w:bottom w:val="single" w:sz="12" w:space="1" w:color="auto"/>
+        </w:pBdr>
+        <w:tabs>
+          <w:tab w:val="left" w:pos="2500"/>
+        </w:tabs>
+        <w:spacing w:before="100" w:beforeAutospacing="1" w:after="100" w:afterAutospacing="1" w:line="240" w:lineRule="auto"/>
+        <w:rPr>
+          <w:rFonts w:ascii="Calibri Light" w:hAnsi="Calibri Light"/>
+          <w:sz w:val="24"/>
+          <w:szCs w:val="26"/>
+        </w:rPr>
+      </w:pPr>
+      <w:r>
+        <w:rPr>
+          <w:rFonts w:ascii="Calibri Light" w:hAnsi="Calibri Light"/>
+          <w:sz w:val="24"/>
+          <w:szCs w:val="26"/>
+        </w:rPr>
+        <w:tab/>
+      </w:r>
+    </w:p>
+    <w:p>
+      <w:pPr>
+        <w:spacing w:before="100" w:beforeAutospacing="1" w:after="100" w:afterAutospacing="1" w:line="240" w:lineRule="auto"/>
+        <w:rPr>
+          <w:rFonts w:ascii="Calibri Light" w:hAnsi="Calibri Light"/>
+          <w:sz w:val="24"/>
+          <w:szCs w:val="26"/>
+        </w:rPr>
+      </w:pPr>
+      <w:r>
+        <w:rPr>
+          <w:rFonts w:ascii="Calibri Light" w:hAnsi="Calibri Light"/>
+          <w:sz w:val="24"/>
+          <w:szCs w:val="26"/>
+        </w:rPr>
+        <w:t>Java 14</w:t>
+      </w:r>
+    </w:p>
+    <w:p>
+      <w:pPr>
+        <w:pStyle w:val="ListParagraph"/>
+        <w:numPr>
+          <w:ilvl w:val="0"/>
+          <w:numId w:val="9"/>
+        </w:numPr>
+        <w:spacing w:before="100" w:beforeAutospacing="1" w:after="100" w:afterAutospacing="1" w:line="240" w:lineRule="auto"/>
+        <w:rPr>
+          <w:rFonts w:ascii="Calibri Light" w:hAnsi="Calibri Light"/>
+          <w:sz w:val="24"/>
+          <w:szCs w:val="26"/>
+        </w:rPr>
+      </w:pPr>
+      <w:r>
+        <w:t>Switch Expressions</w:t>
+      </w:r>
+    </w:p>
+    <w:p>
+      <w:pPr>
+        <w:pStyle w:val="ListParagraph"/>
+        <w:numPr>
+          <w:ilvl w:val="0"/>
+          <w:numId w:val="9"/>
+        </w:numPr>
+        <w:pBdr>
+          <w:bottom w:val="single" w:sz="12" w:space="1" w:color="auto"/>
+        </w:pBdr>
+        <w:tabs>
+          <w:tab w:val="left" w:pos="2500"/>
+        </w:tabs>
+        <w:spacing w:before="100" w:beforeAutospacing="1" w:after="100" w:afterAutospacing="1" w:line="240" w:lineRule="auto"/>
+        <w:rPr>
+          <w:rFonts w:ascii="Calibri Light" w:hAnsi="Calibri Light"/>
+          <w:sz w:val="24"/>
+          <w:szCs w:val="26"/>
+        </w:rPr>
+      </w:pPr>
+      <w:r>
+        <w:t xml:space="preserve">Helpful </w:t>
+      </w:r>
+      <w:proofErr w:type="spellStart"/>
+      <w:r>
+        <w:t>NullPointerException</w:t>
+      </w:r>
+      <w:proofErr w:type="spellEnd"/>
+      <w:r>
+        <w:t xml:space="preserve"> Messages</w:t>
+      </w:r>
+    </w:p>
+    <w:p>
+      <w:pPr>
+        <w:pBdr>
+          <w:bottom w:val="single" w:sz="12" w:space="1" w:color="auto"/>
+        </w:pBdr>
+        <w:tabs>
+          <w:tab w:val="left" w:pos="2500"/>
+        </w:tabs>
+        <w:spacing w:before="100" w:beforeAutospacing="1" w:after="100" w:afterAutospacing="1" w:line="240" w:lineRule="auto"/>
+        <w:ind w:left="720"/>
+        <w:rPr>
+          <w:rFonts w:ascii="Calibri Light" w:hAnsi="Calibri Light"/>
+          <w:sz w:val="24"/>
+          <w:szCs w:val="26"/>
+        </w:rPr>
+      </w:pPr>
+      <w:r>
+        <w:rPr>
+          <w:rFonts w:ascii="Calibri Light" w:hAnsi="Calibri Light"/>
+          <w:sz w:val="24"/>
+          <w:szCs w:val="26"/>
+        </w:rPr>
+        <w:tab/>
+      </w:r>
+      <w:r>
+        <w:rPr>
+          <w:rFonts w:ascii="Calibri Light" w:hAnsi="Calibri Light"/>
+          <w:sz w:val="24"/>
+          <w:szCs w:val="26"/>
+        </w:rPr>
+        <w:tab/>
+      </w:r>
+    </w:p>
+    <w:p>
+      <w:pPr>
+        <w:pBdr>
+          <w:bottom w:val="single" w:sz="12" w:space="1" w:color="auto"/>
+        </w:pBdr>
+        <w:tabs>
+          <w:tab w:val="left" w:pos="1210"/>
+        </w:tabs>
+        <w:spacing w:before="100" w:beforeAutospacing="1" w:after="100" w:afterAutospacing="1" w:line="240" w:lineRule="auto"/>
+        <w:rPr>
+          <w:rFonts w:ascii="Calibri Light" w:hAnsi="Calibri Light"/>
+          <w:sz w:val="24"/>
+          <w:szCs w:val="26"/>
+        </w:rPr>
+      </w:pPr>
+      <w:r>
+        <w:rPr>
+          <w:rFonts w:ascii="Calibri Light" w:hAnsi="Calibri Light"/>
+          <w:sz w:val="24"/>
+          <w:szCs w:val="26"/>
+        </w:rPr>
+        <w:t>Java 15</w:t>
+      </w:r>
+      <w:r>
+        <w:rPr>
+          <w:rFonts w:ascii="Calibri Light" w:hAnsi="Calibri Light"/>
+          <w:sz w:val="24"/>
+          <w:szCs w:val="26"/>
+        </w:rPr>
+        <w:tab/>
+      </w:r>
+    </w:p>
+    <w:p>
+      <w:pPr>
+        <w:pStyle w:val="ListParagraph"/>
+        <w:numPr>
+          <w:ilvl w:val="0"/>
+          <w:numId w:val="10"/>
+        </w:numPr>
+        <w:pBdr>
+          <w:bottom w:val="single" w:sz="12" w:space="1" w:color="auto"/>
+        </w:pBdr>
+        <w:tabs>
+          <w:tab w:val="left" w:pos="1210"/>
+        </w:tabs>
+        <w:spacing w:before="100" w:beforeAutospacing="1" w:after="100" w:afterAutospacing="1" w:line="240" w:lineRule="auto"/>
+      </w:pPr>
+      <w:r>
+        <w:t>Hidden Classes</w:t>
+      </w:r>
+    </w:p>
+    <w:p>
+      <w:pPr>
+        <w:pStyle w:val="ListParagraph"/>
+        <w:numPr>
+          <w:ilvl w:val="0"/>
+          <w:numId w:val="10"/>
+        </w:numPr>
+        <w:pBdr>
+          <w:bottom w:val="single" w:sz="12" w:space="1" w:color="auto"/>
+        </w:pBdr>
+        <w:tabs>
+          <w:tab w:val="left" w:pos="1210"/>
+        </w:tabs>
+        <w:spacing w:before="100" w:beforeAutospacing="1" w:after="100" w:afterAutospacing="1" w:line="240" w:lineRule="auto"/>
+      </w:pPr>
+      <w:proofErr w:type="spellStart"/>
+      <w:r>
+        <w:t>Nashorn</w:t>
+      </w:r>
+      <w:proofErr w:type="spellEnd"/>
+      <w:r>
+        <w:t xml:space="preserve"> JavaScript Engine Removed</w:t>
+      </w:r>
+    </w:p>
+    <w:p>
+      <w:pPr>
+        <w:pStyle w:val="ListParagraph"/>
+        <w:numPr>
+          <w:ilvl w:val="0"/>
+          <w:numId w:val="10"/>
+        </w:numPr>
+        <w:pBdr>
+          <w:bottom w:val="single" w:sz="12" w:space="1" w:color="auto"/>
+        </w:pBdr>
+        <w:tabs>
+          <w:tab w:val="left" w:pos="1210"/>
+        </w:tabs>
+        <w:spacing w:before="100" w:beforeAutospacing="1" w:after="100" w:afterAutospacing="1" w:line="240" w:lineRule="auto"/>
+      </w:pPr>
+      <w:r>
+        <w:t>Text blocks support for Escape sequences.</w:t>
+      </w:r>
+    </w:p>
+    <w:p>
+      <w:pPr>
+        <w:pStyle w:val="ListParagraph"/>
+        <w:numPr>
+          <w:ilvl w:val="0"/>
+          <w:numId w:val="10"/>
+        </w:numPr>
+        <w:pBdr>
+          <w:bottom w:val="single" w:sz="12" w:space="1" w:color="auto"/>
+        </w:pBdr>
+        <w:tabs>
+          <w:tab w:val="left" w:pos="1210"/>
+        </w:tabs>
+        <w:spacing w:before="100" w:beforeAutospacing="1" w:after="100" w:afterAutospacing="1" w:line="240" w:lineRule="auto"/>
+      </w:pPr>
+    </w:p>
+    <w:p>
+      <w:pPr>
+        <w:pBdr>
+          <w:bottom w:val="single" w:sz="12" w:space="1" w:color="auto"/>
+        </w:pBdr>
+        <w:tabs>
+          <w:tab w:val="left" w:pos="1210"/>
+        </w:tabs>
+        <w:spacing w:before="100" w:beforeAutospacing="1" w:after="100" w:afterAutospacing="1" w:line="240" w:lineRule="auto"/>
+        <w:rPr>
+          <w:rFonts w:ascii="Calibri Light" w:hAnsi="Calibri Light"/>
+          <w:sz w:val="24"/>
+          <w:szCs w:val="26"/>
+        </w:rPr>
+      </w:pPr>
+      <w:r>
+        <w:rPr>
+          <w:rFonts w:ascii="Calibri Light" w:hAnsi="Calibri Light"/>
+          <w:sz w:val="24"/>
+          <w:szCs w:val="26"/>
+        </w:rPr>
+        <w:t xml:space="preserve">Java 16 </w:t>
+      </w:r>
+    </w:p>
+    <w:p>
+      <w:pPr>
+        <w:pStyle w:val="ListParagraph"/>
+        <w:numPr>
+          <w:ilvl w:val="0"/>
+          <w:numId w:val="11"/>
+        </w:numPr>
+        <w:pBdr>
+          <w:bottom w:val="single" w:sz="12" w:space="1" w:color="auto"/>
+        </w:pBdr>
+        <w:tabs>
+          <w:tab w:val="left" w:pos="1210"/>
+        </w:tabs>
+        <w:spacing w:before="100" w:beforeAutospacing="1" w:after="100" w:afterAutospacing="1" w:line="240" w:lineRule="auto"/>
+      </w:pPr>
+      <w:r>
+        <w:t>Records</w:t>
+      </w:r>
+    </w:p>
+    <w:p>
+      <w:pPr>
+        <w:pStyle w:val="ListParagraph"/>
+        <w:numPr>
+          <w:ilvl w:val="0"/>
+          <w:numId w:val="11"/>
+        </w:numPr>
+        <w:pBdr>
+          <w:bottom w:val="single" w:sz="12" w:space="1" w:color="auto"/>
+        </w:pBdr>
+        <w:tabs>
+          <w:tab w:val="left" w:pos="1210"/>
+        </w:tabs>
+        <w:spacing w:before="100" w:beforeAutospacing="1" w:after="100" w:afterAutospacing="1" w:line="240" w:lineRule="auto"/>
+        <w:rPr>
+          <w:rStyle w:val="HTMLCode"/>
+          <w:rFonts w:ascii="Calibri Light" w:eastAsiaTheme="minorHAnsi" w:hAnsi="Calibri Light" w:cstheme="minorBidi"/>
+          <w:sz w:val="24"/>
+          <w:szCs w:val="26"/>
+        </w:rPr>
+      </w:pPr>
+      <w:r>
+        <w:t xml:space="preserve">2. Pattern Matching for </w:t>
+      </w:r>
+      <w:proofErr w:type="spellStart"/>
+      <w:r>
+        <w:rPr>
+          <w:rStyle w:val="HTMLCode"/>
+          <w:rFonts w:eastAsiaTheme="minorHAnsi"/>
+        </w:rPr>
+        <w:t>instanceof</w:t>
+      </w:r>
+      <w:proofErr w:type="spellEnd"/>
+    </w:p>
+    <w:p>
+      <w:pPr>
+        <w:pBdr>
+          <w:bottom w:val="single" w:sz="12" w:space="1" w:color="auto"/>
+        </w:pBdr>
+        <w:tabs>
+          <w:tab w:val="left" w:pos="1210"/>
+        </w:tabs>
+        <w:spacing w:before="100" w:beforeAutospacing="1" w:after="100" w:afterAutospacing="1" w:line="240" w:lineRule="auto"/>
+        <w:ind w:left="1210"/>
+        <w:rPr>
+          <w:rFonts w:ascii="Calibri Light" w:hAnsi="Calibri Light"/>
+          <w:sz w:val="24"/>
+          <w:szCs w:val="26"/>
+        </w:rPr>
+      </w:pPr>
+    </w:p>
+    <w:p>
+      <w:pPr>
+        <w:pBdr>
+          <w:bottom w:val="single" w:sz="12" w:space="1" w:color="auto"/>
+        </w:pBdr>
+        <w:tabs>
+          <w:tab w:val="left" w:pos="2500"/>
+        </w:tabs>
+        <w:spacing w:before="100" w:beforeAutospacing="1" w:after="100" w:afterAutospacing="1" w:line="240" w:lineRule="auto"/>
+        <w:rPr>
+          <w:rFonts w:ascii="Calibri Light" w:hAnsi="Calibri Light"/>
+          <w:sz w:val="24"/>
+          <w:szCs w:val="26"/>
+        </w:rPr>
+      </w:pPr>
+      <w:r>
+        <w:rPr>
+          <w:rFonts w:ascii="Calibri Light" w:hAnsi="Calibri Light"/>
+          <w:sz w:val="24"/>
+          <w:szCs w:val="26"/>
+        </w:rPr>
+        <w:t>Java 17</w:t>
+      </w:r>
+    </w:p>
+    <w:p>
+      <w:pPr>
+        <w:pStyle w:val="ListParagraph"/>
+        <w:numPr>
+          <w:ilvl w:val="0"/>
+          <w:numId w:val="12"/>
+        </w:numPr>
+        <w:pBdr>
+          <w:bottom w:val="single" w:sz="12" w:space="1" w:color="auto"/>
+        </w:pBdr>
+        <w:tabs>
+          <w:tab w:val="left" w:pos="2500"/>
+        </w:tabs>
+        <w:spacing w:before="100" w:beforeAutospacing="1" w:after="100" w:afterAutospacing="1" w:line="240" w:lineRule="auto"/>
+      </w:pPr>
+      <w:r>
+        <w:t>Sealed Classes</w:t>
+      </w:r>
+      <w:r>
+        <w:t xml:space="preserve">    example </w:t>
+      </w:r>
+      <w:r>
+        <w:t>public sealed class Shape permits Circle, Square {}</w:t>
+      </w:r>
+    </w:p>
+    <w:p>
+      <w:pPr>
+        <w:pStyle w:val="ListParagraph"/>
+        <w:numPr>
+          <w:ilvl w:val="0"/>
+          <w:numId w:val="12"/>
+        </w:numPr>
+        <w:pBdr>
+          <w:bottom w:val="single" w:sz="12" w:space="1" w:color="auto"/>
+        </w:pBdr>
+        <w:tabs>
+          <w:tab w:val="left" w:pos="2500"/>
+        </w:tabs>
+        <w:spacing w:before="100" w:beforeAutospacing="1" w:after="100" w:afterAutospacing="1" w:line="240" w:lineRule="auto"/>
+        <w:rPr>
+          <w:rFonts w:ascii="Calibri Light" w:hAnsi="Calibri Light"/>
+          <w:sz w:val="24"/>
+          <w:szCs w:val="26"/>
+        </w:rPr>
+      </w:pPr>
+    </w:p>
+    <w:p>
+      <w:pPr>
+        <w:pBdr>
+          <w:bottom w:val="single" w:sz="12" w:space="1" w:color="auto"/>
+        </w:pBdr>
+        <w:tabs>
+          <w:tab w:val="left" w:pos="2500"/>
+        </w:tabs>
+        <w:spacing w:before="100" w:beforeAutospacing="1" w:after="100" w:afterAutospacing="1" w:line="240" w:lineRule="auto"/>
+        <w:rPr>
+          <w:rFonts w:ascii="Calibri Light" w:hAnsi="Calibri Light"/>
+          <w:sz w:val="24"/>
+          <w:szCs w:val="26"/>
+        </w:rPr>
+      </w:pPr>
+      <w:r>
+        <w:rPr>
+          <w:rFonts w:ascii="Calibri Light" w:hAnsi="Calibri Light"/>
+          <w:sz w:val="24"/>
+          <w:szCs w:val="26"/>
+        </w:rPr>
+        <w:t>Java 18</w:t>
+      </w:r>
+    </w:p>
+    <w:p>
+      <w:pPr>
+        <w:pBdr>
+          <w:bottom w:val="single" w:sz="12" w:space="1" w:color="auto"/>
+        </w:pBdr>
+        <w:tabs>
+          <w:tab w:val="left" w:pos="2500"/>
+        </w:tabs>
+        <w:spacing w:before="100" w:beforeAutospacing="1" w:after="100" w:afterAutospacing="1" w:line="240" w:lineRule="auto"/>
+        <w:rPr>
+          <w:rFonts w:ascii="Calibri Light" w:hAnsi="Calibri Light"/>
+          <w:sz w:val="24"/>
+          <w:szCs w:val="26"/>
+        </w:rPr>
+      </w:pPr>
+      <w:r>
+        <w:rPr>
+          <w:rFonts w:ascii="Calibri Light" w:hAnsi="Calibri Light"/>
+          <w:sz w:val="24"/>
+          <w:szCs w:val="26"/>
+        </w:rPr>
+        <w:tab/>
+        <w:t xml:space="preserve">1. </w:t>
+      </w:r>
+      <w:proofErr w:type="gramStart"/>
+      <w:r>
+        <w:rPr>
+          <w:rFonts w:ascii="Calibri Light" w:hAnsi="Calibri Light"/>
+          <w:sz w:val="24"/>
+          <w:szCs w:val="26"/>
+        </w:rPr>
+        <w:t>simple</w:t>
+      </w:r>
+      <w:proofErr w:type="gramEnd"/>
+      <w:r>
+        <w:rPr>
+          <w:rFonts w:ascii="Calibri Light" w:hAnsi="Calibri Light"/>
+          <w:sz w:val="24"/>
+          <w:szCs w:val="26"/>
+        </w:rPr>
+        <w:t xml:space="preserve"> web server</w:t>
+      </w:r>
+    </w:p>
+    <w:p>
+      <w:pPr>
+        <w:pBdr>
+          <w:bottom w:val="single" w:sz="12" w:space="1" w:color="auto"/>
+        </w:pBdr>
+        <w:tabs>
+          <w:tab w:val="left" w:pos="2500"/>
+        </w:tabs>
+        <w:spacing w:before="100" w:beforeAutospacing="1" w:after="100" w:afterAutospacing="1" w:line="240" w:lineRule="auto"/>
+        <w:rPr>
+          <w:rFonts w:ascii="Calibri Light" w:hAnsi="Calibri Light"/>
+          <w:sz w:val="24"/>
+          <w:szCs w:val="26"/>
+        </w:rPr>
+      </w:pPr>
+      <w:r>
+        <w:rPr>
+          <w:rFonts w:ascii="Calibri Light" w:hAnsi="Calibri Light"/>
+          <w:sz w:val="24"/>
+          <w:szCs w:val="26"/>
+        </w:rPr>
+        <w:tab/>
+      </w:r>
+      <w:r>
+        <w:rPr>
+          <w:rFonts w:ascii="Calibri Light" w:hAnsi="Calibri Light"/>
+          <w:sz w:val="24"/>
+          <w:szCs w:val="26"/>
+        </w:rPr>
+        <w:tab/>
+      </w:r>
+      <w:r>
+        <w:rPr>
+          <w:rFonts w:ascii="Calibri Light" w:hAnsi="Calibri Light"/>
+          <w:sz w:val="24"/>
+          <w:szCs w:val="26"/>
+        </w:rPr>
+        <w:tab/>
+      </w:r>
+      <w:r>
+        <w:rPr>
+          <w:rFonts w:ascii="Calibri Light" w:hAnsi="Calibri Light"/>
+          <w:sz w:val="24"/>
+          <w:szCs w:val="26"/>
+        </w:rPr>
+        <w:tab/>
+      </w:r>
+    </w:p>
+    <w:p>
+      <w:pPr>
+        <w:pBdr>
+          <w:bottom w:val="single" w:sz="12" w:space="1" w:color="auto"/>
+        </w:pBdr>
+        <w:tabs>
+          <w:tab w:val="left" w:pos="2500"/>
+        </w:tabs>
+        <w:spacing w:before="100" w:beforeAutospacing="1" w:after="100" w:afterAutospacing="1" w:line="240" w:lineRule="auto"/>
+        <w:rPr>
+          <w:rFonts w:ascii="Calibri Light" w:hAnsi="Calibri Light"/>
+          <w:sz w:val="24"/>
+          <w:szCs w:val="26"/>
+        </w:rPr>
+      </w:pPr>
+      <w:r>
+        <w:rPr>
+          <w:rFonts w:ascii="Calibri Light" w:hAnsi="Calibri Light"/>
+          <w:sz w:val="24"/>
+          <w:szCs w:val="26"/>
+        </w:rPr>
+        <w:tab/>
+      </w:r>
+    </w:p>
+    <w:p>
+      <w:pPr>
+        <w:spacing w:before="100" w:beforeAutospacing="1" w:after="100" w:afterAutospacing="1" w:line="240" w:lineRule="auto"/>
+        <w:rPr>
+          <w:rFonts w:ascii="Calibri Light" w:hAnsi="Calibri Light"/>
+          <w:sz w:val="24"/>
+          <w:szCs w:val="26"/>
+        </w:rPr>
+      </w:pPr>
+      <w:r>
+        <w:rPr>
+          <w:rFonts w:ascii="Calibri Light" w:hAnsi="Calibri Light"/>
+          <w:sz w:val="24"/>
+          <w:szCs w:val="26"/>
+        </w:rPr>
+        <w:t>Java 19</w:t>
+      </w:r>
+    </w:p>
+    <w:tbl>
+      <w:tblPr>
+        <w:tblW w:w="0" w:type="auto"/>
+        <w:tblCellSpacing w:w="15" w:type="dxa"/>
+        <w:tblCellMar>
+          <w:top w:w="15" w:type="dxa"/>
+          <w:left w:w="15" w:type="dxa"/>
+          <w:bottom w:w="15" w:type="dxa"/>
+          <w:right w:w="15" w:type="dxa"/>
+        </w:tblCellMar>
+        <w:tblLook w:val="04A0" w:firstRow="1" w:lastRow="0" w:firstColumn="1" w:lastColumn="0" w:noHBand="0" w:noVBand="1"/>
+      </w:tblPr>
+      <w:tblGrid>
+        <w:gridCol w:w="3124"/>
+      </w:tblGrid>
+      <w:tr>
+        <w:trPr>
+          <w:tblCellSpacing w:w="15" w:type="dxa"/>
+        </w:trPr>
+        <w:tc>
+          <w:tcPr>
+            <w:tcW w:w="0" w:type="auto"/>
+            <w:vAlign w:val="center"/>
+            <w:hideMark/>
+          </w:tcPr>
+          <w:p>
+            <w:pPr>
+              <w:spacing w:after="0" w:line="240" w:lineRule="auto"/>
+              <w:rPr>
+                <w:rFonts w:ascii="Times New Roman" w:eastAsia="Times New Roman" w:hAnsi="Times New Roman" w:cs="Times New Roman"/>
+                <w:sz w:val="24"/>
+                <w:szCs w:val="24"/>
+                <w:lang w:eastAsia="en-IN"/>
+              </w:rPr>
+            </w:pPr>
+            <w:r>
+              <w:rPr>
+                <w:rFonts w:ascii="Times New Roman" w:eastAsia="Times New Roman" w:hAnsi="Times New Roman" w:cs="Times New Roman"/>
+                <w:b/>
+                <w:bCs/>
+                <w:sz w:val="24"/>
+                <w:szCs w:val="24"/>
+                <w:lang w:eastAsia="en-IN"/>
+              </w:rPr>
+              <w:t>Linux/RISC-V Port</w:t>
+            </w:r>
+            <w:r>
+              <w:rPr>
+                <w:rFonts w:ascii="Times New Roman" w:eastAsia="Times New Roman" w:hAnsi="Times New Roman" w:cs="Times New Roman"/>
+                <w:sz w:val="24"/>
+                <w:szCs w:val="24"/>
+                <w:lang w:eastAsia="en-IN"/>
+              </w:rPr>
+              <w:t xml:space="preserve"> (JEP 422)</w:t>
+            </w:r>
+          </w:p>
+        </w:tc>
+      </w:tr>
+    </w:tbl>
+    <w:p>
+      <w:pPr>
+        <w:spacing w:after="0" w:line="240" w:lineRule="auto"/>
+        <w:rPr>
+          <w:rFonts w:ascii="Times New Roman" w:eastAsia="Times New Roman" w:hAnsi="Times New Roman" w:cs="Times New Roman"/>
+          <w:vanish/>
+          <w:sz w:val="24"/>
+          <w:szCs w:val="24"/>
+          <w:lang w:eastAsia="en-IN"/>
+        </w:rPr>
+      </w:pPr>
+    </w:p>
+    <w:tbl>
+      <w:tblPr>
+        <w:tblW w:w="0" w:type="auto"/>
+        <w:tblCellSpacing w:w="15" w:type="dxa"/>
+        <w:tblCellMar>
+          <w:top w:w="15" w:type="dxa"/>
+          <w:left w:w="15" w:type="dxa"/>
+          <w:bottom w:w="15" w:type="dxa"/>
+          <w:right w:w="15" w:type="dxa"/>
+        </w:tblCellMar>
+        <w:tblLook w:val="04A0" w:firstRow="1" w:lastRow="0" w:firstColumn="1" w:lastColumn="0" w:noHBand="0" w:noVBand="1"/>
+      </w:tblPr>
+      <w:tblGrid>
+        <w:gridCol w:w="584"/>
+      </w:tblGrid>
+      <w:tr>
+        <w:trPr>
+          <w:tblCellSpacing w:w="15" w:type="dxa"/>
+        </w:trPr>
+        <w:tc>
+          <w:tcPr>
+            <w:tcW w:w="0" w:type="auto"/>
+            <w:vAlign w:val="center"/>
+            <w:hideMark/>
+          </w:tcPr>
+          <w:p>
+            <w:pPr>
+              <w:spacing w:after="0" w:line="240" w:lineRule="auto"/>
+              <w:rPr>
+                <w:rFonts w:ascii="Times New Roman" w:eastAsia="Times New Roman" w:hAnsi="Times New Roman" w:cs="Times New Roman"/>
+                <w:sz w:val="24"/>
+                <w:szCs w:val="24"/>
+                <w:lang w:eastAsia="en-IN"/>
+              </w:rPr>
+            </w:pPr>
+            <w:r>
+              <w:rPr>
+                <w:rFonts w:ascii="Times New Roman" w:eastAsia="Times New Roman" w:hAnsi="Times New Roman" w:cs="Times New Roman"/>
+                <w:sz w:val="24"/>
+                <w:szCs w:val="24"/>
+                <w:lang w:eastAsia="en-IN"/>
+              </w:rPr>
+              <w:t>Final</w:t>
+            </w:r>
+          </w:p>
+        </w:tc>
+      </w:tr>
+    </w:tbl>
+    <w:p>
+      <w:pPr>
+        <w:spacing w:after="0" w:line="240" w:lineRule="auto"/>
+        <w:rPr>
+          <w:rFonts w:ascii="Times New Roman" w:eastAsia="Times New Roman" w:hAnsi="Times New Roman" w:cs="Times New Roman"/>
+          <w:vanish/>
+          <w:sz w:val="24"/>
+          <w:szCs w:val="24"/>
+          <w:lang w:eastAsia="en-IN"/>
+        </w:rPr>
+      </w:pPr>
+    </w:p>
+    <w:tbl>
+      <w:tblPr>
+        <w:tblW w:w="0" w:type="auto"/>
+        <w:tblCellSpacing w:w="15" w:type="dxa"/>
+        <w:tblCellMar>
+          <w:top w:w="15" w:type="dxa"/>
+          <w:left w:w="15" w:type="dxa"/>
+          <w:bottom w:w="15" w:type="dxa"/>
+          <w:right w:w="15" w:type="dxa"/>
+        </w:tblCellMar>
+        <w:tblLook w:val="04A0" w:firstRow="1" w:lastRow="0" w:firstColumn="1" w:lastColumn="0" w:noHBand="0" w:noVBand="1"/>
+      </w:tblPr>
+      <w:tblGrid>
+        <w:gridCol w:w="3317"/>
+      </w:tblGrid>
+      <w:tr>
+        <w:trPr>
+          <w:tblCellSpacing w:w="15" w:type="dxa"/>
+        </w:trPr>
+        <w:tc>
+          <w:tcPr>
+            <w:tcW w:w="0" w:type="auto"/>
+            <w:vAlign w:val="center"/>
+            <w:hideMark/>
+          </w:tcPr>
+          <w:p>
+            <w:pPr>
+              <w:spacing w:after="0" w:line="240" w:lineRule="auto"/>
+              <w:rPr>
+                <w:rFonts w:ascii="Times New Roman" w:eastAsia="Times New Roman" w:hAnsi="Times New Roman" w:cs="Times New Roman"/>
+                <w:sz w:val="24"/>
+                <w:szCs w:val="24"/>
+                <w:lang w:eastAsia="en-IN"/>
+              </w:rPr>
+            </w:pPr>
+            <w:r>
+              <w:rPr>
+                <w:rFonts w:ascii="Times New Roman" w:eastAsia="Times New Roman" w:hAnsi="Times New Roman" w:cs="Times New Roman"/>
+                <w:sz w:val="24"/>
+                <w:szCs w:val="24"/>
+                <w:lang w:eastAsia="en-IN"/>
+              </w:rPr>
+              <w:t>Support JDK on RISC-V systems</w:t>
+            </w:r>
+          </w:p>
+        </w:tc>
+      </w:tr>
+    </w:tbl>
+    <w:p>
+      <w:pPr>
+        <w:pBdr>
+          <w:bottom w:val="single" w:sz="12" w:space="1" w:color="auto"/>
+        </w:pBdr>
+        <w:tabs>
+          <w:tab w:val="left" w:pos="2500"/>
+        </w:tabs>
+        <w:spacing w:before="100" w:beforeAutospacing="1" w:after="100" w:afterAutospacing="1" w:line="240" w:lineRule="auto"/>
+        <w:rPr>
+          <w:rFonts w:ascii="Calibri Light" w:hAnsi="Calibri Light"/>
+          <w:sz w:val="24"/>
+          <w:szCs w:val="26"/>
+        </w:rPr>
+      </w:pPr>
+      <w:r>
+        <w:rPr>
+          <w:rFonts w:ascii="Calibri Light" w:hAnsi="Calibri Light"/>
+          <w:sz w:val="24"/>
+          <w:szCs w:val="26"/>
+        </w:rPr>
+        <w:tab/>
+      </w:r>
+    </w:p>
+    <w:p>
+      <w:pPr>
+        <w:spacing w:before="100" w:beforeAutospacing="1" w:after="100" w:afterAutospacing="1" w:line="240" w:lineRule="auto"/>
+        <w:rPr>
+          <w:rStyle w:val="Strong"/>
+        </w:rPr>
+      </w:pPr>
+      <w:r>
+        <w:t xml:space="preserve">Java 18 and 19, </w:t>
+      </w:r>
+      <w:r>
+        <w:rPr>
+          <w:rStyle w:val="Strong"/>
+        </w:rPr>
+        <w:t>Java 20</w:t>
+      </w:r>
+      <w:r>
+        <w:rPr>
+          <w:rStyle w:val="Strong"/>
+        </w:rPr>
+        <w:t xml:space="preserve"> are </w:t>
+      </w:r>
+      <w:proofErr w:type="gramStart"/>
+      <w:r>
+        <w:rPr>
+          <w:rStyle w:val="Strong"/>
+        </w:rPr>
+        <w:t>short  term</w:t>
+      </w:r>
+      <w:proofErr w:type="gramEnd"/>
+      <w:r>
+        <w:rPr>
+          <w:rStyle w:val="Strong"/>
+        </w:rPr>
+        <w:t xml:space="preserve"> releases.</w:t>
+      </w:r>
+    </w:p>
+    <w:p>
+      <w:pPr>
+        <w:spacing w:before="100" w:beforeAutospacing="1" w:after="100" w:afterAutospacing="1" w:line="240" w:lineRule="auto"/>
+        <w:rPr>
+          <w:rStyle w:val="Strong"/>
+        </w:rPr>
+      </w:pPr>
+      <w:r>
+        <w:rPr>
+          <w:rStyle w:val="Strong"/>
+        </w:rPr>
+        <w:t>Nothing special</w:t>
+      </w:r>
+    </w:p>
+    <w:p>
+      <w:pPr>
+        <w:pBdr>
+          <w:bottom w:val="single" w:sz="12" w:space="1" w:color="auto"/>
+        </w:pBdr>
+        <w:tabs>
+          <w:tab w:val="left" w:pos="2500"/>
+        </w:tabs>
+        <w:spacing w:before="100" w:beforeAutospacing="1" w:after="100" w:afterAutospacing="1" w:line="240" w:lineRule="auto"/>
+        <w:rPr>
+          <w:rFonts w:ascii="Calibri Light" w:hAnsi="Calibri Light"/>
+          <w:sz w:val="24"/>
+          <w:szCs w:val="26"/>
+        </w:rPr>
+      </w:pPr>
+      <w:r>
+        <w:rPr>
+          <w:rFonts w:ascii="Calibri Light" w:hAnsi="Calibri Light"/>
+          <w:sz w:val="24"/>
+          <w:szCs w:val="26"/>
+        </w:rPr>
+        <w:tab/>
+      </w:r>
+    </w:p>
+    <w:p>
+      <w:pPr>
+        <w:spacing w:before="100" w:beforeAutospacing="1" w:after="100" w:afterAutospacing="1" w:line="240" w:lineRule="auto"/>
+        <w:rPr>
+          <w:rFonts w:ascii="Calibri Light" w:hAnsi="Calibri Light"/>
+          <w:sz w:val="24"/>
+          <w:szCs w:val="26"/>
+        </w:rPr>
+      </w:pPr>
+      <w:r>
+        <w:rPr>
+          <w:rFonts w:ascii="Calibri Light" w:hAnsi="Calibri Light"/>
+          <w:sz w:val="24"/>
+          <w:szCs w:val="26"/>
+        </w:rPr>
+        <w:t>Java 21 features (LTA)</w:t>
+      </w:r>
+    </w:p>
+    <w:p>
+      <w:pPr>
+        <w:pStyle w:val="ListParagraph"/>
+        <w:numPr>
+          <w:ilvl w:val="0"/>
+          <w:numId w:val="13"/>
+        </w:numPr>
+        <w:spacing w:before="100" w:beforeAutospacing="1" w:after="100" w:afterAutospacing="1" w:line="240" w:lineRule="auto"/>
+        <w:rPr>
+          <w:rFonts w:ascii="Calibri Light" w:hAnsi="Calibri Light"/>
+          <w:sz w:val="24"/>
+          <w:szCs w:val="26"/>
+        </w:rPr>
+      </w:pPr>
+      <w:proofErr w:type="spellStart"/>
+      <w:r>
+        <w:rPr>
+          <w:rFonts w:ascii="Calibri Light" w:hAnsi="Calibri Light"/>
+          <w:sz w:val="24"/>
+          <w:szCs w:val="26"/>
+        </w:rPr>
+        <w:t>Virtural</w:t>
+      </w:r>
+      <w:proofErr w:type="spellEnd"/>
+      <w:r>
+        <w:rPr>
+          <w:rFonts w:ascii="Calibri Light" w:hAnsi="Calibri Light"/>
+          <w:sz w:val="24"/>
+          <w:szCs w:val="26"/>
+        </w:rPr>
+        <w:t xml:space="preserve"> threads</w:t>
+      </w:r>
+    </w:p>
+    <w:p>
+      <w:pPr>
+        <w:pStyle w:val="ListParagraph"/>
+        <w:numPr>
+          <w:ilvl w:val="0"/>
+          <w:numId w:val="13"/>
+        </w:numPr>
+        <w:spacing w:before="100" w:beforeAutospacing="1" w:after="100" w:afterAutospacing="1" w:line="240" w:lineRule="auto"/>
+        <w:rPr>
+          <w:rFonts w:ascii="Calibri Light" w:hAnsi="Calibri Light"/>
+          <w:sz w:val="24"/>
+          <w:szCs w:val="26"/>
+        </w:rPr>
+      </w:pPr>
+      <w:r>
+        <w:rPr>
+          <w:rFonts w:ascii="Calibri Light" w:hAnsi="Calibri Light"/>
+          <w:sz w:val="24"/>
+          <w:szCs w:val="26"/>
+        </w:rPr>
+        <w:t>Pattern matching for switch</w:t>
+      </w:r>
+    </w:p>
+    <w:p>
+      <w:pPr>
+        <w:pStyle w:val="ListParagraph"/>
+        <w:numPr>
+          <w:ilvl w:val="0"/>
+          <w:numId w:val="13"/>
+        </w:numPr>
+        <w:spacing w:before="100" w:beforeAutospacing="1" w:after="100" w:afterAutospacing="1" w:line="240" w:lineRule="auto"/>
+        <w:rPr>
+          <w:rFonts w:ascii="Calibri Light" w:hAnsi="Calibri Light"/>
+          <w:sz w:val="24"/>
+          <w:szCs w:val="26"/>
+        </w:rPr>
+      </w:pPr>
+      <w:r>
+        <w:rPr>
+          <w:rFonts w:ascii="Calibri Light" w:hAnsi="Calibri Light"/>
+          <w:sz w:val="24"/>
+          <w:szCs w:val="26"/>
+        </w:rPr>
+        <w:t>Record Patterns</w:t>
+      </w:r>
+    </w:p>
+    <w:p>
+      <w:pPr>
+        <w:pStyle w:val="ListParagraph"/>
+        <w:numPr>
+          <w:ilvl w:val="0"/>
+          <w:numId w:val="13"/>
+        </w:numPr>
+        <w:spacing w:before="100" w:beforeAutospacing="1" w:after="100" w:afterAutospacing="1" w:line="240" w:lineRule="auto"/>
+        <w:rPr>
+          <w:rFonts w:ascii="Calibri Light" w:hAnsi="Calibri Light"/>
+          <w:sz w:val="24"/>
+          <w:szCs w:val="26"/>
+        </w:rPr>
+      </w:pPr>
+      <w:r>
+        <w:rPr>
+          <w:rFonts w:ascii="Calibri Light" w:hAnsi="Calibri Light"/>
+          <w:sz w:val="24"/>
+          <w:szCs w:val="26"/>
+        </w:rPr>
+        <w:t>Sequenced collections</w:t>
+      </w:r>
+    </w:p>
+    <w:p>
+      <w:pPr>
+        <w:pStyle w:val="ListParagraph"/>
+        <w:numPr>
+          <w:ilvl w:val="0"/>
+          <w:numId w:val="13"/>
+        </w:numPr>
+        <w:spacing w:before="100" w:beforeAutospacing="1" w:after="100" w:afterAutospacing="1" w:line="240" w:lineRule="auto"/>
+        <w:rPr>
+          <w:rFonts w:ascii="Calibri Light" w:hAnsi="Calibri Light"/>
+          <w:sz w:val="24"/>
+          <w:szCs w:val="26"/>
+        </w:rPr>
+      </w:pPr>
+      <w:r>
+        <w:rPr>
+          <w:rFonts w:ascii="Calibri Light" w:hAnsi="Calibri Light"/>
+          <w:sz w:val="24"/>
+          <w:szCs w:val="26"/>
+        </w:rPr>
+        <w:t>Generational ZGC is final</w:t>
+      </w:r>
+    </w:p>
+    <w:p>
+      <w:pPr>
+        <w:pStyle w:val="ListParagraph"/>
+        <w:numPr>
+          <w:ilvl w:val="0"/>
+          <w:numId w:val="13"/>
+        </w:numPr>
+        <w:spacing w:before="100" w:beforeAutospacing="1" w:after="100" w:afterAutospacing="1" w:line="240" w:lineRule="auto"/>
+        <w:rPr>
+          <w:rFonts w:ascii="Calibri Light" w:hAnsi="Calibri Light"/>
+          <w:sz w:val="24"/>
+          <w:szCs w:val="26"/>
+        </w:rPr>
+      </w:pPr>
+      <w:r>
+        <w:t>Key Encapsulation Mechanism (KEM) API (JEP 452)</w:t>
+      </w:r>
+    </w:p>
+    <w:p>
+      <w:pPr>
+        <w:pStyle w:val="ListParagraph"/>
+        <w:numPr>
+          <w:ilvl w:val="0"/>
+          <w:numId w:val="13"/>
+        </w:numPr>
+        <w:spacing w:before="100" w:beforeAutospacing="1" w:after="100" w:afterAutospacing="1" w:line="240" w:lineRule="auto"/>
+        <w:rPr>
+          <w:rFonts w:ascii="Calibri Light" w:hAnsi="Calibri Light"/>
+          <w:sz w:val="24"/>
+          <w:szCs w:val="26"/>
+        </w:rPr>
+      </w:pPr>
+    </w:p>
+    <w:p>
+      <w:pPr>
+        <w:pBdr>
+          <w:bottom w:val="single" w:sz="12" w:space="1" w:color="auto"/>
+        </w:pBdr>
+        <w:tabs>
+          <w:tab w:val="left" w:pos="2500"/>
+        </w:tabs>
+        <w:spacing w:before="100" w:beforeAutospacing="1" w:after="100" w:afterAutospacing="1" w:line="240" w:lineRule="auto"/>
+        <w:rPr>
+          <w:rFonts w:ascii="Calibri Light" w:hAnsi="Calibri Light"/>
+          <w:sz w:val="24"/>
+          <w:szCs w:val="26"/>
+        </w:rPr>
+      </w:pPr>
+      <w:r>
+        <w:rPr>
+          <w:rFonts w:ascii="Calibri Light" w:hAnsi="Calibri Light"/>
+          <w:sz w:val="24"/>
+          <w:szCs w:val="26"/>
+        </w:rPr>
+        <w:tab/>
+      </w:r>
+    </w:p>
+    <w:p>
+      <w:pPr>
+        <w:spacing w:before="100" w:beforeAutospacing="1" w:after="100" w:afterAutospacing="1" w:line="240" w:lineRule="auto"/>
+        <w:rPr>
+          <w:rFonts w:ascii="Calibri Light" w:hAnsi="Calibri Light"/>
+          <w:sz w:val="24"/>
+          <w:szCs w:val="26"/>
+        </w:rPr>
+      </w:pPr>
+      <w:r>
+        <w:rPr>
+          <w:rFonts w:ascii="Calibri Light" w:hAnsi="Calibri Light"/>
+          <w:sz w:val="24"/>
+          <w:szCs w:val="26"/>
+        </w:rPr>
+        <w:t>Java 22 features</w:t>
+      </w:r>
+    </w:p>
+    <w:p>
+      <w:pPr>
+        <w:pStyle w:val="ListParagraph"/>
+        <w:numPr>
+          <w:ilvl w:val="0"/>
+          <w:numId w:val="14"/>
+        </w:numPr>
+        <w:spacing w:before="100" w:beforeAutospacing="1" w:after="100" w:afterAutospacing="1" w:line="240" w:lineRule="auto"/>
+      </w:pPr>
+      <w:r>
+        <w:t>Unnamed Variables &amp; Unnamed Patterns</w:t>
+      </w:r>
+    </w:p>
+    <w:p>
+      <w:pPr>
+        <w:pStyle w:val="ListParagraph"/>
+        <w:numPr>
+          <w:ilvl w:val="0"/>
+          <w:numId w:val="14"/>
+        </w:numPr>
+        <w:spacing w:before="100" w:beforeAutospacing="1" w:after="100" w:afterAutospacing="1" w:line="240" w:lineRule="auto"/>
+        <w:rPr>
+          <w:rFonts w:ascii="Calibri Light" w:hAnsi="Calibri Light"/>
+          <w:sz w:val="24"/>
+          <w:szCs w:val="26"/>
+        </w:rPr>
+      </w:pPr>
+      <w:r>
+        <w:t xml:space="preserve">Statements Before </w:t>
+      </w:r>
+      <w:proofErr w:type="gramStart"/>
+      <w:r>
+        <w:t>Super(</w:t>
+      </w:r>
+      <w:proofErr w:type="gramEnd"/>
+      <w:r>
+        <w:t>...)</w:t>
+      </w:r>
+    </w:p>
+    <w:p>
+      <w:pPr>
+        <w:pStyle w:val="ListParagraph"/>
+        <w:numPr>
+          <w:ilvl w:val="0"/>
+          <w:numId w:val="14"/>
+        </w:numPr>
+        <w:spacing w:before="100" w:beforeAutospacing="1" w:after="100" w:afterAutospacing="1" w:line="240" w:lineRule="auto"/>
+        <w:rPr>
+          <w:rFonts w:ascii="Calibri Light" w:hAnsi="Calibri Light"/>
+          <w:sz w:val="24"/>
+          <w:szCs w:val="26"/>
+        </w:rPr>
+      </w:pPr>
+    </w:p>
+    <w:p>
+      <w:pPr>
+        <w:pBdr>
+          <w:bottom w:val="single" w:sz="12" w:space="1" w:color="auto"/>
+        </w:pBdr>
+        <w:tabs>
+          <w:tab w:val="left" w:pos="2500"/>
+        </w:tabs>
+        <w:spacing w:before="100" w:beforeAutospacing="1" w:after="100" w:afterAutospacing="1" w:line="240" w:lineRule="auto"/>
+        <w:rPr>
+          <w:rFonts w:ascii="Calibri Light" w:hAnsi="Calibri Light"/>
+          <w:sz w:val="24"/>
+          <w:szCs w:val="26"/>
+        </w:rPr>
+      </w:pPr>
+      <w:r>
+        <w:rPr>
+          <w:rFonts w:ascii="Calibri Light" w:hAnsi="Calibri Light"/>
+          <w:sz w:val="24"/>
+          <w:szCs w:val="26"/>
+        </w:rPr>
+        <w:tab/>
+      </w:r>
+    </w:p>
+    <w:p>
+      <w:pPr>
+        <w:tabs>
+          <w:tab w:val="left" w:pos="3610"/>
+        </w:tabs>
+        <w:spacing w:before="100" w:beforeAutospacing="1" w:after="100" w:afterAutospacing="1" w:line="240" w:lineRule="auto"/>
+        <w:rPr>
+          <w:rFonts w:ascii="Calibri Light" w:hAnsi="Calibri Light"/>
+          <w:sz w:val="24"/>
+          <w:szCs w:val="26"/>
+        </w:rPr>
+      </w:pPr>
+      <w:r>
+        <w:rPr>
+          <w:rFonts w:ascii="Calibri Light" w:hAnsi="Calibri Light"/>
+          <w:sz w:val="24"/>
+          <w:szCs w:val="26"/>
+        </w:rPr>
+        <w:t>Java 23 features</w:t>
+      </w:r>
+      <w:r>
+        <w:rPr>
+          <w:rFonts w:ascii="Calibri Light" w:hAnsi="Calibri Light"/>
+          <w:sz w:val="24"/>
+          <w:szCs w:val="26"/>
+        </w:rPr>
+        <w:tab/>
+      </w:r>
+    </w:p>
+    <w:p>
+      <w:pPr>
+        <w:tabs>
+          <w:tab w:val="left" w:pos="3610"/>
+        </w:tabs>
+        <w:spacing w:before="100" w:beforeAutospacing="1" w:after="100" w:afterAutospacing="1" w:line="240" w:lineRule="auto"/>
+        <w:rPr>
+          <w:rFonts w:ascii="Calibri Light" w:hAnsi="Calibri Light"/>
+          <w:sz w:val="24"/>
+          <w:szCs w:val="26"/>
+        </w:rPr>
+      </w:pPr>
+      <w:r>
+        <w:rPr>
+          <w:rFonts w:ascii="Calibri Light" w:hAnsi="Calibri Light"/>
+          <w:sz w:val="24"/>
+          <w:szCs w:val="26"/>
+        </w:rPr>
+        <w:t>Record Patterns Enhancements</w:t>
+      </w:r>
+    </w:p>
+    <w:p>
+      <w:pPr>
+        <w:pBdr>
+          <w:bottom w:val="single" w:sz="12" w:space="1" w:color="auto"/>
+        </w:pBdr>
+        <w:tabs>
+          <w:tab w:val="left" w:pos="2500"/>
+        </w:tabs>
+        <w:spacing w:before="100" w:beforeAutospacing="1" w:after="100" w:afterAutospacing="1" w:line="240" w:lineRule="auto"/>
+        <w:rPr>
+          <w:rFonts w:ascii="Calibri Light" w:hAnsi="Calibri Light"/>
+          <w:sz w:val="24"/>
+          <w:szCs w:val="26"/>
+        </w:rPr>
+      </w:pPr>
+      <w:r>
+        <w:rPr>
+          <w:rFonts w:ascii="Calibri Light" w:hAnsi="Calibri Light"/>
+          <w:sz w:val="24"/>
+          <w:szCs w:val="26"/>
+        </w:rPr>
+        <w:t xml:space="preserve">Set a </w:t>
+      </w:r>
+      <w:proofErr w:type="spellStart"/>
+      <w:r>
+        <w:rPr>
+          <w:rFonts w:ascii="Calibri Light" w:hAnsi="Calibri Light"/>
+          <w:sz w:val="24"/>
+          <w:szCs w:val="26"/>
+        </w:rPr>
+        <w:t>beanch</w:t>
+      </w:r>
+      <w:proofErr w:type="spellEnd"/>
+      <w:r>
+        <w:rPr>
+          <w:rFonts w:ascii="Calibri Light" w:hAnsi="Calibri Light"/>
+          <w:sz w:val="24"/>
+          <w:szCs w:val="26"/>
+        </w:rPr>
+        <w:t xml:space="preserve"> mark for java 24 and java 25</w:t>
+      </w:r>
+      <w:r>
+        <w:rPr>
+          <w:rFonts w:ascii="Calibri Light" w:hAnsi="Calibri Light"/>
+          <w:sz w:val="24"/>
+          <w:szCs w:val="26"/>
+        </w:rPr>
+        <w:tab/>
+      </w:r>
+    </w:p>
+    <w:p>
+      <w:pPr>
+        <w:spacing w:before="100" w:beforeAutospacing="1" w:after="100" w:afterAutospacing="1" w:line="240" w:lineRule="auto"/>
+        <w:rPr>
+          <w:rFonts w:ascii="Calibri Light" w:hAnsi="Calibri Light"/>
+          <w:sz w:val="24"/>
+          <w:szCs w:val="26"/>
+        </w:rPr>
+      </w:pPr>
+      <w:r>
+        <w:rPr>
+          <w:rFonts w:ascii="Calibri Light" w:hAnsi="Calibri Light"/>
+          <w:sz w:val="24"/>
+          <w:szCs w:val="26"/>
+        </w:rPr>
+        <w:t>Java 24 features</w:t>
+      </w:r>
+    </w:p>
+    <w:p>
+      <w:pPr>
+        <w:spacing w:before="100" w:beforeAutospacing="1" w:after="100" w:afterAutospacing="1" w:line="240" w:lineRule="auto"/>
+      </w:pPr>
+      <w:r>
+        <w:rPr>
+          <w:rFonts w:ascii="Calibri Light" w:hAnsi="Calibri Light"/>
+          <w:sz w:val="24"/>
+          <w:szCs w:val="26"/>
+        </w:rPr>
+        <w:tab/>
+      </w:r>
+      <w:r>
+        <w:t>Primitive Objects</w:t>
+      </w:r>
+    </w:p>
+    <w:p>
+      <w:pPr>
+        <w:spacing w:before="100" w:beforeAutospacing="1" w:after="100" w:afterAutospacing="1" w:line="240" w:lineRule="auto"/>
+        <w:rPr>
+          <w:rFonts w:ascii="Calibri Light" w:hAnsi="Calibri Light"/>
+          <w:sz w:val="24"/>
+          <w:szCs w:val="26"/>
+        </w:rPr>
+      </w:pPr>
+      <w:r>
+        <w:tab/>
+      </w:r>
+      <w:r>
+        <w:t>Foreign Function &amp; Memory API refinements</w:t>
+      </w:r>
+    </w:p>
+    <w:p>
+      <w:pPr>
+        <w:pBdr>
+          <w:bottom w:val="single" w:sz="12" w:space="1" w:color="auto"/>
+        </w:pBdr>
+        <w:tabs>
+          <w:tab w:val="left" w:pos="2500"/>
+        </w:tabs>
+        <w:spacing w:before="100" w:beforeAutospacing="1" w:after="100" w:afterAutospacing="1" w:line="240" w:lineRule="auto"/>
+        <w:rPr>
+          <w:rFonts w:ascii="Calibri Light" w:hAnsi="Calibri Light"/>
+          <w:sz w:val="24"/>
+          <w:szCs w:val="26"/>
+        </w:rPr>
+      </w:pPr>
+      <w:r>
+        <w:rPr>
+          <w:rFonts w:ascii="Calibri Light" w:hAnsi="Calibri Light"/>
+          <w:sz w:val="24"/>
+          <w:szCs w:val="26"/>
+        </w:rPr>
+        <w:tab/>
+      </w:r>
+    </w:p>
+    <w:p>
+      <w:pPr>
+        <w:spacing w:before="100" w:beforeAutospacing="1" w:after="100" w:afterAutospacing="1" w:line="240" w:lineRule="auto"/>
+        <w:rPr>
+          <w:rFonts w:ascii="Calibri Light" w:hAnsi="Calibri Light"/>
+          <w:sz w:val="24"/>
+          <w:szCs w:val="26"/>
+        </w:rPr>
+      </w:pPr>
+      <w:r>
+        <w:rPr>
+          <w:rFonts w:ascii="Calibri Light" w:hAnsi="Calibri Light"/>
+          <w:sz w:val="24"/>
+          <w:szCs w:val="26"/>
+        </w:rPr>
+        <w:t>Java 25 features</w:t>
+      </w:r>
+    </w:p>
+    <w:p>
+      <w:pPr>
+        <w:pStyle w:val="Heading3"/>
+      </w:pPr>
+      <w:r>
+        <w:rPr>
+          <w:rStyle w:val="Strong"/>
+          <w:b/>
+          <w:bCs/>
+        </w:rPr>
+        <w:t>Language &amp; Syntax Enhancements</w:t>
+      </w:r>
+    </w:p>
+    <w:p>
+      <w:pPr>
+        <w:pStyle w:val="NormalWeb"/>
+        <w:numPr>
+          <w:ilvl w:val="0"/>
+          <w:numId w:val="16"/>
+        </w:numPr>
+      </w:pPr>
+      <w:r>
+        <w:rPr>
+          <w:rStyle w:val="Strong"/>
+        </w:rPr>
+        <w:t xml:space="preserve">Primitive Types in Patterns, </w:t>
+      </w:r>
+      <w:proofErr w:type="spellStart"/>
+      <w:r>
+        <w:rPr>
+          <w:rStyle w:val="HTMLCode"/>
+          <w:b/>
+          <w:bCs/>
+        </w:rPr>
+        <w:t>instanceof</w:t>
+      </w:r>
+      <w:proofErr w:type="spellEnd"/>
+      <w:r>
+        <w:rPr>
+          <w:rStyle w:val="Strong"/>
+        </w:rPr>
+        <w:t xml:space="preserve">, and </w:t>
+      </w:r>
+      <w:r>
+        <w:rPr>
+          <w:rStyle w:val="HTMLCode"/>
+          <w:b/>
+          <w:bCs/>
+        </w:rPr>
+        <w:t>switch</w:t>
+      </w:r>
+      <w:r>
+        <w:rPr>
+          <w:rStyle w:val="Strong"/>
+        </w:rPr>
+        <w:t xml:space="preserve"> (Third Preview) — JEP 507</w:t>
+      </w:r>
+      <w:r>
+        <w:br/>
+      </w:r>
+      <w:proofErr w:type="gramStart"/>
+      <w:r>
+        <w:t>You</w:t>
+      </w:r>
+      <w:proofErr w:type="gramEnd"/>
+      <w:r>
+        <w:t xml:space="preserve"> can now use primitive types (like </w:t>
+      </w:r>
+      <w:proofErr w:type="spellStart"/>
+      <w:r>
+        <w:rPr>
+          <w:rStyle w:val="HTMLCode"/>
+        </w:rPr>
+        <w:t>int</w:t>
+      </w:r>
+      <w:proofErr w:type="spellEnd"/>
+      <w:r>
+        <w:t xml:space="preserve">, </w:t>
+      </w:r>
+      <w:r>
+        <w:rPr>
+          <w:rStyle w:val="HTMLCode"/>
+        </w:rPr>
+        <w:t>double</w:t>
+      </w:r>
+      <w:r>
+        <w:t xml:space="preserve">, etc.) in pattern matching for </w:t>
+      </w:r>
+      <w:proofErr w:type="spellStart"/>
+      <w:r>
+        <w:rPr>
+          <w:rStyle w:val="HTMLCode"/>
+        </w:rPr>
+        <w:t>instanceof</w:t>
+      </w:r>
+      <w:proofErr w:type="spellEnd"/>
+      <w:r>
+        <w:t xml:space="preserve"> and </w:t>
+      </w:r>
+      <w:r>
+        <w:rPr>
+          <w:rStyle w:val="HTMLCode"/>
+        </w:rPr>
+        <w:t>switch</w:t>
+      </w:r>
+      <w:r>
+        <w:t xml:space="preserve">. This makes pattern-matching more uniform and expressive. </w:t>
+      </w:r>
+      <w:hyperlink r:id="rId14" w:tgtFrame="_blank" w:history="1">
+        <w:r>
+          <w:rPr>
+            <w:rStyle w:val="max-w-15ch"/>
+            <w:color w:val="0000FF"/>
+            <w:u w:val="single"/>
+          </w:rPr>
+          <w:t>Oracle Blogs</w:t>
+        </w:r>
+        <w:r>
+          <w:rPr>
+            <w:rStyle w:val="-me-1"/>
+            <w:rFonts w:eastAsiaTheme="majorEastAsia"/>
+            <w:color w:val="0000FF"/>
+            <w:u w:val="single"/>
+          </w:rPr>
+          <w:t>+1</w:t>
+        </w:r>
+      </w:hyperlink>
+    </w:p>
+    <w:p>
+      <w:pPr>
+        <w:pStyle w:val="NormalWeb"/>
+        <w:numPr>
+          <w:ilvl w:val="0"/>
+          <w:numId w:val="16"/>
+        </w:numPr>
+      </w:pPr>
+      <w:r>
+        <w:rPr>
+          <w:rStyle w:val="Strong"/>
+        </w:rPr>
+        <w:t>Module Import Declarations — JEP 511</w:t>
+      </w:r>
+      <w:r>
+        <w:br/>
+        <w:t xml:space="preserve">Simplifies imports by allowing you to import all packages exported by a module at once — reduces import boilerplate, especially in modular codebases or when using many APIs. </w:t>
+      </w:r>
+      <w:hyperlink r:id="rId15" w:tgtFrame="_blank" w:history="1">
+        <w:r>
+          <w:rPr>
+            <w:rStyle w:val="max-w-15ch"/>
+            <w:color w:val="0000FF"/>
+            <w:u w:val="single"/>
+          </w:rPr>
+          <w:t>Oracle</w:t>
+        </w:r>
+        <w:r>
+          <w:rPr>
+            <w:rStyle w:val="-me-1"/>
+            <w:rFonts w:eastAsiaTheme="majorEastAsia"/>
+            <w:color w:val="0000FF"/>
+            <w:u w:val="single"/>
+          </w:rPr>
+          <w:t>+1</w:t>
+        </w:r>
+      </w:hyperlink>
+    </w:p>
+    <w:p>
+      <w:pPr>
+        <w:pStyle w:val="NormalWeb"/>
+        <w:numPr>
+          <w:ilvl w:val="0"/>
+          <w:numId w:val="16"/>
+        </w:numPr>
+      </w:pPr>
+      <w:r>
+        <w:rPr>
+          <w:rStyle w:val="Strong"/>
+        </w:rPr>
+        <w:t>Compact Source Files &amp; Instance Main Methods — JEP 512</w:t>
+      </w:r>
+      <w:r>
+        <w:br/>
+        <w:t>For small/simple programs or scripts, you no longer need the full boilerplate (</w:t>
+      </w:r>
+      <w:r>
+        <w:rPr>
+          <w:rStyle w:val="HTMLCode"/>
+        </w:rPr>
+        <w:t xml:space="preserve">public static void </w:t>
+      </w:r>
+      <w:proofErr w:type="gramStart"/>
+      <w:r>
+        <w:rPr>
+          <w:rStyle w:val="HTMLCode"/>
+        </w:rPr>
+        <w:t>main(</w:t>
+      </w:r>
+      <w:proofErr w:type="gramEnd"/>
+      <w:r>
+        <w:rPr>
+          <w:rStyle w:val="HTMLCode"/>
+        </w:rPr>
+        <w:t>...)</w:t>
+      </w:r>
+      <w:r>
+        <w:t xml:space="preserve">, class wrappers, etc.). Great for beginners, scripting, and quick prototyping. </w:t>
+      </w:r>
+      <w:hyperlink r:id="rId16" w:tgtFrame="_blank" w:history="1">
+        <w:r>
+          <w:rPr>
+            <w:rStyle w:val="max-w-15ch"/>
+            <w:color w:val="0000FF"/>
+            <w:u w:val="single"/>
+          </w:rPr>
+          <w:t>Javaaihub</w:t>
+        </w:r>
+        <w:r>
+          <w:rPr>
+            <w:rStyle w:val="-me-1"/>
+            <w:rFonts w:eastAsiaTheme="majorEastAsia"/>
+            <w:color w:val="0000FF"/>
+            <w:u w:val="single"/>
+          </w:rPr>
+          <w:t>+1</w:t>
+        </w:r>
+      </w:hyperlink>
+    </w:p>
+    <w:p>
+      <w:pPr>
+        <w:pStyle w:val="NormalWeb"/>
+        <w:numPr>
+          <w:ilvl w:val="0"/>
+          <w:numId w:val="16"/>
+        </w:numPr>
+      </w:pPr>
+      <w:r>
+        <w:rPr>
+          <w:rStyle w:val="Strong"/>
+        </w:rPr>
+        <w:t>Flexible Constructor Bodies — JEP 513</w:t>
+      </w:r>
+      <w:r>
+        <w:br/>
+        <w:t xml:space="preserve">Allows more flexibility in constructors: you can execute initialization or validation code </w:t>
+      </w:r>
+      <w:r>
+        <w:rPr>
+          <w:rStyle w:val="Emphasis"/>
+          <w:rFonts w:eastAsiaTheme="majorEastAsia"/>
+        </w:rPr>
+        <w:t>before</w:t>
+      </w:r>
+      <w:r>
+        <w:t xml:space="preserve"> calling </w:t>
+      </w:r>
+      <w:proofErr w:type="gramStart"/>
+      <w:r>
+        <w:rPr>
+          <w:rStyle w:val="HTMLCode"/>
+        </w:rPr>
+        <w:t>super(</w:t>
+      </w:r>
+      <w:proofErr w:type="gramEnd"/>
+      <w:r>
+        <w:rPr>
+          <w:rStyle w:val="HTMLCode"/>
+        </w:rPr>
+        <w:t>...)</w:t>
+      </w:r>
+      <w:r>
+        <w:t xml:space="preserve"> or </w:t>
+      </w:r>
+      <w:r>
+        <w:rPr>
+          <w:rStyle w:val="HTMLCode"/>
+        </w:rPr>
+        <w:t>this(...)</w:t>
+      </w:r>
+      <w:r>
+        <w:t xml:space="preserve">. Improves safety and expressiveness when writing constructors. </w:t>
+      </w:r>
+      <w:hyperlink r:id="rId17" w:tgtFrame="_blank" w:history="1">
+        <w:r>
+          <w:rPr>
+            <w:rStyle w:val="max-w-15ch"/>
+            <w:color w:val="0000FF"/>
+            <w:u w:val="single"/>
+          </w:rPr>
+          <w:t>Oracle Blogs</w:t>
+        </w:r>
+        <w:r>
+          <w:rPr>
+            <w:rStyle w:val="-me-1"/>
+            <w:rFonts w:eastAsiaTheme="majorEastAsia"/>
+            <w:color w:val="0000FF"/>
+            <w:u w:val="single"/>
+          </w:rPr>
+          <w:t>+1</w:t>
+        </w:r>
+      </w:hyperlink>
+    </w:p>
+    <w:p>
+      <w:pPr>
+        <w:spacing w:before="100" w:beforeAutospacing="1" w:after="100" w:afterAutospacing="1" w:line="240" w:lineRule="auto"/>
+        <w:ind w:left="360"/>
+        <w:rPr>
+          <w:rFonts w:ascii="Calibri Light" w:hAnsi="Calibri Light"/>
+          <w:sz w:val="24"/>
+          <w:szCs w:val="26"/>
+        </w:rPr>
+      </w:pPr>
+      <w:r>
+        <w:rPr>
+          <w:rFonts w:ascii="Calibri Light" w:hAnsi="Calibri Light"/>
+          <w:sz w:val="24"/>
+          <w:szCs w:val="26"/>
+        </w:rPr>
+        <w:t>String templates – Final</w:t>
+      </w:r>
+    </w:p>
+    <w:p>
+      <w:pPr>
+        <w:spacing w:before="100" w:beforeAutospacing="1" w:after="100" w:afterAutospacing="1" w:line="240" w:lineRule="auto"/>
+        <w:ind w:left="360"/>
+        <w:rPr>
+          <w:rFonts w:ascii="Calibri Light" w:hAnsi="Calibri Light"/>
+          <w:sz w:val="24"/>
+          <w:szCs w:val="26"/>
+        </w:rPr>
+      </w:pPr>
+      <w:r>
+        <w:rPr>
+          <w:rFonts w:ascii="Calibri Light" w:hAnsi="Calibri Light"/>
+          <w:sz w:val="24"/>
+          <w:szCs w:val="26"/>
+        </w:rPr>
+        <w:t>Value objects stable</w:t>
+      </w:r>
+    </w:p>
+    <w:p>
+      <w:pPr>
+        <w:spacing w:before="100" w:beforeAutospacing="1" w:after="100" w:afterAutospacing="1" w:line="240" w:lineRule="auto"/>
+        <w:ind w:left="360"/>
+        <w:rPr>
+          <w:rFonts w:ascii="Calibri Light" w:hAnsi="Calibri Light"/>
+          <w:sz w:val="24"/>
+          <w:szCs w:val="26"/>
+        </w:rPr>
+      </w:pPr>
+      <w:r>
+        <w:rPr>
+          <w:rFonts w:ascii="Calibri Light" w:hAnsi="Calibri Light"/>
+          <w:sz w:val="24"/>
+          <w:szCs w:val="26"/>
+        </w:rPr>
+        <w:t>Stream Gathers – Final</w:t>
+      </w:r>
+    </w:p>
+    <w:p>
+      <w:pPr>
+        <w:spacing w:before="100" w:beforeAutospacing="1" w:after="100" w:afterAutospacing="1" w:line="240" w:lineRule="auto"/>
+        <w:ind w:left="360"/>
+        <w:rPr>
+          <w:rFonts w:ascii="Calibri Light" w:hAnsi="Calibri Light"/>
+          <w:sz w:val="24"/>
+          <w:szCs w:val="26"/>
+        </w:rPr>
+      </w:pPr>
+      <w:r>
+        <w:rPr>
+          <w:rFonts w:ascii="Calibri Light" w:hAnsi="Calibri Light"/>
+          <w:sz w:val="24"/>
+          <w:szCs w:val="26"/>
+        </w:rPr>
+        <w:t xml:space="preserve">Class-File </w:t>
+      </w:r>
+      <w:proofErr w:type="spellStart"/>
+      <w:proofErr w:type="gramStart"/>
+      <w:r>
+        <w:rPr>
+          <w:rFonts w:ascii="Calibri Light" w:hAnsi="Calibri Light"/>
+          <w:sz w:val="24"/>
+          <w:szCs w:val="26"/>
+        </w:rPr>
+        <w:t>api</w:t>
+      </w:r>
+      <w:proofErr w:type="spellEnd"/>
+      <w:proofErr w:type="gramEnd"/>
+    </w:p>
+    <w:p>
+      <w:pPr>
+        <w:spacing w:before="100" w:beforeAutospacing="1" w:after="100" w:afterAutospacing="1" w:line="240" w:lineRule="auto"/>
+        <w:ind w:left="360"/>
+        <w:rPr>
+          <w:rFonts w:ascii="Calibri Light" w:hAnsi="Calibri Light"/>
+          <w:sz w:val="24"/>
+          <w:szCs w:val="26"/>
+        </w:rPr>
+      </w:pPr>
+      <w:r>
+        <w:rPr>
+          <w:rStyle w:val="Strong"/>
+        </w:rPr>
+        <w:t>Foreign Function &amp; Memory API</w:t>
+      </w:r>
+      <w:r>
+        <w:t xml:space="preserve"> – fully polished</w:t>
+      </w:r>
+      <w:bookmarkStart w:id="0" w:name="_GoBack"/>
+      <w:bookmarkEnd w:id="0"/>
+    </w:p>
+    <w:p>
+      <w:pPr>
+        <w:pBdr>
+          <w:bottom w:val="single" w:sz="12" w:space="1" w:color="auto"/>
+        </w:pBdr>
+        <w:tabs>
+          <w:tab w:val="left" w:pos="2500"/>
+        </w:tabs>
+        <w:spacing w:before="100" w:beforeAutospacing="1" w:after="100" w:afterAutospacing="1" w:line="240" w:lineRule="auto"/>
+        <w:rPr>
+          <w:rFonts w:ascii="Calibri Light" w:hAnsi="Calibri Light"/>
+          <w:sz w:val="24"/>
+          <w:szCs w:val="26"/>
+        </w:rPr>
+      </w:pPr>
+      <w:r>
+        <w:rPr>
+          <w:rFonts w:ascii="Calibri Light" w:hAnsi="Calibri Light"/>
+          <w:sz w:val="24"/>
+          <w:szCs w:val="26"/>
+        </w:rPr>
+        <w:tab/>
+      </w:r>
+    </w:p>
+    <w:p>
+      <w:pPr>
+        <w:spacing w:before="100" w:beforeAutospacing="1" w:after="100" w:afterAutospacing="1" w:line="240" w:lineRule="auto"/>
+        <w:rPr>
+          <w:rFonts w:ascii="Calibri Light" w:hAnsi="Calibri Light"/>
+          <w:sz w:val="24"/>
+          <w:szCs w:val="26"/>
+        </w:rPr>
+      </w:pPr>
+    </w:p>
+    <w:p>
+      <w:pPr>
+        <w:pBdr>
+          <w:bottom w:val="single" w:sz="12" w:space="1" w:color="auto"/>
+        </w:pBdr>
+        <w:tabs>
+          <w:tab w:val="left" w:pos="2500"/>
+        </w:tabs>
+        <w:spacing w:before="100" w:beforeAutospacing="1" w:after="100" w:afterAutospacing="1" w:line="240" w:lineRule="auto"/>
+        <w:rPr>
+          <w:rFonts w:ascii="Calibri Light" w:hAnsi="Calibri Light"/>
+          <w:sz w:val="24"/>
+          <w:szCs w:val="26"/>
+        </w:rPr>
+      </w:pPr>
+      <w:r>
+        <w:rPr>
+          <w:rFonts w:ascii="Calibri Light" w:hAnsi="Calibri Light"/>
+          <w:sz w:val="24"/>
+          <w:szCs w:val="26"/>
+        </w:rPr>
+        <w:tab/>
+      </w:r>
+    </w:p>
+    <w:p>
+      <w:pPr>
+        <w:spacing w:before="100" w:beforeAutospacing="1" w:after="100" w:afterAutospacing="1" w:line="240" w:lineRule="auto"/>
+        <w:rPr>
+          <w:rFonts w:ascii="Calibri Light" w:hAnsi="Calibri Light"/>
+          <w:sz w:val="24"/>
+          <w:szCs w:val="26"/>
+        </w:rPr>
+      </w:pPr>
+    </w:p>
+    <w:p>
+      <w:pPr>
+        <w:pBdr>
+          <w:bottom w:val="single" w:sz="12" w:space="1" w:color="auto"/>
+        </w:pBdr>
+        <w:tabs>
+          <w:tab w:val="left" w:pos="2500"/>
+        </w:tabs>
+        <w:spacing w:before="100" w:beforeAutospacing="1" w:after="100" w:afterAutospacing="1" w:line="240" w:lineRule="auto"/>
+        <w:rPr>
+          <w:rFonts w:ascii="Calibri Light" w:hAnsi="Calibri Light"/>
+          <w:sz w:val="24"/>
+          <w:szCs w:val="26"/>
+        </w:rPr>
+      </w:pPr>
+      <w:r>
+        <w:rPr>
+          <w:rFonts w:ascii="Calibri Light" w:hAnsi="Calibri Light"/>
+          <w:sz w:val="24"/>
+          <w:szCs w:val="26"/>
+        </w:rPr>
+        <w:tab/>
+      </w:r>
+    </w:p>
+    <w:p>
+      <w:pPr>
+        <w:spacing w:before="100" w:beforeAutospacing="1" w:after="100" w:afterAutospacing="1" w:line="240" w:lineRule="auto"/>
+        <w:rPr>
+          <w:rFonts w:ascii="Calibri Light" w:hAnsi="Calibri Light"/>
+          <w:sz w:val="24"/>
+          <w:szCs w:val="26"/>
+        </w:rPr>
+      </w:pPr>
+    </w:p>
+    <w:p>
+      <w:pPr>
+        <w:pBdr>
+          <w:bottom w:val="single" w:sz="12" w:space="1" w:color="auto"/>
+        </w:pBdr>
+        <w:tabs>
+          <w:tab w:val="left" w:pos="2500"/>
+        </w:tabs>
+        <w:spacing w:before="100" w:beforeAutospacing="1" w:after="100" w:afterAutospacing="1" w:line="240" w:lineRule="auto"/>
+        <w:rPr>
+          <w:rFonts w:ascii="Calibri Light" w:hAnsi="Calibri Light"/>
+          <w:sz w:val="24"/>
+          <w:szCs w:val="26"/>
+        </w:rPr>
+      </w:pPr>
+      <w:r>
+        <w:rPr>
+          <w:rFonts w:ascii="Calibri Light" w:hAnsi="Calibri Light"/>
+          <w:sz w:val="24"/>
+          <w:szCs w:val="26"/>
+        </w:rPr>
+        <w:tab/>
+      </w:r>
+    </w:p>
+    <w:p>
+      <w:pPr>
+        <w:spacing w:before="100" w:beforeAutospacing="1" w:after="100" w:afterAutospacing="1" w:line="240" w:lineRule="auto"/>
+        <w:rPr>
+          <w:rFonts w:ascii="Calibri Light" w:hAnsi="Calibri Light"/>
+          <w:sz w:val="24"/>
+          <w:szCs w:val="26"/>
+        </w:rPr>
+      </w:pPr>
+      <w:r>
+        <w:rPr>
+          <w:rFonts w:ascii="Calibri Light" w:hAnsi="Calibri Light"/>
+          <w:sz w:val="24"/>
+          <w:szCs w:val="26"/>
+        </w:rPr>
+        <w:tab/>
+      </w:r>
+    </w:p>
+    <w:p>
+      <w:pPr>
+        <w:spacing w:before="100" w:beforeAutospacing="1" w:after="100" w:afterAutospacing="1" w:line="240" w:lineRule="auto"/>
+        <w:rPr>
+          <w:rFonts w:ascii="Calibri Light" w:hAnsi="Calibri Light"/>
+          <w:sz w:val="24"/>
+          <w:szCs w:val="26"/>
+        </w:rPr>
+      </w:pPr>
+    </w:p>
+    <w:p>
+      <w:pPr>
+        <w:pBdr>
+          <w:bottom w:val="single" w:sz="12" w:space="1" w:color="auto"/>
+        </w:pBdr>
+        <w:tabs>
+          <w:tab w:val="left" w:pos="2500"/>
+        </w:tabs>
+        <w:spacing w:before="100" w:beforeAutospacing="1" w:after="100" w:afterAutospacing="1" w:line="240" w:lineRule="auto"/>
+        <w:rPr>
+          <w:rFonts w:ascii="Calibri Light" w:hAnsi="Calibri Light"/>
+          <w:sz w:val="24"/>
+          <w:szCs w:val="26"/>
+        </w:rPr>
+      </w:pPr>
+      <w:r>
+        <w:rPr>
+          <w:rFonts w:ascii="Calibri Light" w:hAnsi="Calibri Light"/>
+          <w:sz w:val="24"/>
+          <w:szCs w:val="26"/>
+        </w:rPr>
+        <w:tab/>
+      </w:r>
     </w:p>
     <w:p>
       <w:pPr>
@@ -22225,8 +24477,8 @@
       </w:pPr>
     </w:p>
     <w:sectPr>
-      <w:headerReference w:type="default" r:id="rId14"/>
-      <w:footerReference w:type="default" r:id="rId15"/>
+      <w:headerReference w:type="default" r:id="rId18"/>
+      <w:footerReference w:type="default" r:id="rId19"/>
       <w:pgSz w:w="11906" w:h="16838"/>
       <w:pgMar w:top="1440" w:right="1440" w:bottom="1440" w:left="1440" w:header="708" w:footer="708" w:gutter="0"/>
       <w:cols w:space="708"/>
@@ -22411,6 +24663,95 @@
 <file path=word/numbering.xml><?xml version="1.0" encoding="utf-8"?>
 <w:numbering xmlns:wpc="http://schemas.microsoft.com/office/word/2010/wordprocessingCanvas" xmlns:mc="http://schemas.openxmlformats.org/markup-compatibility/2006" xmlns:o="urn:schemas-microsoft-com:office:office" xmlns:r="http://schemas.openxmlformats.org/officeDocument/2006/relationships" xmlns:m="http://schemas.openxmlformats.org/officeDocument/2006/math" xmlns:v="urn:schemas-microsoft-com:vml" xmlns:wp14="http://schemas.microsoft.com/office/word/2010/wordprocessingDrawing" xmlns:wp="http://schemas.openxmlformats.org/drawingml/2006/wordprocessingDrawing" xmlns:w10="urn:schemas-microsoft-com:office:word" xmlns:w="http://schemas.openxmlformats.org/wordprocessingml/2006/main" xmlns:w14="http://schemas.microsoft.com/office/word/2010/wordml" xmlns:wpg="http://schemas.microsoft.com/office/word/2010/wordprocessingGroup" xmlns:wpi="http://schemas.microsoft.com/office/word/2010/wordprocessingInk" xmlns:wne="http://schemas.microsoft.com/office/word/2006/wordml" xmlns:wps="http://schemas.microsoft.com/office/word/2010/wordprocessingShape" mc:Ignorable="w14 wp14">
   <w:abstractNum w:abstractNumId="0">
+    <w:nsid w:val="120A479C"/>
+    <w:multiLevelType w:val="hybridMultilevel"/>
+    <w:tmpl w:val="C5F6E540"/>
+    <w:lvl w:ilvl="0" w:tplc="BCF2436A">
+      <w:start w:val="1"/>
+      <w:numFmt w:val="decimal"/>
+      <w:lvlText w:val="%1."/>
+      <w:lvlJc w:val="left"/>
+      <w:pPr>
+        <w:ind w:left="1080" w:hanging="360"/>
+      </w:pPr>
+      <w:rPr>
+        <w:rFonts w:hint="default"/>
+      </w:rPr>
+    </w:lvl>
+    <w:lvl w:ilvl="1" w:tplc="40090019" w:tentative="1">
+      <w:start w:val="1"/>
+      <w:numFmt w:val="lowerLetter"/>
+      <w:lvlText w:val="%2."/>
+      <w:lvlJc w:val="left"/>
+      <w:pPr>
+        <w:ind w:left="1800" w:hanging="360"/>
+      </w:pPr>
+    </w:lvl>
+    <w:lvl w:ilvl="2" w:tplc="4009001B" w:tentative="1">
+      <w:start w:val="1"/>
+      <w:numFmt w:val="lowerRoman"/>
+      <w:lvlText w:val="%3."/>
+      <w:lvlJc w:val="right"/>
+      <w:pPr>
+        <w:ind w:left="2520" w:hanging="180"/>
+      </w:pPr>
+    </w:lvl>
+    <w:lvl w:ilvl="3" w:tplc="4009000F" w:tentative="1">
+      <w:start w:val="1"/>
+      <w:numFmt w:val="decimal"/>
+      <w:lvlText w:val="%4."/>
+      <w:lvlJc w:val="left"/>
+      <w:pPr>
+        <w:ind w:left="3240" w:hanging="360"/>
+      </w:pPr>
+    </w:lvl>
+    <w:lvl w:ilvl="4" w:tplc="40090019" w:tentative="1">
+      <w:start w:val="1"/>
+      <w:numFmt w:val="lowerLetter"/>
+      <w:lvlText w:val="%5."/>
+      <w:lvlJc w:val="left"/>
+      <w:pPr>
+        <w:ind w:left="3960" w:hanging="360"/>
+      </w:pPr>
+    </w:lvl>
+    <w:lvl w:ilvl="5" w:tplc="4009001B" w:tentative="1">
+      <w:start w:val="1"/>
+      <w:numFmt w:val="lowerRoman"/>
+      <w:lvlText w:val="%6."/>
+      <w:lvlJc w:val="right"/>
+      <w:pPr>
+        <w:ind w:left="4680" w:hanging="180"/>
+      </w:pPr>
+    </w:lvl>
+    <w:lvl w:ilvl="6" w:tplc="4009000F" w:tentative="1">
+      <w:start w:val="1"/>
+      <w:numFmt w:val="decimal"/>
+      <w:lvlText w:val="%7."/>
+      <w:lvlJc w:val="left"/>
+      <w:pPr>
+        <w:ind w:left="5400" w:hanging="360"/>
+      </w:pPr>
+    </w:lvl>
+    <w:lvl w:ilvl="7" w:tplc="40090019" w:tentative="1">
+      <w:start w:val="1"/>
+      <w:numFmt w:val="lowerLetter"/>
+      <w:lvlText w:val="%8."/>
+      <w:lvlJc w:val="left"/>
+      <w:pPr>
+        <w:ind w:left="6120" w:hanging="360"/>
+      </w:pPr>
+    </w:lvl>
+    <w:lvl w:ilvl="8" w:tplc="4009001B" w:tentative="1">
+      <w:start w:val="1"/>
+      <w:numFmt w:val="lowerRoman"/>
+      <w:lvlText w:val="%9."/>
+      <w:lvlJc w:val="right"/>
+      <w:pPr>
+        <w:ind w:left="6840" w:hanging="180"/>
+      </w:pPr>
+    </w:lvl>
+  </w:abstractNum>
+  <w:abstractNum w:abstractNumId="1">
     <w:nsid w:val="1ECD544A"/>
     <w:multiLevelType w:val="hybridMultilevel"/>
     <w:tmpl w:val="35742C8A"/>
@@ -22523,7 +24864,602 @@
       </w:rPr>
     </w:lvl>
   </w:abstractNum>
-  <w:abstractNum w:abstractNumId="1">
+  <w:abstractNum w:abstractNumId="2">
+    <w:nsid w:val="2046672E"/>
+    <w:multiLevelType w:val="hybridMultilevel"/>
+    <w:tmpl w:val="12F48BD4"/>
+    <w:lvl w:ilvl="0" w:tplc="7818B46C">
+      <w:start w:val="1"/>
+      <w:numFmt w:val="decimal"/>
+      <w:lvlText w:val="%1."/>
+      <w:lvlJc w:val="left"/>
+      <w:pPr>
+        <w:ind w:left="1080" w:hanging="360"/>
+      </w:pPr>
+      <w:rPr>
+        <w:rFonts w:hint="default"/>
+      </w:rPr>
+    </w:lvl>
+    <w:lvl w:ilvl="1" w:tplc="40090019" w:tentative="1">
+      <w:start w:val="1"/>
+      <w:numFmt w:val="lowerLetter"/>
+      <w:lvlText w:val="%2."/>
+      <w:lvlJc w:val="left"/>
+      <w:pPr>
+        <w:ind w:left="1800" w:hanging="360"/>
+      </w:pPr>
+    </w:lvl>
+    <w:lvl w:ilvl="2" w:tplc="4009001B" w:tentative="1">
+      <w:start w:val="1"/>
+      <w:numFmt w:val="lowerRoman"/>
+      <w:lvlText w:val="%3."/>
+      <w:lvlJc w:val="right"/>
+      <w:pPr>
+        <w:ind w:left="2520" w:hanging="180"/>
+      </w:pPr>
+    </w:lvl>
+    <w:lvl w:ilvl="3" w:tplc="4009000F" w:tentative="1">
+      <w:start w:val="1"/>
+      <w:numFmt w:val="decimal"/>
+      <w:lvlText w:val="%4."/>
+      <w:lvlJc w:val="left"/>
+      <w:pPr>
+        <w:ind w:left="3240" w:hanging="360"/>
+      </w:pPr>
+    </w:lvl>
+    <w:lvl w:ilvl="4" w:tplc="40090019" w:tentative="1">
+      <w:start w:val="1"/>
+      <w:numFmt w:val="lowerLetter"/>
+      <w:lvlText w:val="%5."/>
+      <w:lvlJc w:val="left"/>
+      <w:pPr>
+        <w:ind w:left="3960" w:hanging="360"/>
+      </w:pPr>
+    </w:lvl>
+    <w:lvl w:ilvl="5" w:tplc="4009001B" w:tentative="1">
+      <w:start w:val="1"/>
+      <w:numFmt w:val="lowerRoman"/>
+      <w:lvlText w:val="%6."/>
+      <w:lvlJc w:val="right"/>
+      <w:pPr>
+        <w:ind w:left="4680" w:hanging="180"/>
+      </w:pPr>
+    </w:lvl>
+    <w:lvl w:ilvl="6" w:tplc="4009000F" w:tentative="1">
+      <w:start w:val="1"/>
+      <w:numFmt w:val="decimal"/>
+      <w:lvlText w:val="%7."/>
+      <w:lvlJc w:val="left"/>
+      <w:pPr>
+        <w:ind w:left="5400" w:hanging="360"/>
+      </w:pPr>
+    </w:lvl>
+    <w:lvl w:ilvl="7" w:tplc="40090019" w:tentative="1">
+      <w:start w:val="1"/>
+      <w:numFmt w:val="lowerLetter"/>
+      <w:lvlText w:val="%8."/>
+      <w:lvlJc w:val="left"/>
+      <w:pPr>
+        <w:ind w:left="6120" w:hanging="360"/>
+      </w:pPr>
+    </w:lvl>
+    <w:lvl w:ilvl="8" w:tplc="4009001B" w:tentative="1">
+      <w:start w:val="1"/>
+      <w:numFmt w:val="lowerRoman"/>
+      <w:lvlText w:val="%9."/>
+      <w:lvlJc w:val="right"/>
+      <w:pPr>
+        <w:ind w:left="6840" w:hanging="180"/>
+      </w:pPr>
+    </w:lvl>
+  </w:abstractNum>
+  <w:abstractNum w:abstractNumId="3">
+    <w:nsid w:val="2DE56610"/>
+    <w:multiLevelType w:val="hybridMultilevel"/>
+    <w:tmpl w:val="AA5C2F78"/>
+    <w:lvl w:ilvl="0" w:tplc="C6C056C2">
+      <w:start w:val="1"/>
+      <w:numFmt w:val="decimal"/>
+      <w:lvlText w:val="%1."/>
+      <w:lvlJc w:val="left"/>
+      <w:pPr>
+        <w:ind w:left="1080" w:hanging="360"/>
+      </w:pPr>
+      <w:rPr>
+        <w:rFonts w:hint="default"/>
+      </w:rPr>
+    </w:lvl>
+    <w:lvl w:ilvl="1" w:tplc="40090019" w:tentative="1">
+      <w:start w:val="1"/>
+      <w:numFmt w:val="lowerLetter"/>
+      <w:lvlText w:val="%2."/>
+      <w:lvlJc w:val="left"/>
+      <w:pPr>
+        <w:ind w:left="1800" w:hanging="360"/>
+      </w:pPr>
+    </w:lvl>
+    <w:lvl w:ilvl="2" w:tplc="4009001B" w:tentative="1">
+      <w:start w:val="1"/>
+      <w:numFmt w:val="lowerRoman"/>
+      <w:lvlText w:val="%3."/>
+      <w:lvlJc w:val="right"/>
+      <w:pPr>
+        <w:ind w:left="2520" w:hanging="180"/>
+      </w:pPr>
+    </w:lvl>
+    <w:lvl w:ilvl="3" w:tplc="4009000F" w:tentative="1">
+      <w:start w:val="1"/>
+      <w:numFmt w:val="decimal"/>
+      <w:lvlText w:val="%4."/>
+      <w:lvlJc w:val="left"/>
+      <w:pPr>
+        <w:ind w:left="3240" w:hanging="360"/>
+      </w:pPr>
+    </w:lvl>
+    <w:lvl w:ilvl="4" w:tplc="40090019" w:tentative="1">
+      <w:start w:val="1"/>
+      <w:numFmt w:val="lowerLetter"/>
+      <w:lvlText w:val="%5."/>
+      <w:lvlJc w:val="left"/>
+      <w:pPr>
+        <w:ind w:left="3960" w:hanging="360"/>
+      </w:pPr>
+    </w:lvl>
+    <w:lvl w:ilvl="5" w:tplc="4009001B" w:tentative="1">
+      <w:start w:val="1"/>
+      <w:numFmt w:val="lowerRoman"/>
+      <w:lvlText w:val="%6."/>
+      <w:lvlJc w:val="right"/>
+      <w:pPr>
+        <w:ind w:left="4680" w:hanging="180"/>
+      </w:pPr>
+    </w:lvl>
+    <w:lvl w:ilvl="6" w:tplc="4009000F" w:tentative="1">
+      <w:start w:val="1"/>
+      <w:numFmt w:val="decimal"/>
+      <w:lvlText w:val="%7."/>
+      <w:lvlJc w:val="left"/>
+      <w:pPr>
+        <w:ind w:left="5400" w:hanging="360"/>
+      </w:pPr>
+    </w:lvl>
+    <w:lvl w:ilvl="7" w:tplc="40090019" w:tentative="1">
+      <w:start w:val="1"/>
+      <w:numFmt w:val="lowerLetter"/>
+      <w:lvlText w:val="%8."/>
+      <w:lvlJc w:val="left"/>
+      <w:pPr>
+        <w:ind w:left="6120" w:hanging="360"/>
+      </w:pPr>
+    </w:lvl>
+    <w:lvl w:ilvl="8" w:tplc="4009001B" w:tentative="1">
+      <w:start w:val="1"/>
+      <w:numFmt w:val="lowerRoman"/>
+      <w:lvlText w:val="%9."/>
+      <w:lvlJc w:val="right"/>
+      <w:pPr>
+        <w:ind w:left="6840" w:hanging="180"/>
+      </w:pPr>
+    </w:lvl>
+  </w:abstractNum>
+  <w:abstractNum w:abstractNumId="4">
+    <w:nsid w:val="30EF10AA"/>
+    <w:multiLevelType w:val="hybridMultilevel"/>
+    <w:tmpl w:val="764CA07E"/>
+    <w:lvl w:ilvl="0" w:tplc="3AB233F4">
+      <w:start w:val="1"/>
+      <w:numFmt w:val="decimal"/>
+      <w:lvlText w:val="%1."/>
+      <w:lvlJc w:val="left"/>
+      <w:pPr>
+        <w:ind w:left="1080" w:hanging="360"/>
+      </w:pPr>
+      <w:rPr>
+        <w:rFonts w:hint="default"/>
+      </w:rPr>
+    </w:lvl>
+    <w:lvl w:ilvl="1" w:tplc="40090019" w:tentative="1">
+      <w:start w:val="1"/>
+      <w:numFmt w:val="lowerLetter"/>
+      <w:lvlText w:val="%2."/>
+      <w:lvlJc w:val="left"/>
+      <w:pPr>
+        <w:ind w:left="1800" w:hanging="360"/>
+      </w:pPr>
+    </w:lvl>
+    <w:lvl w:ilvl="2" w:tplc="4009001B" w:tentative="1">
+      <w:start w:val="1"/>
+      <w:numFmt w:val="lowerRoman"/>
+      <w:lvlText w:val="%3."/>
+      <w:lvlJc w:val="right"/>
+      <w:pPr>
+        <w:ind w:left="2520" w:hanging="180"/>
+      </w:pPr>
+    </w:lvl>
+    <w:lvl w:ilvl="3" w:tplc="4009000F" w:tentative="1">
+      <w:start w:val="1"/>
+      <w:numFmt w:val="decimal"/>
+      <w:lvlText w:val="%4."/>
+      <w:lvlJc w:val="left"/>
+      <w:pPr>
+        <w:ind w:left="3240" w:hanging="360"/>
+      </w:pPr>
+    </w:lvl>
+    <w:lvl w:ilvl="4" w:tplc="40090019" w:tentative="1">
+      <w:start w:val="1"/>
+      <w:numFmt w:val="lowerLetter"/>
+      <w:lvlText w:val="%5."/>
+      <w:lvlJc w:val="left"/>
+      <w:pPr>
+        <w:ind w:left="3960" w:hanging="360"/>
+      </w:pPr>
+    </w:lvl>
+    <w:lvl w:ilvl="5" w:tplc="4009001B" w:tentative="1">
+      <w:start w:val="1"/>
+      <w:numFmt w:val="lowerRoman"/>
+      <w:lvlText w:val="%6."/>
+      <w:lvlJc w:val="right"/>
+      <w:pPr>
+        <w:ind w:left="4680" w:hanging="180"/>
+      </w:pPr>
+    </w:lvl>
+    <w:lvl w:ilvl="6" w:tplc="4009000F" w:tentative="1">
+      <w:start w:val="1"/>
+      <w:numFmt w:val="decimal"/>
+      <w:lvlText w:val="%7."/>
+      <w:lvlJc w:val="left"/>
+      <w:pPr>
+        <w:ind w:left="5400" w:hanging="360"/>
+      </w:pPr>
+    </w:lvl>
+    <w:lvl w:ilvl="7" w:tplc="40090019" w:tentative="1">
+      <w:start w:val="1"/>
+      <w:numFmt w:val="lowerLetter"/>
+      <w:lvlText w:val="%8."/>
+      <w:lvlJc w:val="left"/>
+      <w:pPr>
+        <w:ind w:left="6120" w:hanging="360"/>
+      </w:pPr>
+    </w:lvl>
+    <w:lvl w:ilvl="8" w:tplc="4009001B" w:tentative="1">
+      <w:start w:val="1"/>
+      <w:numFmt w:val="lowerRoman"/>
+      <w:lvlText w:val="%9."/>
+      <w:lvlJc w:val="right"/>
+      <w:pPr>
+        <w:ind w:left="6840" w:hanging="180"/>
+      </w:pPr>
+    </w:lvl>
+  </w:abstractNum>
+  <w:abstractNum w:abstractNumId="5">
+    <w:nsid w:val="388B7A67"/>
+    <w:multiLevelType w:val="multilevel"/>
+    <w:tmpl w:val="47B08126"/>
+    <w:lvl w:ilvl="0">
+      <w:start w:val="1"/>
+      <w:numFmt w:val="bullet"/>
+      <w:lvlText w:val=""/>
+      <w:lvlJc w:val="left"/>
+      <w:pPr>
+        <w:tabs>
+          <w:tab w:val="num" w:pos="720"/>
+        </w:tabs>
+        <w:ind w:left="720" w:hanging="360"/>
+      </w:pPr>
+      <w:rPr>
+        <w:rFonts w:ascii="Symbol" w:hAnsi="Symbol" w:hint="default"/>
+        <w:sz w:val="20"/>
+      </w:rPr>
+    </w:lvl>
+    <w:lvl w:ilvl="1" w:tentative="1">
+      <w:start w:val="1"/>
+      <w:numFmt w:val="bullet"/>
+      <w:lvlText w:val="o"/>
+      <w:lvlJc w:val="left"/>
+      <w:pPr>
+        <w:tabs>
+          <w:tab w:val="num" w:pos="1440"/>
+        </w:tabs>
+        <w:ind w:left="1440" w:hanging="360"/>
+      </w:pPr>
+      <w:rPr>
+        <w:rFonts w:ascii="Courier New" w:hAnsi="Courier New" w:hint="default"/>
+        <w:sz w:val="20"/>
+      </w:rPr>
+    </w:lvl>
+    <w:lvl w:ilvl="2" w:tentative="1">
+      <w:start w:val="1"/>
+      <w:numFmt w:val="bullet"/>
+      <w:lvlText w:val=""/>
+      <w:lvlJc w:val="left"/>
+      <w:pPr>
+        <w:tabs>
+          <w:tab w:val="num" w:pos="2160"/>
+        </w:tabs>
+        <w:ind w:left="2160" w:hanging="360"/>
+      </w:pPr>
+      <w:rPr>
+        <w:rFonts w:ascii="Wingdings" w:hAnsi="Wingdings" w:hint="default"/>
+        <w:sz w:val="20"/>
+      </w:rPr>
+    </w:lvl>
+    <w:lvl w:ilvl="3" w:tentative="1">
+      <w:start w:val="1"/>
+      <w:numFmt w:val="bullet"/>
+      <w:lvlText w:val=""/>
+      <w:lvlJc w:val="left"/>
+      <w:pPr>
+        <w:tabs>
+          <w:tab w:val="num" w:pos="2880"/>
+        </w:tabs>
+        <w:ind w:left="2880" w:hanging="360"/>
+      </w:pPr>
+      <w:rPr>
+        <w:rFonts w:ascii="Wingdings" w:hAnsi="Wingdings" w:hint="default"/>
+        <w:sz w:val="20"/>
+      </w:rPr>
+    </w:lvl>
+    <w:lvl w:ilvl="4" w:tentative="1">
+      <w:start w:val="1"/>
+      <w:numFmt w:val="bullet"/>
+      <w:lvlText w:val=""/>
+      <w:lvlJc w:val="left"/>
+      <w:pPr>
+        <w:tabs>
+          <w:tab w:val="num" w:pos="3600"/>
+        </w:tabs>
+        <w:ind w:left="3600" w:hanging="360"/>
+      </w:pPr>
+      <w:rPr>
+        <w:rFonts w:ascii="Wingdings" w:hAnsi="Wingdings" w:hint="default"/>
+        <w:sz w:val="20"/>
+      </w:rPr>
+    </w:lvl>
+    <w:lvl w:ilvl="5" w:tentative="1">
+      <w:start w:val="1"/>
+      <w:numFmt w:val="bullet"/>
+      <w:lvlText w:val=""/>
+      <w:lvlJc w:val="left"/>
+      <w:pPr>
+        <w:tabs>
+          <w:tab w:val="num" w:pos="4320"/>
+        </w:tabs>
+        <w:ind w:left="4320" w:hanging="360"/>
+      </w:pPr>
+      <w:rPr>
+        <w:rFonts w:ascii="Wingdings" w:hAnsi="Wingdings" w:hint="default"/>
+        <w:sz w:val="20"/>
+      </w:rPr>
+    </w:lvl>
+    <w:lvl w:ilvl="6" w:tentative="1">
+      <w:start w:val="1"/>
+      <w:numFmt w:val="bullet"/>
+      <w:lvlText w:val=""/>
+      <w:lvlJc w:val="left"/>
+      <w:pPr>
+        <w:tabs>
+          <w:tab w:val="num" w:pos="5040"/>
+        </w:tabs>
+        <w:ind w:left="5040" w:hanging="360"/>
+      </w:pPr>
+      <w:rPr>
+        <w:rFonts w:ascii="Wingdings" w:hAnsi="Wingdings" w:hint="default"/>
+        <w:sz w:val="20"/>
+      </w:rPr>
+    </w:lvl>
+    <w:lvl w:ilvl="7" w:tentative="1">
+      <w:start w:val="1"/>
+      <w:numFmt w:val="bullet"/>
+      <w:lvlText w:val=""/>
+      <w:lvlJc w:val="left"/>
+      <w:pPr>
+        <w:tabs>
+          <w:tab w:val="num" w:pos="5760"/>
+        </w:tabs>
+        <w:ind w:left="5760" w:hanging="360"/>
+      </w:pPr>
+      <w:rPr>
+        <w:rFonts w:ascii="Wingdings" w:hAnsi="Wingdings" w:hint="default"/>
+        <w:sz w:val="20"/>
+      </w:rPr>
+    </w:lvl>
+    <w:lvl w:ilvl="8" w:tentative="1">
+      <w:start w:val="1"/>
+      <w:numFmt w:val="bullet"/>
+      <w:lvlText w:val=""/>
+      <w:lvlJc w:val="left"/>
+      <w:pPr>
+        <w:tabs>
+          <w:tab w:val="num" w:pos="6480"/>
+        </w:tabs>
+        <w:ind w:left="6480" w:hanging="360"/>
+      </w:pPr>
+      <w:rPr>
+        <w:rFonts w:ascii="Wingdings" w:hAnsi="Wingdings" w:hint="default"/>
+        <w:sz w:val="20"/>
+      </w:rPr>
+    </w:lvl>
+  </w:abstractNum>
+  <w:abstractNum w:abstractNumId="6">
+    <w:nsid w:val="3ABA3BEA"/>
+    <w:multiLevelType w:val="hybridMultilevel"/>
+    <w:tmpl w:val="5A3C2360"/>
+    <w:lvl w:ilvl="0" w:tplc="40090011">
+      <w:start w:val="1"/>
+      <w:numFmt w:val="decimal"/>
+      <w:lvlText w:val="%1)"/>
+      <w:lvlJc w:val="left"/>
+      <w:pPr>
+        <w:ind w:left="720" w:hanging="360"/>
+      </w:pPr>
+      <w:rPr>
+        <w:rFonts w:hint="default"/>
+      </w:rPr>
+    </w:lvl>
+    <w:lvl w:ilvl="1" w:tplc="40090019" w:tentative="1">
+      <w:start w:val="1"/>
+      <w:numFmt w:val="lowerLetter"/>
+      <w:lvlText w:val="%2."/>
+      <w:lvlJc w:val="left"/>
+      <w:pPr>
+        <w:ind w:left="1440" w:hanging="360"/>
+      </w:pPr>
+    </w:lvl>
+    <w:lvl w:ilvl="2" w:tplc="4009001B" w:tentative="1">
+      <w:start w:val="1"/>
+      <w:numFmt w:val="lowerRoman"/>
+      <w:lvlText w:val="%3."/>
+      <w:lvlJc w:val="right"/>
+      <w:pPr>
+        <w:ind w:left="2160" w:hanging="180"/>
+      </w:pPr>
+    </w:lvl>
+    <w:lvl w:ilvl="3" w:tplc="4009000F" w:tentative="1">
+      <w:start w:val="1"/>
+      <w:numFmt w:val="decimal"/>
+      <w:lvlText w:val="%4."/>
+      <w:lvlJc w:val="left"/>
+      <w:pPr>
+        <w:ind w:left="2880" w:hanging="360"/>
+      </w:pPr>
+    </w:lvl>
+    <w:lvl w:ilvl="4" w:tplc="40090019" w:tentative="1">
+      <w:start w:val="1"/>
+      <w:numFmt w:val="lowerLetter"/>
+      <w:lvlText w:val="%5."/>
+      <w:lvlJc w:val="left"/>
+      <w:pPr>
+        <w:ind w:left="3600" w:hanging="360"/>
+      </w:pPr>
+    </w:lvl>
+    <w:lvl w:ilvl="5" w:tplc="4009001B" w:tentative="1">
+      <w:start w:val="1"/>
+      <w:numFmt w:val="lowerRoman"/>
+      <w:lvlText w:val="%6."/>
+      <w:lvlJc w:val="right"/>
+      <w:pPr>
+        <w:ind w:left="4320" w:hanging="180"/>
+      </w:pPr>
+    </w:lvl>
+    <w:lvl w:ilvl="6" w:tplc="4009000F" w:tentative="1">
+      <w:start w:val="1"/>
+      <w:numFmt w:val="decimal"/>
+      <w:lvlText w:val="%7."/>
+      <w:lvlJc w:val="left"/>
+      <w:pPr>
+        <w:ind w:left="5040" w:hanging="360"/>
+      </w:pPr>
+    </w:lvl>
+    <w:lvl w:ilvl="7" w:tplc="40090019" w:tentative="1">
+      <w:start w:val="1"/>
+      <w:numFmt w:val="lowerLetter"/>
+      <w:lvlText w:val="%8."/>
+      <w:lvlJc w:val="left"/>
+      <w:pPr>
+        <w:ind w:left="5760" w:hanging="360"/>
+      </w:pPr>
+    </w:lvl>
+    <w:lvl w:ilvl="8" w:tplc="4009001B" w:tentative="1">
+      <w:start w:val="1"/>
+      <w:numFmt w:val="lowerRoman"/>
+      <w:lvlText w:val="%9."/>
+      <w:lvlJc w:val="right"/>
+      <w:pPr>
+        <w:ind w:left="6480" w:hanging="180"/>
+      </w:pPr>
+    </w:lvl>
+  </w:abstractNum>
+  <w:abstractNum w:abstractNumId="7">
+    <w:nsid w:val="40DC6BE7"/>
+    <w:multiLevelType w:val="hybridMultilevel"/>
+    <w:tmpl w:val="EDEE559A"/>
+    <w:lvl w:ilvl="0" w:tplc="AF1C678C">
+      <w:start w:val="1"/>
+      <w:numFmt w:val="decimal"/>
+      <w:lvlText w:val="%1."/>
+      <w:lvlJc w:val="left"/>
+      <w:pPr>
+        <w:ind w:left="1570" w:hanging="360"/>
+      </w:pPr>
+      <w:rPr>
+        <w:rFonts w:ascii="Calibri Light" w:hAnsi="Calibri Light" w:hint="default"/>
+        <w:sz w:val="24"/>
+      </w:rPr>
+    </w:lvl>
+    <w:lvl w:ilvl="1" w:tplc="40090019" w:tentative="1">
+      <w:start w:val="1"/>
+      <w:numFmt w:val="lowerLetter"/>
+      <w:lvlText w:val="%2."/>
+      <w:lvlJc w:val="left"/>
+      <w:pPr>
+        <w:ind w:left="2290" w:hanging="360"/>
+      </w:pPr>
+    </w:lvl>
+    <w:lvl w:ilvl="2" w:tplc="4009001B" w:tentative="1">
+      <w:start w:val="1"/>
+      <w:numFmt w:val="lowerRoman"/>
+      <w:lvlText w:val="%3."/>
+      <w:lvlJc w:val="right"/>
+      <w:pPr>
+        <w:ind w:left="3010" w:hanging="180"/>
+      </w:pPr>
+    </w:lvl>
+    <w:lvl w:ilvl="3" w:tplc="4009000F" w:tentative="1">
+      <w:start w:val="1"/>
+      <w:numFmt w:val="decimal"/>
+      <w:lvlText w:val="%4."/>
+      <w:lvlJc w:val="left"/>
+      <w:pPr>
+        <w:ind w:left="3730" w:hanging="360"/>
+      </w:pPr>
+    </w:lvl>
+    <w:lvl w:ilvl="4" w:tplc="40090019" w:tentative="1">
+      <w:start w:val="1"/>
+      <w:numFmt w:val="lowerLetter"/>
+      <w:lvlText w:val="%5."/>
+      <w:lvlJc w:val="left"/>
+      <w:pPr>
+        <w:ind w:left="4450" w:hanging="360"/>
+      </w:pPr>
+    </w:lvl>
+    <w:lvl w:ilvl="5" w:tplc="4009001B" w:tentative="1">
+      <w:start w:val="1"/>
+      <w:numFmt w:val="lowerRoman"/>
+      <w:lvlText w:val="%6."/>
+      <w:lvlJc w:val="right"/>
+      <w:pPr>
+        <w:ind w:left="5170" w:hanging="180"/>
+      </w:pPr>
+    </w:lvl>
+    <w:lvl w:ilvl="6" w:tplc="4009000F" w:tentative="1">
+      <w:start w:val="1"/>
+      <w:numFmt w:val="decimal"/>
+      <w:lvlText w:val="%7."/>
+      <w:lvlJc w:val="left"/>
+      <w:pPr>
+        <w:ind w:left="5890" w:hanging="360"/>
+      </w:pPr>
+    </w:lvl>
+    <w:lvl w:ilvl="7" w:tplc="40090019" w:tentative="1">
+      <w:start w:val="1"/>
+      <w:numFmt w:val="lowerLetter"/>
+      <w:lvlText w:val="%8."/>
+      <w:lvlJc w:val="left"/>
+      <w:pPr>
+        <w:ind w:left="6610" w:hanging="360"/>
+      </w:pPr>
+    </w:lvl>
+    <w:lvl w:ilvl="8" w:tplc="4009001B" w:tentative="1">
+      <w:start w:val="1"/>
+      <w:numFmt w:val="lowerRoman"/>
+      <w:lvlText w:val="%9."/>
+      <w:lvlJc w:val="right"/>
+      <w:pPr>
+        <w:ind w:left="7330" w:hanging="180"/>
+      </w:pPr>
+    </w:lvl>
+  </w:abstractNum>
+  <w:abstractNum w:abstractNumId="8">
     <w:nsid w:val="46B964A5"/>
     <w:multiLevelType w:val="multilevel"/>
     <w:tmpl w:val="D0F248EC"/>
@@ -22672,7 +25608,7 @@
       </w:rPr>
     </w:lvl>
   </w:abstractNum>
-  <w:abstractNum w:abstractNumId="2">
+  <w:abstractNum w:abstractNumId="9">
     <w:nsid w:val="46C24F1F"/>
     <w:multiLevelType w:val="multilevel"/>
     <w:tmpl w:val="616011D8"/>
@@ -22821,14 +25757,589 @@
       </w:rPr>
     </w:lvl>
   </w:abstractNum>
+  <w:abstractNum w:abstractNumId="10">
+    <w:nsid w:val="585B6873"/>
+    <w:multiLevelType w:val="hybridMultilevel"/>
+    <w:tmpl w:val="7E4A428E"/>
+    <w:lvl w:ilvl="0" w:tplc="6A3028A4">
+      <w:start w:val="1"/>
+      <w:numFmt w:val="decimal"/>
+      <w:lvlText w:val="%1."/>
+      <w:lvlJc w:val="left"/>
+      <w:pPr>
+        <w:ind w:left="1800" w:hanging="360"/>
+      </w:pPr>
+      <w:rPr>
+        <w:rFonts w:hint="default"/>
+      </w:rPr>
+    </w:lvl>
+    <w:lvl w:ilvl="1" w:tplc="40090019" w:tentative="1">
+      <w:start w:val="1"/>
+      <w:numFmt w:val="lowerLetter"/>
+      <w:lvlText w:val="%2."/>
+      <w:lvlJc w:val="left"/>
+      <w:pPr>
+        <w:ind w:left="2520" w:hanging="360"/>
+      </w:pPr>
+    </w:lvl>
+    <w:lvl w:ilvl="2" w:tplc="4009001B" w:tentative="1">
+      <w:start w:val="1"/>
+      <w:numFmt w:val="lowerRoman"/>
+      <w:lvlText w:val="%3."/>
+      <w:lvlJc w:val="right"/>
+      <w:pPr>
+        <w:ind w:left="3240" w:hanging="180"/>
+      </w:pPr>
+    </w:lvl>
+    <w:lvl w:ilvl="3" w:tplc="4009000F" w:tentative="1">
+      <w:start w:val="1"/>
+      <w:numFmt w:val="decimal"/>
+      <w:lvlText w:val="%4."/>
+      <w:lvlJc w:val="left"/>
+      <w:pPr>
+        <w:ind w:left="3960" w:hanging="360"/>
+      </w:pPr>
+    </w:lvl>
+    <w:lvl w:ilvl="4" w:tplc="40090019" w:tentative="1">
+      <w:start w:val="1"/>
+      <w:numFmt w:val="lowerLetter"/>
+      <w:lvlText w:val="%5."/>
+      <w:lvlJc w:val="left"/>
+      <w:pPr>
+        <w:ind w:left="4680" w:hanging="360"/>
+      </w:pPr>
+    </w:lvl>
+    <w:lvl w:ilvl="5" w:tplc="4009001B" w:tentative="1">
+      <w:start w:val="1"/>
+      <w:numFmt w:val="lowerRoman"/>
+      <w:lvlText w:val="%6."/>
+      <w:lvlJc w:val="right"/>
+      <w:pPr>
+        <w:ind w:left="5400" w:hanging="180"/>
+      </w:pPr>
+    </w:lvl>
+    <w:lvl w:ilvl="6" w:tplc="4009000F" w:tentative="1">
+      <w:start w:val="1"/>
+      <w:numFmt w:val="decimal"/>
+      <w:lvlText w:val="%7."/>
+      <w:lvlJc w:val="left"/>
+      <w:pPr>
+        <w:ind w:left="6120" w:hanging="360"/>
+      </w:pPr>
+    </w:lvl>
+    <w:lvl w:ilvl="7" w:tplc="40090019" w:tentative="1">
+      <w:start w:val="1"/>
+      <w:numFmt w:val="lowerLetter"/>
+      <w:lvlText w:val="%8."/>
+      <w:lvlJc w:val="left"/>
+      <w:pPr>
+        <w:ind w:left="6840" w:hanging="360"/>
+      </w:pPr>
+    </w:lvl>
+    <w:lvl w:ilvl="8" w:tplc="4009001B" w:tentative="1">
+      <w:start w:val="1"/>
+      <w:numFmt w:val="lowerRoman"/>
+      <w:lvlText w:val="%9."/>
+      <w:lvlJc w:val="right"/>
+      <w:pPr>
+        <w:ind w:left="7560" w:hanging="180"/>
+      </w:pPr>
+    </w:lvl>
+  </w:abstractNum>
+  <w:abstractNum w:abstractNumId="11">
+    <w:nsid w:val="5D572A26"/>
+    <w:multiLevelType w:val="hybridMultilevel"/>
+    <w:tmpl w:val="684EF31A"/>
+    <w:lvl w:ilvl="0" w:tplc="CBA659FA">
+      <w:start w:val="1"/>
+      <w:numFmt w:val="decimal"/>
+      <w:lvlText w:val="%1."/>
+      <w:lvlJc w:val="left"/>
+      <w:pPr>
+        <w:ind w:left="1080" w:hanging="360"/>
+      </w:pPr>
+      <w:rPr>
+        <w:rFonts w:ascii="Calibri Light" w:hAnsi="Calibri Light" w:hint="default"/>
+        <w:sz w:val="24"/>
+      </w:rPr>
+    </w:lvl>
+    <w:lvl w:ilvl="1" w:tplc="40090019" w:tentative="1">
+      <w:start w:val="1"/>
+      <w:numFmt w:val="lowerLetter"/>
+      <w:lvlText w:val="%2."/>
+      <w:lvlJc w:val="left"/>
+      <w:pPr>
+        <w:ind w:left="1800" w:hanging="360"/>
+      </w:pPr>
+    </w:lvl>
+    <w:lvl w:ilvl="2" w:tplc="4009001B" w:tentative="1">
+      <w:start w:val="1"/>
+      <w:numFmt w:val="lowerRoman"/>
+      <w:lvlText w:val="%3."/>
+      <w:lvlJc w:val="right"/>
+      <w:pPr>
+        <w:ind w:left="2520" w:hanging="180"/>
+      </w:pPr>
+    </w:lvl>
+    <w:lvl w:ilvl="3" w:tplc="4009000F" w:tentative="1">
+      <w:start w:val="1"/>
+      <w:numFmt w:val="decimal"/>
+      <w:lvlText w:val="%4."/>
+      <w:lvlJc w:val="left"/>
+      <w:pPr>
+        <w:ind w:left="3240" w:hanging="360"/>
+      </w:pPr>
+    </w:lvl>
+    <w:lvl w:ilvl="4" w:tplc="40090019" w:tentative="1">
+      <w:start w:val="1"/>
+      <w:numFmt w:val="lowerLetter"/>
+      <w:lvlText w:val="%5."/>
+      <w:lvlJc w:val="left"/>
+      <w:pPr>
+        <w:ind w:left="3960" w:hanging="360"/>
+      </w:pPr>
+    </w:lvl>
+    <w:lvl w:ilvl="5" w:tplc="4009001B" w:tentative="1">
+      <w:start w:val="1"/>
+      <w:numFmt w:val="lowerRoman"/>
+      <w:lvlText w:val="%6."/>
+      <w:lvlJc w:val="right"/>
+      <w:pPr>
+        <w:ind w:left="4680" w:hanging="180"/>
+      </w:pPr>
+    </w:lvl>
+    <w:lvl w:ilvl="6" w:tplc="4009000F" w:tentative="1">
+      <w:start w:val="1"/>
+      <w:numFmt w:val="decimal"/>
+      <w:lvlText w:val="%7."/>
+      <w:lvlJc w:val="left"/>
+      <w:pPr>
+        <w:ind w:left="5400" w:hanging="360"/>
+      </w:pPr>
+    </w:lvl>
+    <w:lvl w:ilvl="7" w:tplc="40090019" w:tentative="1">
+      <w:start w:val="1"/>
+      <w:numFmt w:val="lowerLetter"/>
+      <w:lvlText w:val="%8."/>
+      <w:lvlJc w:val="left"/>
+      <w:pPr>
+        <w:ind w:left="6120" w:hanging="360"/>
+      </w:pPr>
+    </w:lvl>
+    <w:lvl w:ilvl="8" w:tplc="4009001B" w:tentative="1">
+      <w:start w:val="1"/>
+      <w:numFmt w:val="lowerRoman"/>
+      <w:lvlText w:val="%9."/>
+      <w:lvlJc w:val="right"/>
+      <w:pPr>
+        <w:ind w:left="6840" w:hanging="180"/>
+      </w:pPr>
+    </w:lvl>
+  </w:abstractNum>
+  <w:abstractNum w:abstractNumId="12">
+    <w:nsid w:val="68B83A33"/>
+    <w:multiLevelType w:val="hybridMultilevel"/>
+    <w:tmpl w:val="D91A4966"/>
+    <w:lvl w:ilvl="0" w:tplc="A3CE91C0">
+      <w:start w:val="1"/>
+      <w:numFmt w:val="decimal"/>
+      <w:lvlText w:val="%1."/>
+      <w:lvlJc w:val="left"/>
+      <w:pPr>
+        <w:ind w:left="2860" w:hanging="360"/>
+      </w:pPr>
+      <w:rPr>
+        <w:rFonts w:ascii="Calibri Light" w:hAnsi="Calibri Light" w:hint="default"/>
+        <w:sz w:val="24"/>
+      </w:rPr>
+    </w:lvl>
+    <w:lvl w:ilvl="1" w:tplc="40090019" w:tentative="1">
+      <w:start w:val="1"/>
+      <w:numFmt w:val="lowerLetter"/>
+      <w:lvlText w:val="%2."/>
+      <w:lvlJc w:val="left"/>
+      <w:pPr>
+        <w:ind w:left="3580" w:hanging="360"/>
+      </w:pPr>
+    </w:lvl>
+    <w:lvl w:ilvl="2" w:tplc="4009001B" w:tentative="1">
+      <w:start w:val="1"/>
+      <w:numFmt w:val="lowerRoman"/>
+      <w:lvlText w:val="%3."/>
+      <w:lvlJc w:val="right"/>
+      <w:pPr>
+        <w:ind w:left="4300" w:hanging="180"/>
+      </w:pPr>
+    </w:lvl>
+    <w:lvl w:ilvl="3" w:tplc="4009000F" w:tentative="1">
+      <w:start w:val="1"/>
+      <w:numFmt w:val="decimal"/>
+      <w:lvlText w:val="%4."/>
+      <w:lvlJc w:val="left"/>
+      <w:pPr>
+        <w:ind w:left="5020" w:hanging="360"/>
+      </w:pPr>
+    </w:lvl>
+    <w:lvl w:ilvl="4" w:tplc="40090019" w:tentative="1">
+      <w:start w:val="1"/>
+      <w:numFmt w:val="lowerLetter"/>
+      <w:lvlText w:val="%5."/>
+      <w:lvlJc w:val="left"/>
+      <w:pPr>
+        <w:ind w:left="5740" w:hanging="360"/>
+      </w:pPr>
+    </w:lvl>
+    <w:lvl w:ilvl="5" w:tplc="4009001B" w:tentative="1">
+      <w:start w:val="1"/>
+      <w:numFmt w:val="lowerRoman"/>
+      <w:lvlText w:val="%6."/>
+      <w:lvlJc w:val="right"/>
+      <w:pPr>
+        <w:ind w:left="6460" w:hanging="180"/>
+      </w:pPr>
+    </w:lvl>
+    <w:lvl w:ilvl="6" w:tplc="4009000F" w:tentative="1">
+      <w:start w:val="1"/>
+      <w:numFmt w:val="decimal"/>
+      <w:lvlText w:val="%7."/>
+      <w:lvlJc w:val="left"/>
+      <w:pPr>
+        <w:ind w:left="7180" w:hanging="360"/>
+      </w:pPr>
+    </w:lvl>
+    <w:lvl w:ilvl="7" w:tplc="40090019" w:tentative="1">
+      <w:start w:val="1"/>
+      <w:numFmt w:val="lowerLetter"/>
+      <w:lvlText w:val="%8."/>
+      <w:lvlJc w:val="left"/>
+      <w:pPr>
+        <w:ind w:left="7900" w:hanging="360"/>
+      </w:pPr>
+    </w:lvl>
+    <w:lvl w:ilvl="8" w:tplc="4009001B" w:tentative="1">
+      <w:start w:val="1"/>
+      <w:numFmt w:val="lowerRoman"/>
+      <w:lvlText w:val="%9."/>
+      <w:lvlJc w:val="right"/>
+      <w:pPr>
+        <w:ind w:left="8620" w:hanging="180"/>
+      </w:pPr>
+    </w:lvl>
+  </w:abstractNum>
+  <w:abstractNum w:abstractNumId="13">
+    <w:nsid w:val="690C41ED"/>
+    <w:multiLevelType w:val="hybridMultilevel"/>
+    <w:tmpl w:val="2B06CE50"/>
+    <w:lvl w:ilvl="0" w:tplc="7A9C3636">
+      <w:start w:val="1"/>
+      <w:numFmt w:val="decimal"/>
+      <w:lvlText w:val="%1."/>
+      <w:lvlJc w:val="left"/>
+      <w:pPr>
+        <w:ind w:left="1080" w:hanging="360"/>
+      </w:pPr>
+      <w:rPr>
+        <w:rFonts w:hint="default"/>
+      </w:rPr>
+    </w:lvl>
+    <w:lvl w:ilvl="1" w:tplc="40090019" w:tentative="1">
+      <w:start w:val="1"/>
+      <w:numFmt w:val="lowerLetter"/>
+      <w:lvlText w:val="%2."/>
+      <w:lvlJc w:val="left"/>
+      <w:pPr>
+        <w:ind w:left="1800" w:hanging="360"/>
+      </w:pPr>
+    </w:lvl>
+    <w:lvl w:ilvl="2" w:tplc="4009001B" w:tentative="1">
+      <w:start w:val="1"/>
+      <w:numFmt w:val="lowerRoman"/>
+      <w:lvlText w:val="%3."/>
+      <w:lvlJc w:val="right"/>
+      <w:pPr>
+        <w:ind w:left="2520" w:hanging="180"/>
+      </w:pPr>
+    </w:lvl>
+    <w:lvl w:ilvl="3" w:tplc="4009000F" w:tentative="1">
+      <w:start w:val="1"/>
+      <w:numFmt w:val="decimal"/>
+      <w:lvlText w:val="%4."/>
+      <w:lvlJc w:val="left"/>
+      <w:pPr>
+        <w:ind w:left="3240" w:hanging="360"/>
+      </w:pPr>
+    </w:lvl>
+    <w:lvl w:ilvl="4" w:tplc="40090019" w:tentative="1">
+      <w:start w:val="1"/>
+      <w:numFmt w:val="lowerLetter"/>
+      <w:lvlText w:val="%5."/>
+      <w:lvlJc w:val="left"/>
+      <w:pPr>
+        <w:ind w:left="3960" w:hanging="360"/>
+      </w:pPr>
+    </w:lvl>
+    <w:lvl w:ilvl="5" w:tplc="4009001B" w:tentative="1">
+      <w:start w:val="1"/>
+      <w:numFmt w:val="lowerRoman"/>
+      <w:lvlText w:val="%6."/>
+      <w:lvlJc w:val="right"/>
+      <w:pPr>
+        <w:ind w:left="4680" w:hanging="180"/>
+      </w:pPr>
+    </w:lvl>
+    <w:lvl w:ilvl="6" w:tplc="4009000F" w:tentative="1">
+      <w:start w:val="1"/>
+      <w:numFmt w:val="decimal"/>
+      <w:lvlText w:val="%7."/>
+      <w:lvlJc w:val="left"/>
+      <w:pPr>
+        <w:ind w:left="5400" w:hanging="360"/>
+      </w:pPr>
+    </w:lvl>
+    <w:lvl w:ilvl="7" w:tplc="40090019" w:tentative="1">
+      <w:start w:val="1"/>
+      <w:numFmt w:val="lowerLetter"/>
+      <w:lvlText w:val="%8."/>
+      <w:lvlJc w:val="left"/>
+      <w:pPr>
+        <w:ind w:left="6120" w:hanging="360"/>
+      </w:pPr>
+    </w:lvl>
+    <w:lvl w:ilvl="8" w:tplc="4009001B" w:tentative="1">
+      <w:start w:val="1"/>
+      <w:numFmt w:val="lowerRoman"/>
+      <w:lvlText w:val="%9."/>
+      <w:lvlJc w:val="right"/>
+      <w:pPr>
+        <w:ind w:left="6840" w:hanging="180"/>
+      </w:pPr>
+    </w:lvl>
+  </w:abstractNum>
+  <w:abstractNum w:abstractNumId="14">
+    <w:nsid w:val="721F566B"/>
+    <w:multiLevelType w:val="hybridMultilevel"/>
+    <w:tmpl w:val="E160BEF6"/>
+    <w:lvl w:ilvl="0" w:tplc="FEBAD4F8">
+      <w:start w:val="1"/>
+      <w:numFmt w:val="decimal"/>
+      <w:lvlText w:val="%1."/>
+      <w:lvlJc w:val="left"/>
+      <w:pPr>
+        <w:ind w:left="1570" w:hanging="360"/>
+      </w:pPr>
+      <w:rPr>
+        <w:rFonts w:hint="default"/>
+      </w:rPr>
+    </w:lvl>
+    <w:lvl w:ilvl="1" w:tplc="40090019" w:tentative="1">
+      <w:start w:val="1"/>
+      <w:numFmt w:val="lowerLetter"/>
+      <w:lvlText w:val="%2."/>
+      <w:lvlJc w:val="left"/>
+      <w:pPr>
+        <w:ind w:left="2290" w:hanging="360"/>
+      </w:pPr>
+    </w:lvl>
+    <w:lvl w:ilvl="2" w:tplc="4009001B" w:tentative="1">
+      <w:start w:val="1"/>
+      <w:numFmt w:val="lowerRoman"/>
+      <w:lvlText w:val="%3."/>
+      <w:lvlJc w:val="right"/>
+      <w:pPr>
+        <w:ind w:left="3010" w:hanging="180"/>
+      </w:pPr>
+    </w:lvl>
+    <w:lvl w:ilvl="3" w:tplc="4009000F" w:tentative="1">
+      <w:start w:val="1"/>
+      <w:numFmt w:val="decimal"/>
+      <w:lvlText w:val="%4."/>
+      <w:lvlJc w:val="left"/>
+      <w:pPr>
+        <w:ind w:left="3730" w:hanging="360"/>
+      </w:pPr>
+    </w:lvl>
+    <w:lvl w:ilvl="4" w:tplc="40090019" w:tentative="1">
+      <w:start w:val="1"/>
+      <w:numFmt w:val="lowerLetter"/>
+      <w:lvlText w:val="%5."/>
+      <w:lvlJc w:val="left"/>
+      <w:pPr>
+        <w:ind w:left="4450" w:hanging="360"/>
+      </w:pPr>
+    </w:lvl>
+    <w:lvl w:ilvl="5" w:tplc="4009001B" w:tentative="1">
+      <w:start w:val="1"/>
+      <w:numFmt w:val="lowerRoman"/>
+      <w:lvlText w:val="%6."/>
+      <w:lvlJc w:val="right"/>
+      <w:pPr>
+        <w:ind w:left="5170" w:hanging="180"/>
+      </w:pPr>
+    </w:lvl>
+    <w:lvl w:ilvl="6" w:tplc="4009000F" w:tentative="1">
+      <w:start w:val="1"/>
+      <w:numFmt w:val="decimal"/>
+      <w:lvlText w:val="%7."/>
+      <w:lvlJc w:val="left"/>
+      <w:pPr>
+        <w:ind w:left="5890" w:hanging="360"/>
+      </w:pPr>
+    </w:lvl>
+    <w:lvl w:ilvl="7" w:tplc="40090019" w:tentative="1">
+      <w:start w:val="1"/>
+      <w:numFmt w:val="lowerLetter"/>
+      <w:lvlText w:val="%8."/>
+      <w:lvlJc w:val="left"/>
+      <w:pPr>
+        <w:ind w:left="6610" w:hanging="360"/>
+      </w:pPr>
+    </w:lvl>
+    <w:lvl w:ilvl="8" w:tplc="4009001B" w:tentative="1">
+      <w:start w:val="1"/>
+      <w:numFmt w:val="lowerRoman"/>
+      <w:lvlText w:val="%9."/>
+      <w:lvlJc w:val="right"/>
+      <w:pPr>
+        <w:ind w:left="7330" w:hanging="180"/>
+      </w:pPr>
+    </w:lvl>
+  </w:abstractNum>
+  <w:abstractNum w:abstractNumId="15">
+    <w:nsid w:val="77747DF7"/>
+    <w:multiLevelType w:val="hybridMultilevel"/>
+    <w:tmpl w:val="8E54C490"/>
+    <w:lvl w:ilvl="0" w:tplc="2D628346">
+      <w:start w:val="1"/>
+      <w:numFmt w:val="decimal"/>
+      <w:lvlText w:val="%1."/>
+      <w:lvlJc w:val="left"/>
+      <w:pPr>
+        <w:ind w:left="1080" w:hanging="360"/>
+      </w:pPr>
+      <w:rPr>
+        <w:rFonts w:hint="default"/>
+      </w:rPr>
+    </w:lvl>
+    <w:lvl w:ilvl="1" w:tplc="40090019" w:tentative="1">
+      <w:start w:val="1"/>
+      <w:numFmt w:val="lowerLetter"/>
+      <w:lvlText w:val="%2."/>
+      <w:lvlJc w:val="left"/>
+      <w:pPr>
+        <w:ind w:left="1800" w:hanging="360"/>
+      </w:pPr>
+    </w:lvl>
+    <w:lvl w:ilvl="2" w:tplc="4009001B" w:tentative="1">
+      <w:start w:val="1"/>
+      <w:numFmt w:val="lowerRoman"/>
+      <w:lvlText w:val="%3."/>
+      <w:lvlJc w:val="right"/>
+      <w:pPr>
+        <w:ind w:left="2520" w:hanging="180"/>
+      </w:pPr>
+    </w:lvl>
+    <w:lvl w:ilvl="3" w:tplc="4009000F" w:tentative="1">
+      <w:start w:val="1"/>
+      <w:numFmt w:val="decimal"/>
+      <w:lvlText w:val="%4."/>
+      <w:lvlJc w:val="left"/>
+      <w:pPr>
+        <w:ind w:left="3240" w:hanging="360"/>
+      </w:pPr>
+    </w:lvl>
+    <w:lvl w:ilvl="4" w:tplc="40090019" w:tentative="1">
+      <w:start w:val="1"/>
+      <w:numFmt w:val="lowerLetter"/>
+      <w:lvlText w:val="%5."/>
+      <w:lvlJc w:val="left"/>
+      <w:pPr>
+        <w:ind w:left="3960" w:hanging="360"/>
+      </w:pPr>
+    </w:lvl>
+    <w:lvl w:ilvl="5" w:tplc="4009001B" w:tentative="1">
+      <w:start w:val="1"/>
+      <w:numFmt w:val="lowerRoman"/>
+      <w:lvlText w:val="%6."/>
+      <w:lvlJc w:val="right"/>
+      <w:pPr>
+        <w:ind w:left="4680" w:hanging="180"/>
+      </w:pPr>
+    </w:lvl>
+    <w:lvl w:ilvl="6" w:tplc="4009000F" w:tentative="1">
+      <w:start w:val="1"/>
+      <w:numFmt w:val="decimal"/>
+      <w:lvlText w:val="%7."/>
+      <w:lvlJc w:val="left"/>
+      <w:pPr>
+        <w:ind w:left="5400" w:hanging="360"/>
+      </w:pPr>
+    </w:lvl>
+    <w:lvl w:ilvl="7" w:tplc="40090019" w:tentative="1">
+      <w:start w:val="1"/>
+      <w:numFmt w:val="lowerLetter"/>
+      <w:lvlText w:val="%8."/>
+      <w:lvlJc w:val="left"/>
+      <w:pPr>
+        <w:ind w:left="6120" w:hanging="360"/>
+      </w:pPr>
+    </w:lvl>
+    <w:lvl w:ilvl="8" w:tplc="4009001B" w:tentative="1">
+      <w:start w:val="1"/>
+      <w:numFmt w:val="lowerRoman"/>
+      <w:lvlText w:val="%9."/>
+      <w:lvlJc w:val="right"/>
+      <w:pPr>
+        <w:ind w:left="6840" w:hanging="180"/>
+      </w:pPr>
+    </w:lvl>
+  </w:abstractNum>
   <w:num w:numId="1">
+    <w:abstractNumId w:val="8"/>
+  </w:num>
+  <w:num w:numId="2">
     <w:abstractNumId w:val="1"/>
   </w:num>
-  <w:num w:numId="2">
+  <w:num w:numId="3">
+    <w:abstractNumId w:val="9"/>
+  </w:num>
+  <w:num w:numId="4">
+    <w:abstractNumId w:val="13"/>
+  </w:num>
+  <w:num w:numId="5">
+    <w:abstractNumId w:val="10"/>
+  </w:num>
+  <w:num w:numId="6">
+    <w:abstractNumId w:val="2"/>
+  </w:num>
+  <w:num w:numId="7">
+    <w:abstractNumId w:val="3"/>
+  </w:num>
+  <w:num w:numId="8">
     <w:abstractNumId w:val="0"/>
   </w:num>
-  <w:num w:numId="3">
-    <w:abstractNumId w:val="2"/>
+  <w:num w:numId="9">
+    <w:abstractNumId w:val="15"/>
+  </w:num>
+  <w:num w:numId="10">
+    <w:abstractNumId w:val="7"/>
+  </w:num>
+  <w:num w:numId="11">
+    <w:abstractNumId w:val="14"/>
+  </w:num>
+  <w:num w:numId="12">
+    <w:abstractNumId w:val="12"/>
+  </w:num>
+  <w:num w:numId="13">
+    <w:abstractNumId w:val="6"/>
+  </w:num>
+  <w:num w:numId="14">
+    <w:abstractNumId w:val="11"/>
+  </w:num>
+  <w:num w:numId="15">
+    <w:abstractNumId w:val="4"/>
+  </w:num>
+  <w:num w:numId="16">
+    <w:abstractNumId w:val="5"/>
   </w:num>
 </w:numbering>
 </file>
@@ -23011,6 +26522,31 @@
       <w:color w:val="2E74B5" w:themeColor="accent1" w:themeShade="BF"/>
       <w:sz w:val="40"/>
       <w:szCs w:val="40"/>
+    </w:rPr>
+  </w:style>
+  <w:style w:type="paragraph" w:styleId="Heading2">
+    <w:name w:val="heading 2"/>
+    <w:basedOn w:val="Normal"/>
+    <w:next w:val="Normal"/>
+    <w:link w:val="Heading2Char"/>
+    <w:uiPriority w:val="9"/>
+    <w:semiHidden/>
+    <w:unhideWhenUsed/>
+    <w:qFormat/>
+    <w:rsid w:val="00B04862"/>
+    <w:pPr>
+      <w:keepNext/>
+      <w:keepLines/>
+      <w:spacing w:before="200" w:after="0"/>
+      <w:outlineLvl w:val="1"/>
+    </w:pPr>
+    <w:rPr>
+      <w:rFonts w:asciiTheme="majorHAnsi" w:eastAsiaTheme="majorEastAsia" w:hAnsiTheme="majorHAnsi" w:cstheme="majorBidi"/>
+      <w:b/>
+      <w:bCs/>
+      <w:color w:val="5B9BD5" w:themeColor="accent1"/>
+      <w:sz w:val="26"/>
+      <w:szCs w:val="26"/>
     </w:rPr>
   </w:style>
   <w:style w:type="paragraph" w:styleId="Heading3">
@@ -23206,6 +26742,48 @@
       <w:color w:val="5B9BD5" w:themeColor="accent1"/>
     </w:rPr>
   </w:style>
+  <w:style w:type="character" w:customStyle="1" w:styleId="Heading2Char">
+    <w:name w:val="Heading 2 Char"/>
+    <w:basedOn w:val="DefaultParagraphFont"/>
+    <w:link w:val="Heading2"/>
+    <w:uiPriority w:val="9"/>
+    <w:semiHidden/>
+    <w:rsid w:val="00B04862"/>
+    <w:rPr>
+      <w:rFonts w:asciiTheme="majorHAnsi" w:eastAsiaTheme="majorEastAsia" w:hAnsiTheme="majorHAnsi" w:cstheme="majorBidi"/>
+      <w:b/>
+      <w:bCs/>
+      <w:color w:val="5B9BD5" w:themeColor="accent1"/>
+      <w:sz w:val="26"/>
+      <w:szCs w:val="26"/>
+    </w:rPr>
+  </w:style>
+  <w:style w:type="character" w:customStyle="1" w:styleId="ms-1">
+    <w:name w:val="ms-1"/>
+    <w:basedOn w:val="DefaultParagraphFont"/>
+    <w:rsid w:val="004B4330"/>
+  </w:style>
+  <w:style w:type="character" w:customStyle="1" w:styleId="max-w-15ch">
+    <w:name w:val="max-w-[15ch]"/>
+    <w:basedOn w:val="DefaultParagraphFont"/>
+    <w:rsid w:val="004B4330"/>
+  </w:style>
+  <w:style w:type="character" w:customStyle="1" w:styleId="-me-1">
+    <w:name w:val="-me-1"/>
+    <w:basedOn w:val="DefaultParagraphFont"/>
+    <w:rsid w:val="004B4330"/>
+  </w:style>
+  <w:style w:type="character" w:styleId="Emphasis">
+    <w:name w:val="Emphasis"/>
+    <w:basedOn w:val="DefaultParagraphFont"/>
+    <w:uiPriority w:val="20"/>
+    <w:qFormat/>
+    <w:rsid w:val="00F9652A"/>
+    <w:rPr>
+      <w:i/>
+      <w:iCs/>
+    </w:rPr>
+  </w:style>
 </w:styles>
 </file>
 
@@ -23387,6 +26965,31 @@
       <w:color w:val="2E74B5" w:themeColor="accent1" w:themeShade="BF"/>
       <w:sz w:val="40"/>
       <w:szCs w:val="40"/>
+    </w:rPr>
+  </w:style>
+  <w:style w:type="paragraph" w:styleId="Heading2">
+    <w:name w:val="heading 2"/>
+    <w:basedOn w:val="Normal"/>
+    <w:next w:val="Normal"/>
+    <w:link w:val="Heading2Char"/>
+    <w:uiPriority w:val="9"/>
+    <w:semiHidden/>
+    <w:unhideWhenUsed/>
+    <w:qFormat/>
+    <w:rsid w:val="00B04862"/>
+    <w:pPr>
+      <w:keepNext/>
+      <w:keepLines/>
+      <w:spacing w:before="200" w:after="0"/>
+      <w:outlineLvl w:val="1"/>
+    </w:pPr>
+    <w:rPr>
+      <w:rFonts w:asciiTheme="majorHAnsi" w:eastAsiaTheme="majorEastAsia" w:hAnsiTheme="majorHAnsi" w:cstheme="majorBidi"/>
+      <w:b/>
+      <w:bCs/>
+      <w:color w:val="5B9BD5" w:themeColor="accent1"/>
+      <w:sz w:val="26"/>
+      <w:szCs w:val="26"/>
     </w:rPr>
   </w:style>
   <w:style w:type="paragraph" w:styleId="Heading3">
@@ -23580,6 +27183,48 @@
       <w:b/>
       <w:bCs/>
       <w:color w:val="5B9BD5" w:themeColor="accent1"/>
+    </w:rPr>
+  </w:style>
+  <w:style w:type="character" w:customStyle="1" w:styleId="Heading2Char">
+    <w:name w:val="Heading 2 Char"/>
+    <w:basedOn w:val="DefaultParagraphFont"/>
+    <w:link w:val="Heading2"/>
+    <w:uiPriority w:val="9"/>
+    <w:semiHidden/>
+    <w:rsid w:val="00B04862"/>
+    <w:rPr>
+      <w:rFonts w:asciiTheme="majorHAnsi" w:eastAsiaTheme="majorEastAsia" w:hAnsiTheme="majorHAnsi" w:cstheme="majorBidi"/>
+      <w:b/>
+      <w:bCs/>
+      <w:color w:val="5B9BD5" w:themeColor="accent1"/>
+      <w:sz w:val="26"/>
+      <w:szCs w:val="26"/>
+    </w:rPr>
+  </w:style>
+  <w:style w:type="character" w:customStyle="1" w:styleId="ms-1">
+    <w:name w:val="ms-1"/>
+    <w:basedOn w:val="DefaultParagraphFont"/>
+    <w:rsid w:val="004B4330"/>
+  </w:style>
+  <w:style w:type="character" w:customStyle="1" w:styleId="max-w-15ch">
+    <w:name w:val="max-w-[15ch]"/>
+    <w:basedOn w:val="DefaultParagraphFont"/>
+    <w:rsid w:val="004B4330"/>
+  </w:style>
+  <w:style w:type="character" w:customStyle="1" w:styleId="-me-1">
+    <w:name w:val="-me-1"/>
+    <w:basedOn w:val="DefaultParagraphFont"/>
+    <w:rsid w:val="004B4330"/>
+  </w:style>
+  <w:style w:type="character" w:styleId="Emphasis">
+    <w:name w:val="Emphasis"/>
+    <w:basedOn w:val="DefaultParagraphFont"/>
+    <w:uiPriority w:val="20"/>
+    <w:qFormat/>
+    <w:rsid w:val="00F9652A"/>
+    <w:rPr>
+      <w:i/>
+      <w:iCs/>
     </w:rPr>
   </w:style>
 </w:styles>
@@ -23851,7 +27496,7 @@
 </file>
 
 <file path=customXml/itemProps1.xml><?xml version="1.0" encoding="utf-8"?>
-<ds:datastoreItem xmlns:ds="http://schemas.openxmlformats.org/officeDocument/2006/customXml" ds:itemID="{48589D94-ADB4-4B81-A8CA-B4D39D3125BE}">
+<ds:datastoreItem xmlns:ds="http://schemas.openxmlformats.org/officeDocument/2006/customXml" ds:itemID="{29441FFC-C1C8-4E35-9FF5-131C685C442F}">
   <ds:schemaRefs>
     <ds:schemaRef ds:uri="http://schemas.openxmlformats.org/officeDocument/2006/bibliography"/>
   </ds:schemaRefs>

</xml_diff>